<commit_message>
docs: update permission persona preread status
</commit_message>
<xml_diff>
--- a/docs/architecture/frontend/permission-persona-navigation-model-preread.docx
+++ b/docs/architecture/frontend/permission-persona-navigation-model-preread.docx
@@ -7,13 +7,23 @@
         <w:pStyle w:val="Title"/>
       </w:pPr>
       <w:r>
+        <w:rPr>
+          <w:rFonts w:ascii="Aptos" w:hAnsi="Aptos"/>
+          <w:color w:val="244C7A"/>
+          <w:sz w:val="40"/>
+        </w:rPr>
         <w:t>Permission, Persona, and Navigation Model</w:t>
       </w:r>
     </w:p>
     <w:p>
+      <w:pPr>
+        <w:spacing w:after="120" w:line="259" w:lineRule="auto"/>
+      </w:pPr>
       <w:r>
         <w:rPr>
-          <w:i/>
+          <w:rFonts w:ascii="Aptos" w:hAnsi="Aptos"/>
+          <w:color w:val="1F2937"/>
+          <w:sz w:val="20"/>
         </w:rPr>
         <w:t>Meeting preread for aligning how LFX One decides where users can go, what they see, and what they can do.</w:t>
       </w:r>
@@ -21,21 +31,27 @@
     <w:p>
       <w:pPr>
         <w:pStyle w:val="Heading1"/>
-        <w:keepNext/>
       </w:pPr>
       <w:r>
         <w:t>Purpose</w:t>
       </w:r>
     </w:p>
     <w:p>
+      <w:pPr>
+        <w:spacing w:after="120" w:line="259" w:lineRule="auto"/>
+      </w:pPr>
       <w:r>
+        <w:rPr>
+          <w:rFonts w:ascii="Aptos" w:hAnsi="Aptos"/>
+          <w:color w:val="1F2937"/>
+          <w:sz w:val="20"/>
+        </w:rPr>
         <w:t>This preread proposes a clear separation between access, experience, and authority. The goal is to make the product easier to reason about and to keep persona-driven UX from accidentally becoming authorization logic.</w:t>
       </w:r>
     </w:p>
     <w:p>
       <w:pPr>
         <w:pStyle w:val="Heading1"/>
-        <w:keepNext/>
       </w:pPr>
       <w:r>
         <w:t>Core Contract</w:t>
@@ -43,31 +59,120 @@
     </w:p>
     <w:tbl>
       <w:tblPr>
+        <w:tblStyle w:val="TableGrid"/>
         <w:tblW w:type="auto" w:w="0"/>
+        <w:jc w:val="center"/>
         <w:tblLayout w:type="fixed"/>
         <w:tblLook w:firstColumn="1" w:firstRow="1" w:lastColumn="0" w:lastRow="0" w:noHBand="0" w:noVBand="1" w:val="04A0"/>
+        <w:tblBorders>
+          <w:top w:val="single" w:sz="6" w:space="0" w:color="B7C6D8"/>
+          <w:left w:val="single" w:sz="6" w:space="0" w:color="B7C6D8"/>
+          <w:bottom w:val="single" w:sz="6" w:space="0" w:color="B7C6D8"/>
+          <w:right w:val="single" w:sz="6" w:space="0" w:color="B7C6D8"/>
+          <w:insideH w:val="single" w:sz="6" w:space="0" w:color="B7C6D8"/>
+          <w:insideV w:val="single" w:sz="6" w:space="0" w:color="B7C6D8"/>
+        </w:tblBorders>
       </w:tblPr>
       <w:tblGrid>
-        <w:gridCol w:w="3264"/>
-        <w:gridCol w:w="3264"/>
-        <w:gridCol w:w="3264"/>
+        <w:gridCol w:w="3408"/>
+        <w:gridCol w:w="3408"/>
+        <w:gridCol w:w="3408"/>
       </w:tblGrid>
+      <w:tr>
+        <w:trPr>
+          <w:tblHeader w:val="true"/>
+        </w:trPr>
+        <w:tc>
+          <w:tcPr>
+            <w:tcW w:type="dxa" w:w="2232"/>
+            <w:shd w:fill="D9E7F5"/>
+            <w:tcMar>
+              <w:top w:w="120" w:type="dxa"/>
+              <w:start w:w="120" w:type="dxa"/>
+              <w:bottom w:w="120" w:type="dxa"/>
+              <w:end w:w="120" w:type="dxa"/>
+            </w:tcMar>
+            <w:vAlign w:val="center"/>
+          </w:tcPr>
+          <w:p>
+            <w:pPr>
+              <w:jc w:val="left"/>
+            </w:pPr>
+            <w:r>
+              <w:rPr>
+                <w:rFonts w:ascii="Aptos" w:hAnsi="Aptos"/>
+                <w:b/>
+                <w:color w:val="17324D"/>
+                <w:sz w:val="16"/>
+              </w:rPr>
+              <w:t>Decision</w:t>
+            </w:r>
+          </w:p>
+        </w:tc>
+        <w:tc>
+          <w:tcPr>
+            <w:tcW w:type="dxa" w:w="3024"/>
+            <w:shd w:fill="D9E7F5"/>
+            <w:tcMar>
+              <w:top w:w="120" w:type="dxa"/>
+              <w:start w:w="120" w:type="dxa"/>
+              <w:bottom w:w="120" w:type="dxa"/>
+              <w:end w:w="120" w:type="dxa"/>
+            </w:tcMar>
+            <w:vAlign w:val="center"/>
+          </w:tcPr>
+          <w:p>
+            <w:pPr>
+              <w:jc w:val="left"/>
+            </w:pPr>
+            <w:r>
+              <w:rPr>
+                <w:rFonts w:ascii="Aptos" w:hAnsi="Aptos"/>
+                <w:b/>
+                <w:color w:val="17324D"/>
+                <w:sz w:val="16"/>
+              </w:rPr>
+              <w:t>Source of Truth</w:t>
+            </w:r>
+          </w:p>
+        </w:tc>
+        <w:tc>
+          <w:tcPr>
+            <w:tcW w:type="dxa" w:w="4968"/>
+            <w:shd w:fill="D9E7F5"/>
+            <w:tcMar>
+              <w:top w:w="120" w:type="dxa"/>
+              <w:start w:w="120" w:type="dxa"/>
+              <w:bottom w:w="120" w:type="dxa"/>
+              <w:end w:w="120" w:type="dxa"/>
+            </w:tcMar>
+            <w:vAlign w:val="center"/>
+          </w:tcPr>
+          <w:p>
+            <w:pPr>
+              <w:jc w:val="left"/>
+            </w:pPr>
+            <w:r>
+              <w:rPr>
+                <w:rFonts w:ascii="Aptos" w:hAnsi="Aptos"/>
+                <w:b/>
+                <w:color w:val="17324D"/>
+                <w:sz w:val="16"/>
+              </w:rPr>
+              <w:t>Meaning</w:t>
+            </w:r>
+          </w:p>
+        </w:tc>
+      </w:tr>
       <w:tr>
         <w:tc>
           <w:tcPr>
-            <w:tcW w:type="dxa" w:w="2448"/>
-            <w:shd w:fill="E8F1FF"/>
-            <w:tcBorders>
-              <w:top w:val="single" w:sz="6" w:space="0" w:color="D9E2EC"/>
-              <w:left w:val="single" w:sz="6" w:space="0" w:color="D9E2EC"/>
-              <w:bottom w:val="single" w:sz="6" w:space="0" w:color="D9E2EC"/>
-              <w:right w:val="single" w:sz="6" w:space="0" w:color="D9E2EC"/>
-            </w:tcBorders>
+            <w:tcW w:type="dxa" w:w="2232"/>
             <w:tcMar>
-              <w:top w:w="100" w:type="dxa"/>
-              <w:start w:w="140" w:type="dxa"/>
-              <w:bottom w:w="100" w:type="dxa"/>
-              <w:end w:w="140" w:type="dxa"/>
+              <w:top w:w="120" w:type="dxa"/>
+              <w:start w:w="120" w:type="dxa"/>
+              <w:bottom w:w="120" w:type="dxa"/>
+              <w:end w:w="120" w:type="dxa"/>
             </w:tcMar>
             <w:vAlign w:val="center"/>
           </w:tcPr>
@@ -77,30 +182,22 @@
             </w:pPr>
             <w:r>
               <w:rPr>
-                <w:rFonts w:ascii="Arial" w:hAnsi="Arial"/>
-                <w:b/>
-                <w:color w:val="0F172A"/>
-                <w:sz w:val="20"/>
+                <w:rFonts w:ascii="Aptos" w:hAnsi="Aptos"/>
+                <w:color w:val="27364A"/>
+                <w:sz w:val="15"/>
               </w:rPr>
-              <w:t>Decision</w:t>
+              <w:t>Where can I go?</w:t>
             </w:r>
           </w:p>
         </w:tc>
         <w:tc>
           <w:tcPr>
-            <w:tcW w:type="dxa" w:w="3240"/>
-            <w:shd w:fill="E8F1FF"/>
-            <w:tcBorders>
-              <w:top w:val="single" w:sz="6" w:space="0" w:color="D9E2EC"/>
-              <w:left w:val="single" w:sz="6" w:space="0" w:color="D9E2EC"/>
-              <w:bottom w:val="single" w:sz="6" w:space="0" w:color="D9E2EC"/>
-              <w:right w:val="single" w:sz="6" w:space="0" w:color="D9E2EC"/>
-            </w:tcBorders>
+            <w:tcW w:type="dxa" w:w="3024"/>
             <w:tcMar>
-              <w:top w:w="100" w:type="dxa"/>
-              <w:start w:w="140" w:type="dxa"/>
-              <w:bottom w:w="100" w:type="dxa"/>
-              <w:end w:w="140" w:type="dxa"/>
+              <w:top w:w="120" w:type="dxa"/>
+              <w:start w:w="120" w:type="dxa"/>
+              <w:bottom w:w="120" w:type="dxa"/>
+              <w:end w:w="120" w:type="dxa"/>
             </w:tcMar>
             <w:vAlign w:val="center"/>
           </w:tcPr>
@@ -110,30 +207,22 @@
             </w:pPr>
             <w:r>
               <w:rPr>
-                <w:rFonts w:ascii="Arial" w:hAnsi="Arial"/>
-                <w:b/>
-                <w:color w:val="0F172A"/>
-                <w:sz w:val="20"/>
+                <w:rFonts w:ascii="Aptos" w:hAnsi="Aptos"/>
+                <w:color w:val="27364A"/>
+                <w:sz w:val="15"/>
               </w:rPr>
-              <w:t>Source of Truth</w:t>
+              <w:t>View permission</w:t>
             </w:r>
           </w:p>
         </w:tc>
         <w:tc>
           <w:tcPr>
-            <w:tcW w:type="dxa" w:w="3672"/>
-            <w:shd w:fill="E8F1FF"/>
-            <w:tcBorders>
-              <w:top w:val="single" w:sz="6" w:space="0" w:color="D9E2EC"/>
-              <w:left w:val="single" w:sz="6" w:space="0" w:color="D9E2EC"/>
-              <w:bottom w:val="single" w:sz="6" w:space="0" w:color="D9E2EC"/>
-              <w:right w:val="single" w:sz="6" w:space="0" w:color="D9E2EC"/>
-            </w:tcBorders>
+            <w:tcW w:type="dxa" w:w="4968"/>
             <w:tcMar>
-              <w:top w:w="100" w:type="dxa"/>
-              <w:start w:w="140" w:type="dxa"/>
-              <w:bottom w:w="100" w:type="dxa"/>
-              <w:end w:w="140" w:type="dxa"/>
+              <w:top w:w="120" w:type="dxa"/>
+              <w:start w:w="120" w:type="dxa"/>
+              <w:bottom w:w="120" w:type="dxa"/>
+              <w:end w:w="120" w:type="dxa"/>
             </w:tcMar>
             <w:vAlign w:val="center"/>
           </w:tcPr>
@@ -143,12 +232,11 @@
             </w:pPr>
             <w:r>
               <w:rPr>
-                <w:rFonts w:ascii="Arial" w:hAnsi="Arial"/>
-                <w:b/>
-                <w:color w:val="0F172A"/>
-                <w:sz w:val="20"/>
+                <w:rFonts w:ascii="Aptos" w:hAnsi="Aptos"/>
+                <w:color w:val="27364A"/>
+                <w:sz w:val="15"/>
               </w:rPr>
-              <w:t>Meaning</w:t>
+              <w:t>Foundation/Project selector eligibility.</w:t>
             </w:r>
           </w:p>
         </w:tc>
@@ -156,18 +244,12 @@
       <w:tr>
         <w:tc>
           <w:tcPr>
-            <w:tcW w:type="dxa" w:w="2448"/>
-            <w:tcBorders>
-              <w:top w:val="single" w:sz="6" w:space="0" w:color="D9E2EC"/>
-              <w:left w:val="single" w:sz="6" w:space="0" w:color="D9E2EC"/>
-              <w:bottom w:val="single" w:sz="6" w:space="0" w:color="D9E2EC"/>
-              <w:right w:val="single" w:sz="6" w:space="0" w:color="D9E2EC"/>
-            </w:tcBorders>
+            <w:tcW w:type="dxa" w:w="2232"/>
             <w:tcMar>
-              <w:top w:w="100" w:type="dxa"/>
-              <w:start w:w="140" w:type="dxa"/>
-              <w:bottom w:w="100" w:type="dxa"/>
-              <w:end w:w="140" w:type="dxa"/>
+              <w:top w:w="120" w:type="dxa"/>
+              <w:start w:w="120" w:type="dxa"/>
+              <w:bottom w:w="120" w:type="dxa"/>
+              <w:end w:w="120" w:type="dxa"/>
             </w:tcMar>
             <w:vAlign w:val="center"/>
           </w:tcPr>
@@ -177,29 +259,22 @@
             </w:pPr>
             <w:r>
               <w:rPr>
-                <w:rFonts w:ascii="Arial" w:hAnsi="Arial"/>
-                <w:b w:val="0"/>
-                <w:color w:val="111827"/>
-                <w:sz w:val="20"/>
+                <w:rFonts w:ascii="Aptos" w:hAnsi="Aptos"/>
+                <w:color w:val="27364A"/>
+                <w:sz w:val="15"/>
               </w:rPr>
-              <w:t>Where can I go?</w:t>
+              <w:t>What do I see there?</w:t>
             </w:r>
           </w:p>
         </w:tc>
         <w:tc>
           <w:tcPr>
-            <w:tcW w:type="dxa" w:w="3240"/>
-            <w:tcBorders>
-              <w:top w:val="single" w:sz="6" w:space="0" w:color="D9E2EC"/>
-              <w:left w:val="single" w:sz="6" w:space="0" w:color="D9E2EC"/>
-              <w:bottom w:val="single" w:sz="6" w:space="0" w:color="D9E2EC"/>
-              <w:right w:val="single" w:sz="6" w:space="0" w:color="D9E2EC"/>
-            </w:tcBorders>
+            <w:tcW w:type="dxa" w:w="3024"/>
             <w:tcMar>
-              <w:top w:w="100" w:type="dxa"/>
-              <w:start w:w="140" w:type="dxa"/>
-              <w:bottom w:w="100" w:type="dxa"/>
-              <w:end w:w="140" w:type="dxa"/>
+              <w:top w:w="120" w:type="dxa"/>
+              <w:start w:w="120" w:type="dxa"/>
+              <w:bottom w:w="120" w:type="dxa"/>
+              <w:end w:w="120" w:type="dxa"/>
             </w:tcMar>
             <w:vAlign w:val="center"/>
           </w:tcPr>
@@ -209,29 +284,22 @@
             </w:pPr>
             <w:r>
               <w:rPr>
-                <w:rFonts w:ascii="Arial" w:hAnsi="Arial"/>
-                <w:b w:val="0"/>
-                <w:color w:val="111827"/>
-                <w:sz w:val="20"/>
+                <w:rFonts w:ascii="Aptos" w:hAnsi="Aptos"/>
+                <w:color w:val="27364A"/>
+                <w:sz w:val="15"/>
               </w:rPr>
-              <w:t>View permission</w:t>
+              <w:t>Persona / role</w:t>
             </w:r>
           </w:p>
         </w:tc>
         <w:tc>
           <w:tcPr>
-            <w:tcW w:type="dxa" w:w="3672"/>
-            <w:tcBorders>
-              <w:top w:val="single" w:sz="6" w:space="0" w:color="D9E2EC"/>
-              <w:left w:val="single" w:sz="6" w:space="0" w:color="D9E2EC"/>
-              <w:bottom w:val="single" w:sz="6" w:space="0" w:color="D9E2EC"/>
-              <w:right w:val="single" w:sz="6" w:space="0" w:color="D9E2EC"/>
-            </w:tcBorders>
+            <w:tcW w:type="dxa" w:w="4968"/>
             <w:tcMar>
-              <w:top w:w="100" w:type="dxa"/>
-              <w:start w:w="140" w:type="dxa"/>
-              <w:bottom w:w="100" w:type="dxa"/>
-              <w:end w:w="140" w:type="dxa"/>
+              <w:top w:w="120" w:type="dxa"/>
+              <w:start w:w="120" w:type="dxa"/>
+              <w:bottom w:w="120" w:type="dxa"/>
+              <w:end w:w="120" w:type="dxa"/>
             </w:tcMar>
             <w:vAlign w:val="center"/>
           </w:tcPr>
@@ -241,12 +309,11 @@
             </w:pPr>
             <w:r>
               <w:rPr>
-                <w:rFonts w:ascii="Arial" w:hAnsi="Arial"/>
-                <w:b w:val="0"/>
-                <w:color w:val="111827"/>
-                <w:sz w:val="20"/>
+                <w:rFonts w:ascii="Aptos" w:hAnsi="Aptos"/>
+                <w:color w:val="27364A"/>
+                <w:sz w:val="15"/>
               </w:rPr>
-              <w:t>Foundation/Project selector eligibility.</w:t>
+              <w:t>Sidebar links, page sections, dashboard variants, content shape.</w:t>
             </w:r>
           </w:p>
         </w:tc>
@@ -254,18 +321,12 @@
       <w:tr>
         <w:tc>
           <w:tcPr>
-            <w:tcW w:type="dxa" w:w="2448"/>
-            <w:tcBorders>
-              <w:top w:val="single" w:sz="6" w:space="0" w:color="D9E2EC"/>
-              <w:left w:val="single" w:sz="6" w:space="0" w:color="D9E2EC"/>
-              <w:bottom w:val="single" w:sz="6" w:space="0" w:color="D9E2EC"/>
-              <w:right w:val="single" w:sz="6" w:space="0" w:color="D9E2EC"/>
-            </w:tcBorders>
+            <w:tcW w:type="dxa" w:w="2232"/>
             <w:tcMar>
-              <w:top w:w="100" w:type="dxa"/>
-              <w:start w:w="140" w:type="dxa"/>
-              <w:bottom w:w="100" w:type="dxa"/>
-              <w:end w:w="140" w:type="dxa"/>
+              <w:top w:w="120" w:type="dxa"/>
+              <w:start w:w="120" w:type="dxa"/>
+              <w:bottom w:w="120" w:type="dxa"/>
+              <w:end w:w="120" w:type="dxa"/>
             </w:tcMar>
             <w:vAlign w:val="center"/>
           </w:tcPr>
@@ -275,29 +336,22 @@
             </w:pPr>
             <w:r>
               <w:rPr>
-                <w:rFonts w:ascii="Arial" w:hAnsi="Arial"/>
-                <w:b w:val="0"/>
-                <w:color w:val="111827"/>
-                <w:sz w:val="20"/>
+                <w:rFonts w:ascii="Aptos" w:hAnsi="Aptos"/>
+                <w:color w:val="27364A"/>
+                <w:sz w:val="15"/>
               </w:rPr>
-              <w:t>What do I see there?</w:t>
+              <w:t>What can I do?</w:t>
             </w:r>
           </w:p>
         </w:tc>
         <w:tc>
           <w:tcPr>
-            <w:tcW w:type="dxa" w:w="3240"/>
-            <w:tcBorders>
-              <w:top w:val="single" w:sz="6" w:space="0" w:color="D9E2EC"/>
-              <w:left w:val="single" w:sz="6" w:space="0" w:color="D9E2EC"/>
-              <w:bottom w:val="single" w:sz="6" w:space="0" w:color="D9E2EC"/>
-              <w:right w:val="single" w:sz="6" w:space="0" w:color="D9E2EC"/>
-            </w:tcBorders>
+            <w:tcW w:type="dxa" w:w="3024"/>
             <w:tcMar>
-              <w:top w:w="100" w:type="dxa"/>
-              <w:start w:w="140" w:type="dxa"/>
-              <w:bottom w:w="100" w:type="dxa"/>
-              <w:end w:w="140" w:type="dxa"/>
+              <w:top w:w="120" w:type="dxa"/>
+              <w:start w:w="120" w:type="dxa"/>
+              <w:bottom w:w="120" w:type="dxa"/>
+              <w:end w:w="120" w:type="dxa"/>
             </w:tcMar>
             <w:vAlign w:val="center"/>
           </w:tcPr>
@@ -307,29 +361,22 @@
             </w:pPr>
             <w:r>
               <w:rPr>
-                <w:rFonts w:ascii="Arial" w:hAnsi="Arial"/>
-                <w:b w:val="0"/>
-                <w:color w:val="111827"/>
-                <w:sz w:val="20"/>
+                <w:rFonts w:ascii="Aptos" w:hAnsi="Aptos"/>
+                <w:color w:val="27364A"/>
+                <w:sz w:val="15"/>
               </w:rPr>
-              <w:t>Persona / role</w:t>
+              <w:t>Manage / write permission</w:t>
             </w:r>
           </w:p>
         </w:tc>
         <w:tc>
           <w:tcPr>
-            <w:tcW w:type="dxa" w:w="3672"/>
-            <w:tcBorders>
-              <w:top w:val="single" w:sz="6" w:space="0" w:color="D9E2EC"/>
-              <w:left w:val="single" w:sz="6" w:space="0" w:color="D9E2EC"/>
-              <w:bottom w:val="single" w:sz="6" w:space="0" w:color="D9E2EC"/>
-              <w:right w:val="single" w:sz="6" w:space="0" w:color="D9E2EC"/>
-            </w:tcBorders>
+            <w:tcW w:type="dxa" w:w="4968"/>
             <w:tcMar>
-              <w:top w:w="100" w:type="dxa"/>
-              <w:start w:w="140" w:type="dxa"/>
-              <w:bottom w:w="100" w:type="dxa"/>
-              <w:end w:w="140" w:type="dxa"/>
+              <w:top w:w="120" w:type="dxa"/>
+              <w:start w:w="120" w:type="dxa"/>
+              <w:bottom w:w="120" w:type="dxa"/>
+              <w:end w:w="120" w:type="dxa"/>
             </w:tcMar>
             <w:vAlign w:val="center"/>
           </w:tcPr>
@@ -339,12 +386,271 @@
             </w:pPr>
             <w:r>
               <w:rPr>
-                <w:rFonts w:ascii="Arial" w:hAnsi="Arial"/>
-                <w:b w:val="0"/>
-                <w:color w:val="111827"/>
-                <w:sz w:val="20"/>
+                <w:rFonts w:ascii="Aptos" w:hAnsi="Aptos"/>
+                <w:color w:val="27364A"/>
+                <w:sz w:val="15"/>
               </w:rPr>
-              <w:t>Sidebar links, page sections, dashboard variants, content shape.</w:t>
+              <w:t>Create, edit, delete, configure, invite, assign, administer.</w:t>
+            </w:r>
+          </w:p>
+        </w:tc>
+      </w:tr>
+    </w:tbl>
+    <w:p/>
+    <w:p>
+      <w:pPr>
+        <w:pStyle w:val="Heading1"/>
+      </w:pPr>
+      <w:r>
+        <w:t>Decision Boundaries</w:t>
+      </w:r>
+    </w:p>
+    <w:p>
+      <w:pPr>
+        <w:pStyle w:val="Heading2"/>
+      </w:pPr>
+      <w:r>
+        <w:t>1. Context Selector: Where Can I Go?</w:t>
+      </w:r>
+    </w:p>
+    <w:p>
+      <w:pPr>
+        <w:pStyle w:val="ListBullet"/>
+        <w:spacing w:after="120" w:line="259" w:lineRule="auto"/>
+      </w:pPr>
+      <w:r>
+        <w:rPr>
+          <w:rFonts w:ascii="Aptos" w:hAnsi="Aptos"/>
+          <w:color w:val="1F2937"/>
+          <w:sz w:val="20"/>
+        </w:rPr>
+        <w:t>Foundation and Project selector eligibility should be based on view permission.</w:t>
+      </w:r>
+    </w:p>
+    <w:p>
+      <w:pPr>
+        <w:pStyle w:val="ListBullet"/>
+        <w:spacing w:after="120" w:line="259" w:lineRule="auto"/>
+      </w:pPr>
+      <w:r>
+        <w:rPr>
+          <w:rFonts w:ascii="Aptos" w:hAnsi="Aptos"/>
+          <w:color w:val="1F2937"/>
+          <w:sz w:val="20"/>
+        </w:rPr>
+        <w:t>If a context appears in the selector, the user should be allowed to enter that context.</w:t>
+      </w:r>
+    </w:p>
+    <w:p>
+      <w:pPr>
+        <w:pStyle w:val="ListBullet"/>
+        <w:spacing w:after="120" w:line="259" w:lineRule="auto"/>
+      </w:pPr>
+      <w:r>
+        <w:rPr>
+          <w:rFonts w:ascii="Aptos" w:hAnsi="Aptos"/>
+          <w:color w:val="1F2937"/>
+          <w:sz w:val="20"/>
+        </w:rPr>
+        <w:t>Persona may narrow or prioritize the experience, but it should not be the authority for selector eligibility.</w:t>
+      </w:r>
+    </w:p>
+    <w:p>
+      <w:pPr>
+        <w:pStyle w:val="Heading2"/>
+      </w:pPr>
+      <w:r>
+        <w:t>2. Sidebar and Page Content: What Do I See There?</w:t>
+      </w:r>
+    </w:p>
+    <w:p>
+      <w:pPr>
+        <w:pStyle w:val="ListBullet"/>
+        <w:spacing w:after="120" w:line="259" w:lineRule="auto"/>
+      </w:pPr>
+      <w:r>
+        <w:rPr>
+          <w:rFonts w:ascii="Aptos" w:hAnsi="Aptos"/>
+          <w:color w:val="1F2937"/>
+          <w:sz w:val="20"/>
+        </w:rPr>
+        <w:t>Once inside a view-permitted context, persona/role should shape navigation links, page sections, dashboards, tabs, cards, metrics, and content variants.</w:t>
+      </w:r>
+    </w:p>
+    <w:p>
+      <w:pPr>
+        <w:pStyle w:val="ListBullet"/>
+        <w:spacing w:after="120" w:line="259" w:lineRule="auto"/>
+      </w:pPr>
+      <w:r>
+        <w:rPr>
+          <w:rFonts w:ascii="Aptos" w:hAnsi="Aptos"/>
+          <w:color w:val="1F2937"/>
+          <w:sz w:val="20"/>
+        </w:rPr>
+        <w:t>This is where Executive Director, Board Member, Maintainer, Contributor, and committee roles can create different product experiences.</w:t>
+      </w:r>
+    </w:p>
+    <w:p>
+      <w:pPr>
+        <w:pStyle w:val="Heading2"/>
+      </w:pPr>
+      <w:r>
+        <w:t>3. Actions and Routes: What Can I Do?</w:t>
+      </w:r>
+    </w:p>
+    <w:p>
+      <w:pPr>
+        <w:pStyle w:val="ListBullet"/>
+        <w:spacing w:after="120" w:line="259" w:lineRule="auto"/>
+      </w:pPr>
+      <w:r>
+        <w:rPr>
+          <w:rFonts w:ascii="Aptos" w:hAnsi="Aptos"/>
+          <w:color w:val="1F2937"/>
+          <w:sz w:val="20"/>
+        </w:rPr>
+        <w:t>Create, edit, delete, configure, invite, assign, permission management, and admin operations should require manage/write permission.</w:t>
+      </w:r>
+    </w:p>
+    <w:p>
+      <w:pPr>
+        <w:pStyle w:val="ListBullet"/>
+        <w:spacing w:after="120" w:line="259" w:lineRule="auto"/>
+      </w:pPr>
+      <w:r>
+        <w:rPr>
+          <w:rFonts w:ascii="Aptos" w:hAnsi="Aptos"/>
+          <w:color w:val="1F2937"/>
+          <w:sz w:val="20"/>
+        </w:rPr>
+        <w:t>Buttons should be hidden or disabled, direct routes should be guarded, and backend/downstream authorization should remain authoritative.</w:t>
+      </w:r>
+    </w:p>
+    <w:p>
+      <w:pPr>
+        <w:pStyle w:val="Heading1"/>
+      </w:pPr>
+      <w:r>
+        <w:t>Default Foundation and Project Selection</w:t>
+      </w:r>
+    </w:p>
+    <w:p>
+      <w:pPr>
+        <w:spacing w:after="120" w:line="259" w:lineRule="auto"/>
+      </w:pPr>
+      <w:r>
+        <w:rPr>
+          <w:rFonts w:ascii="Aptos" w:hAnsi="Aptos"/>
+          <w:color w:val="1F2937"/>
+          <w:sz w:val="20"/>
+        </w:rPr>
+        <w:t>Defaulting should happen only after the selector candidate list has already been filtered by view permission.</w:t>
+      </w:r>
+    </w:p>
+    <w:tbl>
+      <w:tblPr>
+        <w:tblStyle w:val="TableGrid"/>
+        <w:tblW w:type="auto" w:w="0"/>
+        <w:jc w:val="center"/>
+        <w:tblLayout w:type="fixed"/>
+        <w:tblLook w:firstColumn="1" w:firstRow="1" w:lastColumn="0" w:lastRow="0" w:noHBand="0" w:noVBand="1" w:val="04A0"/>
+        <w:tblBorders>
+          <w:top w:val="single" w:sz="6" w:space="0" w:color="B7C6D8"/>
+          <w:left w:val="single" w:sz="6" w:space="0" w:color="B7C6D8"/>
+          <w:bottom w:val="single" w:sz="6" w:space="0" w:color="B7C6D8"/>
+          <w:right w:val="single" w:sz="6" w:space="0" w:color="B7C6D8"/>
+          <w:insideH w:val="single" w:sz="6" w:space="0" w:color="B7C6D8"/>
+          <w:insideV w:val="single" w:sz="6" w:space="0" w:color="B7C6D8"/>
+        </w:tblBorders>
+      </w:tblPr>
+      <w:tblGrid>
+        <w:gridCol w:w="3408"/>
+        <w:gridCol w:w="3408"/>
+        <w:gridCol w:w="3408"/>
+      </w:tblGrid>
+      <w:tr>
+        <w:trPr>
+          <w:tblHeader w:val="true"/>
+        </w:trPr>
+        <w:tc>
+          <w:tcPr>
+            <w:tcW w:type="dxa" w:w="2232"/>
+            <w:shd w:fill="D9E7F5"/>
+            <w:tcMar>
+              <w:top w:w="120" w:type="dxa"/>
+              <w:start w:w="120" w:type="dxa"/>
+              <w:bottom w:w="120" w:type="dxa"/>
+              <w:end w:w="120" w:type="dxa"/>
+            </w:tcMar>
+            <w:vAlign w:val="center"/>
+          </w:tcPr>
+          <w:p>
+            <w:pPr>
+              <w:jc w:val="left"/>
+            </w:pPr>
+            <w:r>
+              <w:rPr>
+                <w:rFonts w:ascii="Aptos" w:hAnsi="Aptos"/>
+                <w:b/>
+                <w:color w:val="17324D"/>
+                <w:sz w:val="16"/>
+              </w:rPr>
+              <w:t>Step</w:t>
+            </w:r>
+          </w:p>
+        </w:tc>
+        <w:tc>
+          <w:tcPr>
+            <w:tcW w:type="dxa" w:w="3024"/>
+            <w:shd w:fill="D9E7F5"/>
+            <w:tcMar>
+              <w:top w:w="120" w:type="dxa"/>
+              <w:start w:w="120" w:type="dxa"/>
+              <w:bottom w:w="120" w:type="dxa"/>
+              <w:end w:w="120" w:type="dxa"/>
+            </w:tcMar>
+            <w:vAlign w:val="center"/>
+          </w:tcPr>
+          <w:p>
+            <w:pPr>
+              <w:jc w:val="left"/>
+            </w:pPr>
+            <w:r>
+              <w:rPr>
+                <w:rFonts w:ascii="Aptos" w:hAnsi="Aptos"/>
+                <w:b/>
+                <w:color w:val="17324D"/>
+                <w:sz w:val="16"/>
+              </w:rPr>
+              <w:t>Foundation Lens</w:t>
+            </w:r>
+          </w:p>
+        </w:tc>
+        <w:tc>
+          <w:tcPr>
+            <w:tcW w:type="dxa" w:w="4968"/>
+            <w:shd w:fill="D9E7F5"/>
+            <w:tcMar>
+              <w:top w:w="120" w:type="dxa"/>
+              <w:start w:w="120" w:type="dxa"/>
+              <w:bottom w:w="120" w:type="dxa"/>
+              <w:end w:w="120" w:type="dxa"/>
+            </w:tcMar>
+            <w:vAlign w:val="center"/>
+          </w:tcPr>
+          <w:p>
+            <w:pPr>
+              <w:jc w:val="left"/>
+            </w:pPr>
+            <w:r>
+              <w:rPr>
+                <w:rFonts w:ascii="Aptos" w:hAnsi="Aptos"/>
+                <w:b/>
+                <w:color w:val="17324D"/>
+                <w:sz w:val="16"/>
+              </w:rPr>
+              <w:t>Project Lens</w:t>
             </w:r>
           </w:p>
         </w:tc>
@@ -352,18 +658,12 @@
       <w:tr>
         <w:tc>
           <w:tcPr>
-            <w:tcW w:type="dxa" w:w="2448"/>
-            <w:tcBorders>
-              <w:top w:val="single" w:sz="6" w:space="0" w:color="D9E2EC"/>
-              <w:left w:val="single" w:sz="6" w:space="0" w:color="D9E2EC"/>
-              <w:bottom w:val="single" w:sz="6" w:space="0" w:color="D9E2EC"/>
-              <w:right w:val="single" w:sz="6" w:space="0" w:color="D9E2EC"/>
-            </w:tcBorders>
+            <w:tcW w:type="dxa" w:w="2232"/>
             <w:tcMar>
-              <w:top w:w="100" w:type="dxa"/>
-              <w:start w:w="140" w:type="dxa"/>
-              <w:bottom w:w="100" w:type="dxa"/>
-              <w:end w:w="140" w:type="dxa"/>
+              <w:top w:w="120" w:type="dxa"/>
+              <w:start w:w="120" w:type="dxa"/>
+              <w:bottom w:w="120" w:type="dxa"/>
+              <w:end w:w="120" w:type="dxa"/>
             </w:tcMar>
             <w:vAlign w:val="center"/>
           </w:tcPr>
@@ -373,29 +673,22 @@
             </w:pPr>
             <w:r>
               <w:rPr>
-                <w:rFonts w:ascii="Arial" w:hAnsi="Arial"/>
-                <w:b w:val="0"/>
-                <w:color w:val="111827"/>
-                <w:sz w:val="20"/>
+                <w:rFonts w:ascii="Aptos" w:hAnsi="Aptos"/>
+                <w:color w:val="27364A"/>
+                <w:sz w:val="15"/>
               </w:rPr>
-              <w:t>What can I do?</w:t>
+              <w:t>1</w:t>
             </w:r>
           </w:p>
         </w:tc>
         <w:tc>
           <w:tcPr>
-            <w:tcW w:type="dxa" w:w="3240"/>
-            <w:tcBorders>
-              <w:top w:val="single" w:sz="6" w:space="0" w:color="D9E2EC"/>
-              <w:left w:val="single" w:sz="6" w:space="0" w:color="D9E2EC"/>
-              <w:bottom w:val="single" w:sz="6" w:space="0" w:color="D9E2EC"/>
-              <w:right w:val="single" w:sz="6" w:space="0" w:color="D9E2EC"/>
-            </w:tcBorders>
+            <w:tcW w:type="dxa" w:w="3024"/>
             <w:tcMar>
-              <w:top w:w="100" w:type="dxa"/>
-              <w:start w:w="140" w:type="dxa"/>
-              <w:bottom w:w="100" w:type="dxa"/>
-              <w:end w:w="140" w:type="dxa"/>
+              <w:top w:w="120" w:type="dxa"/>
+              <w:start w:w="120" w:type="dxa"/>
+              <w:bottom w:w="120" w:type="dxa"/>
+              <w:end w:w="120" w:type="dxa"/>
             </w:tcMar>
             <w:vAlign w:val="center"/>
           </w:tcPr>
@@ -405,29 +698,22 @@
             </w:pPr>
             <w:r>
               <w:rPr>
-                <w:rFonts w:ascii="Arial" w:hAnsi="Arial"/>
-                <w:b w:val="0"/>
-                <w:color w:val="111827"/>
-                <w:sz w:val="20"/>
+                <w:rFonts w:ascii="Aptos" w:hAnsi="Aptos"/>
+                <w:color w:val="27364A"/>
+                <w:sz w:val="15"/>
               </w:rPr>
-              <w:t>Manage / write permission</w:t>
+              <w:t>Keep existing selected foundation if still view-permitted.</w:t>
             </w:r>
           </w:p>
         </w:tc>
         <w:tc>
           <w:tcPr>
-            <w:tcW w:type="dxa" w:w="3672"/>
-            <w:tcBorders>
-              <w:top w:val="single" w:sz="6" w:space="0" w:color="D9E2EC"/>
-              <w:left w:val="single" w:sz="6" w:space="0" w:color="D9E2EC"/>
-              <w:bottom w:val="single" w:sz="6" w:space="0" w:color="D9E2EC"/>
-              <w:right w:val="single" w:sz="6" w:space="0" w:color="D9E2EC"/>
-            </w:tcBorders>
+            <w:tcW w:type="dxa" w:w="4968"/>
             <w:tcMar>
-              <w:top w:w="100" w:type="dxa"/>
-              <w:start w:w="140" w:type="dxa"/>
-              <w:bottom w:w="100" w:type="dxa"/>
-              <w:end w:w="140" w:type="dxa"/>
+              <w:top w:w="120" w:type="dxa"/>
+              <w:start w:w="120" w:type="dxa"/>
+              <w:bottom w:w="120" w:type="dxa"/>
+              <w:end w:w="120" w:type="dxa"/>
             </w:tcMar>
             <w:vAlign w:val="center"/>
           </w:tcPr>
@@ -437,157 +723,24 @@
             </w:pPr>
             <w:r>
               <w:rPr>
-                <w:rFonts w:ascii="Arial" w:hAnsi="Arial"/>
-                <w:b w:val="0"/>
-                <w:color w:val="111827"/>
-                <w:sz w:val="20"/>
+                <w:rFonts w:ascii="Aptos" w:hAnsi="Aptos"/>
+                <w:color w:val="27364A"/>
+                <w:sz w:val="15"/>
               </w:rPr>
-              <w:t>Create, edit, delete, configure, invite, assign, administer.</w:t>
+              <w:t>Keep existing selected project if still view-permitted.</w:t>
             </w:r>
           </w:p>
         </w:tc>
       </w:tr>
-    </w:tbl>
-    <w:p>
-      <w:pPr>
-        <w:pStyle w:val="Heading1"/>
-        <w:keepNext/>
-      </w:pPr>
-      <w:r>
-        <w:t>Decision Boundaries</w:t>
-      </w:r>
-    </w:p>
-    <w:p>
-      <w:pPr>
-        <w:pStyle w:val="Heading2"/>
-        <w:keepNext/>
-      </w:pPr>
-      <w:r>
-        <w:t>1. Context Selector: Where Can I Go?</w:t>
-      </w:r>
-    </w:p>
-    <w:p>
-      <w:pPr>
-        <w:pStyle w:val="ListBullet"/>
-        <w:spacing w:after="80"/>
-      </w:pPr>
-      <w:r>
-        <w:t>Foundation and Project selector eligibility should be based on view permission.</w:t>
-      </w:r>
-    </w:p>
-    <w:p>
-      <w:pPr>
-        <w:pStyle w:val="ListBullet"/>
-        <w:spacing w:after="80"/>
-      </w:pPr>
-      <w:r>
-        <w:t>If a context appears in the selector, the user should be allowed to enter that context.</w:t>
-      </w:r>
-    </w:p>
-    <w:p>
-      <w:pPr>
-        <w:pStyle w:val="ListBullet"/>
-        <w:spacing w:after="80"/>
-      </w:pPr>
-      <w:r>
-        <w:t>Persona may narrow or prioritize the experience, but it should not be the authority for selector eligibility.</w:t>
-      </w:r>
-    </w:p>
-    <w:p>
-      <w:pPr>
-        <w:pStyle w:val="Heading2"/>
-        <w:keepNext/>
-      </w:pPr>
-      <w:r>
-        <w:t>2. Sidebar and Page Content: What Do I See There?</w:t>
-      </w:r>
-    </w:p>
-    <w:p>
-      <w:pPr>
-        <w:pStyle w:val="ListBullet"/>
-        <w:spacing w:after="80"/>
-      </w:pPr>
-      <w:r>
-        <w:t>Once inside a view-permitted context, persona/role should shape navigation links, page sections, dashboards, tabs, cards, metrics, and content variants.</w:t>
-      </w:r>
-    </w:p>
-    <w:p>
-      <w:pPr>
-        <w:pStyle w:val="ListBullet"/>
-        <w:spacing w:after="80"/>
-      </w:pPr>
-      <w:r>
-        <w:t>This is where Executive Director, Board Member, Maintainer, Contributor, and committee roles can create different product experiences.</w:t>
-      </w:r>
-    </w:p>
-    <w:p>
-      <w:pPr>
-        <w:pStyle w:val="Heading2"/>
-        <w:keepNext/>
-      </w:pPr>
-      <w:r>
-        <w:t>3. Actions and Routes: What Can I Do?</w:t>
-      </w:r>
-    </w:p>
-    <w:p>
-      <w:pPr>
-        <w:pStyle w:val="ListBullet"/>
-        <w:spacing w:after="80"/>
-      </w:pPr>
-      <w:r>
-        <w:t>Create, edit, delete, configure, invite, assign, permission management, and admin operations should require manage/write permission.</w:t>
-      </w:r>
-    </w:p>
-    <w:p>
-      <w:pPr>
-        <w:pStyle w:val="ListBullet"/>
-        <w:spacing w:after="80"/>
-      </w:pPr>
-      <w:r>
-        <w:t>Buttons should be hidden or disabled, direct routes should be guarded, and backend/downstream authorization should remain authoritative.</w:t>
-      </w:r>
-    </w:p>
-    <w:p>
-      <w:pPr>
-        <w:pStyle w:val="Heading1"/>
-        <w:keepNext/>
-      </w:pPr>
-      <w:r>
-        <w:t>Default Foundation and Project Selection</w:t>
-      </w:r>
-    </w:p>
-    <w:p>
-      <w:r>
-        <w:t>Defaulting should happen only after the selector candidate list has already been filtered by view permission.</w:t>
-      </w:r>
-    </w:p>
-    <w:tbl>
-      <w:tblPr>
-        <w:tblW w:type="auto" w:w="0"/>
-        <w:tblLayout w:type="fixed"/>
-        <w:tblLook w:firstColumn="1" w:firstRow="1" w:lastColumn="0" w:lastRow="0" w:noHBand="0" w:noVBand="1" w:val="04A0"/>
-      </w:tblPr>
-      <w:tblGrid>
-        <w:gridCol w:w="3264"/>
-        <w:gridCol w:w="3264"/>
-        <w:gridCol w:w="3264"/>
-      </w:tblGrid>
       <w:tr>
         <w:tc>
           <w:tcPr>
-            <w:tcW w:type="dxa" w:w="2016"/>
-            <w:shd w:fill="EEF6F0"/>
-            <w:tcBorders>
-              <w:top w:val="single" w:sz="6" w:space="0" w:color="D9E2EC"/>
-              <w:left w:val="single" w:sz="6" w:space="0" w:color="D9E2EC"/>
-              <w:bottom w:val="single" w:sz="6" w:space="0" w:color="D9E2EC"/>
-              <w:right w:val="single" w:sz="6" w:space="0" w:color="D9E2EC"/>
-            </w:tcBorders>
+            <w:tcW w:type="dxa" w:w="2232"/>
             <w:tcMar>
-              <w:top w:w="100" w:type="dxa"/>
-              <w:start w:w="140" w:type="dxa"/>
-              <w:bottom w:w="100" w:type="dxa"/>
-              <w:end w:w="140" w:type="dxa"/>
+              <w:top w:w="120" w:type="dxa"/>
+              <w:start w:w="120" w:type="dxa"/>
+              <w:bottom w:w="120" w:type="dxa"/>
+              <w:end w:w="120" w:type="dxa"/>
             </w:tcMar>
             <w:vAlign w:val="center"/>
           </w:tcPr>
@@ -597,30 +750,22 @@
             </w:pPr>
             <w:r>
               <w:rPr>
-                <w:rFonts w:ascii="Arial" w:hAnsi="Arial"/>
-                <w:b/>
-                <w:color w:val="111827"/>
-                <w:sz w:val="20"/>
+                <w:rFonts w:ascii="Aptos" w:hAnsi="Aptos"/>
+                <w:color w:val="27364A"/>
+                <w:sz w:val="15"/>
               </w:rPr>
-              <w:t>Step</w:t>
+              <w:t>2</w:t>
             </w:r>
           </w:p>
         </w:tc>
         <w:tc>
           <w:tcPr>
-            <w:tcW w:type="dxa" w:w="3672"/>
-            <w:shd w:fill="EEF6F0"/>
-            <w:tcBorders>
-              <w:top w:val="single" w:sz="6" w:space="0" w:color="D9E2EC"/>
-              <w:left w:val="single" w:sz="6" w:space="0" w:color="D9E2EC"/>
-              <w:bottom w:val="single" w:sz="6" w:space="0" w:color="D9E2EC"/>
-              <w:right w:val="single" w:sz="6" w:space="0" w:color="D9E2EC"/>
-            </w:tcBorders>
+            <w:tcW w:type="dxa" w:w="3024"/>
             <w:tcMar>
-              <w:top w:w="100" w:type="dxa"/>
-              <w:start w:w="140" w:type="dxa"/>
-              <w:bottom w:w="100" w:type="dxa"/>
-              <w:end w:w="140" w:type="dxa"/>
+              <w:top w:w="120" w:type="dxa"/>
+              <w:start w:w="120" w:type="dxa"/>
+              <w:bottom w:w="120" w:type="dxa"/>
+              <w:end w:w="120" w:type="dxa"/>
             </w:tcMar>
             <w:vAlign w:val="center"/>
           </w:tcPr>
@@ -630,30 +775,22 @@
             </w:pPr>
             <w:r>
               <w:rPr>
-                <w:rFonts w:ascii="Arial" w:hAnsi="Arial"/>
-                <w:b/>
-                <w:color w:val="111827"/>
-                <w:sz w:val="20"/>
+                <w:rFonts w:ascii="Aptos" w:hAnsi="Aptos"/>
+                <w:color w:val="27364A"/>
+                <w:sz w:val="15"/>
               </w:rPr>
-              <w:t>Foundation Lens</w:t>
+              <w:t>Choose Executive Director foundation if view-permitted.</w:t>
             </w:r>
           </w:p>
         </w:tc>
         <w:tc>
           <w:tcPr>
-            <w:tcW w:type="dxa" w:w="3672"/>
-            <w:shd w:fill="EEF6F0"/>
-            <w:tcBorders>
-              <w:top w:val="single" w:sz="6" w:space="0" w:color="D9E2EC"/>
-              <w:left w:val="single" w:sz="6" w:space="0" w:color="D9E2EC"/>
-              <w:bottom w:val="single" w:sz="6" w:space="0" w:color="D9E2EC"/>
-              <w:right w:val="single" w:sz="6" w:space="0" w:color="D9E2EC"/>
-            </w:tcBorders>
+            <w:tcW w:type="dxa" w:w="4968"/>
             <w:tcMar>
-              <w:top w:w="100" w:type="dxa"/>
-              <w:start w:w="140" w:type="dxa"/>
-              <w:bottom w:w="100" w:type="dxa"/>
-              <w:end w:w="140" w:type="dxa"/>
+              <w:top w:w="120" w:type="dxa"/>
+              <w:start w:w="120" w:type="dxa"/>
+              <w:bottom w:w="120" w:type="dxa"/>
+              <w:end w:w="120" w:type="dxa"/>
             </w:tcMar>
             <w:vAlign w:val="center"/>
           </w:tcPr>
@@ -663,12 +800,11 @@
             </w:pPr>
             <w:r>
               <w:rPr>
-                <w:rFonts w:ascii="Arial" w:hAnsi="Arial"/>
-                <w:b/>
-                <w:color w:val="111827"/>
-                <w:sz w:val="20"/>
+                <w:rFonts w:ascii="Aptos" w:hAnsi="Aptos"/>
+                <w:color w:val="27364A"/>
+                <w:sz w:val="15"/>
               </w:rPr>
-              <w:t>Project Lens</w:t>
+              <w:t>Choose Maintainer project if view-permitted.</w:t>
             </w:r>
           </w:p>
         </w:tc>
@@ -676,18 +812,12 @@
       <w:tr>
         <w:tc>
           <w:tcPr>
-            <w:tcW w:type="dxa" w:w="2016"/>
-            <w:tcBorders>
-              <w:top w:val="single" w:sz="6" w:space="0" w:color="D9E2EC"/>
-              <w:left w:val="single" w:sz="6" w:space="0" w:color="D9E2EC"/>
-              <w:bottom w:val="single" w:sz="6" w:space="0" w:color="D9E2EC"/>
-              <w:right w:val="single" w:sz="6" w:space="0" w:color="D9E2EC"/>
-            </w:tcBorders>
+            <w:tcW w:type="dxa" w:w="2232"/>
             <w:tcMar>
-              <w:top w:w="100" w:type="dxa"/>
-              <w:start w:w="140" w:type="dxa"/>
-              <w:bottom w:w="100" w:type="dxa"/>
-              <w:end w:w="140" w:type="dxa"/>
+              <w:top w:w="120" w:type="dxa"/>
+              <w:start w:w="120" w:type="dxa"/>
+              <w:bottom w:w="120" w:type="dxa"/>
+              <w:end w:w="120" w:type="dxa"/>
             </w:tcMar>
             <w:vAlign w:val="center"/>
           </w:tcPr>
@@ -697,29 +827,22 @@
             </w:pPr>
             <w:r>
               <w:rPr>
-                <w:rFonts w:ascii="Arial" w:hAnsi="Arial"/>
-                <w:b w:val="0"/>
-                <w:color w:val="111827"/>
-                <w:sz w:val="20"/>
+                <w:rFonts w:ascii="Aptos" w:hAnsi="Aptos"/>
+                <w:color w:val="27364A"/>
+                <w:sz w:val="15"/>
               </w:rPr>
-              <w:t>1</w:t>
+              <w:t>3</w:t>
             </w:r>
           </w:p>
         </w:tc>
         <w:tc>
           <w:tcPr>
-            <w:tcW w:type="dxa" w:w="3672"/>
-            <w:tcBorders>
-              <w:top w:val="single" w:sz="6" w:space="0" w:color="D9E2EC"/>
-              <w:left w:val="single" w:sz="6" w:space="0" w:color="D9E2EC"/>
-              <w:bottom w:val="single" w:sz="6" w:space="0" w:color="D9E2EC"/>
-              <w:right w:val="single" w:sz="6" w:space="0" w:color="D9E2EC"/>
-            </w:tcBorders>
+            <w:tcW w:type="dxa" w:w="3024"/>
             <w:tcMar>
-              <w:top w:w="100" w:type="dxa"/>
-              <w:start w:w="140" w:type="dxa"/>
-              <w:bottom w:w="100" w:type="dxa"/>
-              <w:end w:w="140" w:type="dxa"/>
+              <w:top w:w="120" w:type="dxa"/>
+              <w:start w:w="120" w:type="dxa"/>
+              <w:bottom w:w="120" w:type="dxa"/>
+              <w:end w:w="120" w:type="dxa"/>
             </w:tcMar>
             <w:vAlign w:val="center"/>
           </w:tcPr>
@@ -729,29 +852,22 @@
             </w:pPr>
             <w:r>
               <w:rPr>
-                <w:rFonts w:ascii="Arial" w:hAnsi="Arial"/>
-                <w:b w:val="0"/>
-                <w:color w:val="111827"/>
-                <w:sz w:val="20"/>
+                <w:rFonts w:ascii="Aptos" w:hAnsi="Aptos"/>
+                <w:color w:val="27364A"/>
+                <w:sz w:val="15"/>
               </w:rPr>
-              <w:t>Keep existing selected foundation if still view-permitted.</w:t>
+              <w:t>Choose Board Member foundation if view-permitted.</w:t>
             </w:r>
           </w:p>
         </w:tc>
         <w:tc>
           <w:tcPr>
-            <w:tcW w:type="dxa" w:w="3672"/>
-            <w:tcBorders>
-              <w:top w:val="single" w:sz="6" w:space="0" w:color="D9E2EC"/>
-              <w:left w:val="single" w:sz="6" w:space="0" w:color="D9E2EC"/>
-              <w:bottom w:val="single" w:sz="6" w:space="0" w:color="D9E2EC"/>
-              <w:right w:val="single" w:sz="6" w:space="0" w:color="D9E2EC"/>
-            </w:tcBorders>
+            <w:tcW w:type="dxa" w:w="4968"/>
             <w:tcMar>
-              <w:top w:w="100" w:type="dxa"/>
-              <w:start w:w="140" w:type="dxa"/>
-              <w:bottom w:w="100" w:type="dxa"/>
-              <w:end w:w="140" w:type="dxa"/>
+              <w:top w:w="120" w:type="dxa"/>
+              <w:start w:w="120" w:type="dxa"/>
+              <w:bottom w:w="120" w:type="dxa"/>
+              <w:end w:w="120" w:type="dxa"/>
             </w:tcMar>
             <w:vAlign w:val="center"/>
           </w:tcPr>
@@ -761,12 +877,11 @@
             </w:pPr>
             <w:r>
               <w:rPr>
-                <w:rFonts w:ascii="Arial" w:hAnsi="Arial"/>
-                <w:b w:val="0"/>
-                <w:color w:val="111827"/>
-                <w:sz w:val="20"/>
+                <w:rFonts w:ascii="Aptos" w:hAnsi="Aptos"/>
+                <w:color w:val="27364A"/>
+                <w:sz w:val="15"/>
               </w:rPr>
-              <w:t>Keep existing selected project if still view-permitted.</w:t>
+              <w:t>Choose Contributor project if view-permitted.</w:t>
             </w:r>
           </w:p>
         </w:tc>
@@ -774,18 +889,12 @@
       <w:tr>
         <w:tc>
           <w:tcPr>
-            <w:tcW w:type="dxa" w:w="2016"/>
-            <w:tcBorders>
-              <w:top w:val="single" w:sz="6" w:space="0" w:color="D9E2EC"/>
-              <w:left w:val="single" w:sz="6" w:space="0" w:color="D9E2EC"/>
-              <w:bottom w:val="single" w:sz="6" w:space="0" w:color="D9E2EC"/>
-              <w:right w:val="single" w:sz="6" w:space="0" w:color="D9E2EC"/>
-            </w:tcBorders>
+            <w:tcW w:type="dxa" w:w="2232"/>
             <w:tcMar>
-              <w:top w:w="100" w:type="dxa"/>
-              <w:start w:w="140" w:type="dxa"/>
-              <w:bottom w:w="100" w:type="dxa"/>
-              <w:end w:w="140" w:type="dxa"/>
+              <w:top w:w="120" w:type="dxa"/>
+              <w:start w:w="120" w:type="dxa"/>
+              <w:bottom w:w="120" w:type="dxa"/>
+              <w:end w:w="120" w:type="dxa"/>
             </w:tcMar>
             <w:vAlign w:val="center"/>
           </w:tcPr>
@@ -795,29 +904,22 @@
             </w:pPr>
             <w:r>
               <w:rPr>
-                <w:rFonts w:ascii="Arial" w:hAnsi="Arial"/>
-                <w:b w:val="0"/>
-                <w:color w:val="111827"/>
-                <w:sz w:val="20"/>
+                <w:rFonts w:ascii="Aptos" w:hAnsi="Aptos"/>
+                <w:color w:val="27364A"/>
+                <w:sz w:val="15"/>
               </w:rPr>
-              <w:t>2</w:t>
+              <w:t>4</w:t>
             </w:r>
           </w:p>
         </w:tc>
         <w:tc>
           <w:tcPr>
-            <w:tcW w:type="dxa" w:w="3672"/>
-            <w:tcBorders>
-              <w:top w:val="single" w:sz="6" w:space="0" w:color="D9E2EC"/>
-              <w:left w:val="single" w:sz="6" w:space="0" w:color="D9E2EC"/>
-              <w:bottom w:val="single" w:sz="6" w:space="0" w:color="D9E2EC"/>
-              <w:right w:val="single" w:sz="6" w:space="0" w:color="D9E2EC"/>
-            </w:tcBorders>
+            <w:tcW w:type="dxa" w:w="3024"/>
             <w:tcMar>
-              <w:top w:w="100" w:type="dxa"/>
-              <w:start w:w="140" w:type="dxa"/>
-              <w:bottom w:w="100" w:type="dxa"/>
-              <w:end w:w="140" w:type="dxa"/>
+              <w:top w:w="120" w:type="dxa"/>
+              <w:start w:w="120" w:type="dxa"/>
+              <w:bottom w:w="120" w:type="dxa"/>
+              <w:end w:w="120" w:type="dxa"/>
             </w:tcMar>
             <w:vAlign w:val="center"/>
           </w:tcPr>
@@ -827,29 +929,22 @@
             </w:pPr>
             <w:r>
               <w:rPr>
-                <w:rFonts w:ascii="Arial" w:hAnsi="Arial"/>
-                <w:b w:val="0"/>
-                <w:color w:val="111827"/>
-                <w:sz w:val="20"/>
+                <w:rFonts w:ascii="Aptos" w:hAnsi="Aptos"/>
+                <w:color w:val="27364A"/>
+                <w:sz w:val="15"/>
               </w:rPr>
-              <w:t>Choose Executive Director foundation if view-permitted.</w:t>
+              <w:t>Choose first view-permitted foundation in stable order.</w:t>
             </w:r>
           </w:p>
         </w:tc>
         <w:tc>
           <w:tcPr>
-            <w:tcW w:type="dxa" w:w="3672"/>
-            <w:tcBorders>
-              <w:top w:val="single" w:sz="6" w:space="0" w:color="D9E2EC"/>
-              <w:left w:val="single" w:sz="6" w:space="0" w:color="D9E2EC"/>
-              <w:bottom w:val="single" w:sz="6" w:space="0" w:color="D9E2EC"/>
-              <w:right w:val="single" w:sz="6" w:space="0" w:color="D9E2EC"/>
-            </w:tcBorders>
+            <w:tcW w:type="dxa" w:w="4968"/>
             <w:tcMar>
-              <w:top w:w="100" w:type="dxa"/>
-              <w:start w:w="140" w:type="dxa"/>
-              <w:bottom w:w="100" w:type="dxa"/>
-              <w:end w:w="140" w:type="dxa"/>
+              <w:top w:w="120" w:type="dxa"/>
+              <w:start w:w="120" w:type="dxa"/>
+              <w:bottom w:w="120" w:type="dxa"/>
+              <w:end w:w="120" w:type="dxa"/>
             </w:tcMar>
             <w:vAlign w:val="center"/>
           </w:tcPr>
@@ -859,12 +954,241 @@
             </w:pPr>
             <w:r>
               <w:rPr>
-                <w:rFonts w:ascii="Arial" w:hAnsi="Arial"/>
-                <w:b w:val="0"/>
-                <w:color w:val="111827"/>
-                <w:sz w:val="20"/>
+                <w:rFonts w:ascii="Aptos" w:hAnsi="Aptos"/>
+                <w:color w:val="27364A"/>
+                <w:sz w:val="15"/>
               </w:rPr>
-              <w:t>Choose Maintainer project if view-permitted.</w:t>
+              <w:t>Choose first view-permitted project in stable order.</w:t>
+            </w:r>
+          </w:p>
+        </w:tc>
+      </w:tr>
+    </w:tbl>
+    <w:p/>
+    <w:p>
+      <w:pPr>
+        <w:pStyle w:val="Heading1"/>
+      </w:pPr>
+      <w:r>
+        <w:t>Implementation Priority</w:t>
+      </w:r>
+    </w:p>
+    <w:p>
+      <w:pPr>
+        <w:spacing w:before="40" w:after="160"/>
+        <w:ind w:left="259"/>
+      </w:pPr>
+      <w:r>
+        <w:rPr>
+          <w:rFonts w:ascii="Aptos Mono" w:hAnsi="Aptos Mono"/>
+          <w:color w:val="17324D"/>
+          <w:sz w:val="18"/>
+        </w:rPr>
+        <w:t>Priority 1:</w:t>
+        <w:br/>
+        <w:t>Make Foundation/Project selector eligibility explicitly view-permission scoped.</w:t>
+        <w:br/>
+        <w:br/>
+        <w:t>Candidate contexts + view permission check = selector items</w:t>
+      </w:r>
+    </w:p>
+    <w:p>
+      <w:pPr>
+        <w:pStyle w:val="Heading1"/>
+      </w:pPr>
+      <w:r>
+        <w:t>Current Code Status</w:t>
+      </w:r>
+    </w:p>
+    <w:p>
+      <w:pPr>
+        <w:spacing w:after="120" w:line="259" w:lineRule="auto"/>
+      </w:pPr>
+      <w:r>
+        <w:rPr>
+          <w:rFonts w:ascii="Aptos" w:hAnsi="Aptos"/>
+          <w:color w:val="1F2937"/>
+          <w:sz w:val="20"/>
+        </w:rPr>
+        <w:t xml:space="preserve">Verified against </w:t>
+      </w:r>
+      <w:r>
+        <w:rPr>
+          <w:rFonts w:ascii="Aptos" w:hAnsi="Aptos"/>
+          <w:b/>
+          <w:color w:val="1F2937"/>
+          <w:sz w:val="20"/>
+        </w:rPr>
+        <w:t>origin/main</w:t>
+      </w:r>
+      <w:r>
+        <w:rPr>
+          <w:rFonts w:ascii="Aptos" w:hAnsi="Aptos"/>
+          <w:color w:val="1F2937"/>
+          <w:sz w:val="20"/>
+        </w:rPr>
+        <w:t xml:space="preserve"> on May 6, 2026.</w:t>
+      </w:r>
+    </w:p>
+    <w:tbl>
+      <w:tblPr>
+        <w:tblStyle w:val="TableGrid"/>
+        <w:tblW w:type="auto" w:w="0"/>
+        <w:jc w:val="center"/>
+        <w:tblLayout w:type="fixed"/>
+        <w:tblLook w:firstColumn="1" w:firstRow="1" w:lastColumn="0" w:lastRow="0" w:noHBand="0" w:noVBand="1" w:val="04A0"/>
+        <w:tblBorders>
+          <w:top w:val="single" w:sz="6" w:space="0" w:color="B7C6D8"/>
+          <w:left w:val="single" w:sz="6" w:space="0" w:color="B7C6D8"/>
+          <w:bottom w:val="single" w:sz="6" w:space="0" w:color="B7C6D8"/>
+          <w:right w:val="single" w:sz="6" w:space="0" w:color="B7C6D8"/>
+          <w:insideH w:val="single" w:sz="6" w:space="0" w:color="B7C6D8"/>
+          <w:insideV w:val="single" w:sz="6" w:space="0" w:color="B7C6D8"/>
+        </w:tblBorders>
+      </w:tblPr>
+      <w:tblGrid>
+        <w:gridCol w:w="2045"/>
+        <w:gridCol w:w="2045"/>
+        <w:gridCol w:w="2045"/>
+        <w:gridCol w:w="2045"/>
+        <w:gridCol w:w="2045"/>
+      </w:tblGrid>
+      <w:tr>
+        <w:trPr>
+          <w:tblHeader w:val="true"/>
+        </w:trPr>
+        <w:tc>
+          <w:tcPr>
+            <w:tcW w:type="dxa" w:w="1800"/>
+            <w:shd w:fill="D9E7F5"/>
+            <w:tcMar>
+              <w:top w:w="120" w:type="dxa"/>
+              <w:start w:w="120" w:type="dxa"/>
+              <w:bottom w:w="120" w:type="dxa"/>
+              <w:end w:w="120" w:type="dxa"/>
+            </w:tcMar>
+            <w:vAlign w:val="center"/>
+          </w:tcPr>
+          <w:p>
+            <w:pPr>
+              <w:jc w:val="left"/>
+            </w:pPr>
+            <w:r>
+              <w:rPr>
+                <w:rFonts w:ascii="Aptos" w:hAnsi="Aptos"/>
+                <w:b/>
+                <w:color w:val="17324D"/>
+                <w:sz w:val="16"/>
+              </w:rPr>
+              <w:t>Area</w:t>
+            </w:r>
+          </w:p>
+        </w:tc>
+        <w:tc>
+          <w:tcPr>
+            <w:tcW w:type="dxa" w:w="2232"/>
+            <w:shd w:fill="D9E7F5"/>
+            <w:tcMar>
+              <w:top w:w="120" w:type="dxa"/>
+              <w:start w:w="120" w:type="dxa"/>
+              <w:bottom w:w="120" w:type="dxa"/>
+              <w:end w:w="120" w:type="dxa"/>
+            </w:tcMar>
+            <w:vAlign w:val="center"/>
+          </w:tcPr>
+          <w:p>
+            <w:pPr>
+              <w:jc w:val="left"/>
+            </w:pPr>
+            <w:r>
+              <w:rPr>
+                <w:rFonts w:ascii="Aptos" w:hAnsi="Aptos"/>
+                <w:b/>
+                <w:color w:val="17324D"/>
+                <w:sz w:val="16"/>
+              </w:rPr>
+              <w:t>Target behavior</w:t>
+            </w:r>
+          </w:p>
+        </w:tc>
+        <w:tc>
+          <w:tcPr>
+            <w:tcW w:type="dxa" w:w="1655"/>
+            <w:shd w:fill="D9E7F5"/>
+            <w:tcMar>
+              <w:top w:w="120" w:type="dxa"/>
+              <w:start w:w="120" w:type="dxa"/>
+              <w:bottom w:w="120" w:type="dxa"/>
+              <w:end w:w="120" w:type="dxa"/>
+            </w:tcMar>
+            <w:vAlign w:val="center"/>
+          </w:tcPr>
+          <w:p>
+            <w:pPr>
+              <w:jc w:val="left"/>
+            </w:pPr>
+            <w:r>
+              <w:rPr>
+                <w:rFonts w:ascii="Aptos" w:hAnsi="Aptos"/>
+                <w:b/>
+                <w:color w:val="17324D"/>
+                <w:sz w:val="16"/>
+              </w:rPr>
+              <w:t>Current status</w:t>
+            </w:r>
+          </w:p>
+        </w:tc>
+        <w:tc>
+          <w:tcPr>
+            <w:tcW w:type="dxa" w:w="2880"/>
+            <w:shd w:fill="D9E7F5"/>
+            <w:tcMar>
+              <w:top w:w="120" w:type="dxa"/>
+              <w:start w:w="120" w:type="dxa"/>
+              <w:bottom w:w="120" w:type="dxa"/>
+              <w:end w:w="120" w:type="dxa"/>
+            </w:tcMar>
+            <w:vAlign w:val="center"/>
+          </w:tcPr>
+          <w:p>
+            <w:pPr>
+              <w:jc w:val="left"/>
+            </w:pPr>
+            <w:r>
+              <w:rPr>
+                <w:rFonts w:ascii="Aptos" w:hAnsi="Aptos"/>
+                <w:b/>
+                <w:color w:val="17324D"/>
+                <w:sz w:val="16"/>
+              </w:rPr>
+              <w:t>What is done</w:t>
+            </w:r>
+          </w:p>
+        </w:tc>
+        <w:tc>
+          <w:tcPr>
+            <w:tcW w:type="dxa" w:w="3096"/>
+            <w:shd w:fill="D9E7F5"/>
+            <w:tcMar>
+              <w:top w:w="120" w:type="dxa"/>
+              <w:start w:w="120" w:type="dxa"/>
+              <w:bottom w:w="120" w:type="dxa"/>
+              <w:end w:w="120" w:type="dxa"/>
+            </w:tcMar>
+            <w:vAlign w:val="center"/>
+          </w:tcPr>
+          <w:p>
+            <w:pPr>
+              <w:jc w:val="left"/>
+            </w:pPr>
+            <w:r>
+              <w:rPr>
+                <w:rFonts w:ascii="Aptos" w:hAnsi="Aptos"/>
+                <w:b/>
+                <w:color w:val="17324D"/>
+                <w:sz w:val="16"/>
+              </w:rPr>
+              <w:t>What still needs to be done</w:t>
             </w:r>
           </w:p>
         </w:tc>
@@ -872,18 +1196,12 @@
       <w:tr>
         <w:tc>
           <w:tcPr>
-            <w:tcW w:type="dxa" w:w="2016"/>
-            <w:tcBorders>
-              <w:top w:val="single" w:sz="6" w:space="0" w:color="D9E2EC"/>
-              <w:left w:val="single" w:sz="6" w:space="0" w:color="D9E2EC"/>
-              <w:bottom w:val="single" w:sz="6" w:space="0" w:color="D9E2EC"/>
-              <w:right w:val="single" w:sz="6" w:space="0" w:color="D9E2EC"/>
-            </w:tcBorders>
+            <w:tcW w:type="dxa" w:w="1800"/>
             <w:tcMar>
-              <w:top w:w="100" w:type="dxa"/>
-              <w:start w:w="140" w:type="dxa"/>
-              <w:bottom w:w="100" w:type="dxa"/>
-              <w:end w:w="140" w:type="dxa"/>
+              <w:top w:w="120" w:type="dxa"/>
+              <w:start w:w="120" w:type="dxa"/>
+              <w:bottom w:w="120" w:type="dxa"/>
+              <w:end w:w="120" w:type="dxa"/>
             </w:tcMar>
             <w:vAlign w:val="center"/>
           </w:tcPr>
@@ -893,29 +1211,22 @@
             </w:pPr>
             <w:r>
               <w:rPr>
-                <w:rFonts w:ascii="Arial" w:hAnsi="Arial"/>
-                <w:b w:val="0"/>
-                <w:color w:val="111827"/>
-                <w:sz w:val="20"/>
+                <w:rFonts w:ascii="Aptos" w:hAnsi="Aptos"/>
+                <w:color w:val="27364A"/>
+                <w:sz w:val="15"/>
               </w:rPr>
-              <w:t>3</w:t>
+              <w:t>Foundation/Project selector</w:t>
             </w:r>
           </w:p>
         </w:tc>
         <w:tc>
           <w:tcPr>
-            <w:tcW w:type="dxa" w:w="3672"/>
-            <w:tcBorders>
-              <w:top w:val="single" w:sz="6" w:space="0" w:color="D9E2EC"/>
-              <w:left w:val="single" w:sz="6" w:space="0" w:color="D9E2EC"/>
-              <w:bottom w:val="single" w:sz="6" w:space="0" w:color="D9E2EC"/>
-              <w:right w:val="single" w:sz="6" w:space="0" w:color="D9E2EC"/>
-            </w:tcBorders>
+            <w:tcW w:type="dxa" w:w="2232"/>
             <w:tcMar>
-              <w:top w:w="100" w:type="dxa"/>
-              <w:start w:w="140" w:type="dxa"/>
-              <w:bottom w:w="100" w:type="dxa"/>
-              <w:end w:w="140" w:type="dxa"/>
+              <w:top w:w="120" w:type="dxa"/>
+              <w:start w:w="120" w:type="dxa"/>
+              <w:bottom w:w="120" w:type="dxa"/>
+              <w:end w:w="120" w:type="dxa"/>
             </w:tcMar>
             <w:vAlign w:val="center"/>
           </w:tcPr>
@@ -925,29 +1236,22 @@
             </w:pPr>
             <w:r>
               <w:rPr>
-                <w:rFonts w:ascii="Arial" w:hAnsi="Arial"/>
-                <w:b w:val="0"/>
-                <w:color w:val="111827"/>
-                <w:sz w:val="20"/>
+                <w:rFonts w:ascii="Aptos" w:hAnsi="Aptos"/>
+                <w:color w:val="27364A"/>
+                <w:sz w:val="15"/>
               </w:rPr>
-              <w:t>Choose Board Member foundation if view-permitted.</w:t>
+              <w:t>Show only contexts where the user has view permission.</w:t>
             </w:r>
           </w:p>
         </w:tc>
         <w:tc>
           <w:tcPr>
-            <w:tcW w:type="dxa" w:w="3672"/>
-            <w:tcBorders>
-              <w:top w:val="single" w:sz="6" w:space="0" w:color="D9E2EC"/>
-              <w:left w:val="single" w:sz="6" w:space="0" w:color="D9E2EC"/>
-              <w:bottom w:val="single" w:sz="6" w:space="0" w:color="D9E2EC"/>
-              <w:right w:val="single" w:sz="6" w:space="0" w:color="D9E2EC"/>
-            </w:tcBorders>
+            <w:tcW w:type="dxa" w:w="1655"/>
             <w:tcMar>
-              <w:top w:w="100" w:type="dxa"/>
-              <w:start w:w="140" w:type="dxa"/>
-              <w:bottom w:w="100" w:type="dxa"/>
-              <w:end w:w="140" w:type="dxa"/>
+              <w:top w:w="120" w:type="dxa"/>
+              <w:start w:w="120" w:type="dxa"/>
+              <w:bottom w:w="120" w:type="dxa"/>
+              <w:end w:w="120" w:type="dxa"/>
             </w:tcMar>
             <w:vAlign w:val="center"/>
           </w:tcPr>
@@ -957,31 +1261,22 @@
             </w:pPr>
             <w:r>
               <w:rPr>
-                <w:rFonts w:ascii="Arial" w:hAnsi="Arial"/>
-                <w:b w:val="0"/>
-                <w:color w:val="111827"/>
-                <w:sz w:val="20"/>
+                <w:rFonts w:ascii="Aptos" w:hAnsi="Aptos"/>
+                <w:color w:val="27364A"/>
+                <w:sz w:val="15"/>
               </w:rPr>
-              <w:t>Choose Contributor project if view-permitted.</w:t>
+              <w:t>Partially aligned.</w:t>
             </w:r>
           </w:p>
         </w:tc>
-      </w:tr>
-      <w:tr>
         <w:tc>
           <w:tcPr>
-            <w:tcW w:type="dxa" w:w="2016"/>
-            <w:tcBorders>
-              <w:top w:val="single" w:sz="6" w:space="0" w:color="D9E2EC"/>
-              <w:left w:val="single" w:sz="6" w:space="0" w:color="D9E2EC"/>
-              <w:bottom w:val="single" w:sz="6" w:space="0" w:color="D9E2EC"/>
-              <w:right w:val="single" w:sz="6" w:space="0" w:color="D9E2EC"/>
-            </w:tcBorders>
+            <w:tcW w:type="dxa" w:w="2880"/>
             <w:tcMar>
-              <w:top w:w="100" w:type="dxa"/>
-              <w:start w:w="140" w:type="dxa"/>
-              <w:bottom w:w="100" w:type="dxa"/>
-              <w:end w:w="140" w:type="dxa"/>
+              <w:top w:w="120" w:type="dxa"/>
+              <w:start w:w="120" w:type="dxa"/>
+              <w:bottom w:w="120" w:type="dxa"/>
+              <w:end w:w="120" w:type="dxa"/>
             </w:tcMar>
             <w:vAlign w:val="center"/>
           </w:tcPr>
@@ -991,29 +1286,22 @@
             </w:pPr>
             <w:r>
               <w:rPr>
-                <w:rFonts w:ascii="Arial" w:hAnsi="Arial"/>
-                <w:b w:val="0"/>
-                <w:color w:val="111827"/>
-                <w:sz w:val="20"/>
+                <w:rFonts w:ascii="Aptos" w:hAnsi="Aptos"/>
+                <w:color w:val="27364A"/>
+                <w:sz w:val="15"/>
               </w:rPr>
-              <w:t>4</w:t>
+              <w:t>The server navigation service now sources selector items through the query/resource API using the user's bearer token. If that upstream API enforces viewer access, the selector is effectively view-permission scoped.</w:t>
             </w:r>
           </w:p>
         </w:tc>
         <w:tc>
           <w:tcPr>
-            <w:tcW w:type="dxa" w:w="3672"/>
-            <w:tcBorders>
-              <w:top w:val="single" w:sz="6" w:space="0" w:color="D9E2EC"/>
-              <w:left w:val="single" w:sz="6" w:space="0" w:color="D9E2EC"/>
-              <w:bottom w:val="single" w:sz="6" w:space="0" w:color="D9E2EC"/>
-              <w:right w:val="single" w:sz="6" w:space="0" w:color="D9E2EC"/>
-            </w:tcBorders>
+            <w:tcW w:type="dxa" w:w="3096"/>
             <w:tcMar>
-              <w:top w:w="100" w:type="dxa"/>
-              <w:start w:w="140" w:type="dxa"/>
-              <w:bottom w:w="100" w:type="dxa"/>
-              <w:end w:w="140" w:type="dxa"/>
+              <w:top w:w="120" w:type="dxa"/>
+              <w:start w:w="120" w:type="dxa"/>
+              <w:bottom w:w="120" w:type="dxa"/>
+              <w:end w:w="120" w:type="dxa"/>
             </w:tcMar>
             <w:vAlign w:val="center"/>
           </w:tcPr>
@@ -1023,29 +1311,41 @@
             </w:pPr>
             <w:r>
               <w:rPr>
-                <w:rFonts w:ascii="Arial" w:hAnsi="Arial"/>
-                <w:b w:val="0"/>
-                <w:color w:val="111827"/>
-                <w:sz w:val="20"/>
+                <w:rFonts w:ascii="Aptos" w:hAnsi="Aptos"/>
+                <w:color w:val="27364A"/>
+                <w:sz w:val="15"/>
               </w:rPr>
-              <w:t>Choose first view-permitted foundation in stable order.</w:t>
+              <w:t xml:space="preserve">Confirm and document the upstream contract. If the BFF must own this explicitly, add a batch </w:t>
+            </w:r>
+            <w:r>
+              <w:rPr>
+                <w:rFonts w:ascii="Aptos Mono" w:hAnsi="Aptos Mono"/>
+                <w:b/>
+                <w:color w:val="27364A"/>
+                <w:sz w:val="15"/>
+              </w:rPr>
+              <w:t>viewer</w:t>
+            </w:r>
+            <w:r>
+              <w:rPr>
+                <w:rFonts w:ascii="Aptos" w:hAnsi="Aptos"/>
+                <w:color w:val="27364A"/>
+                <w:sz w:val="15"/>
+              </w:rPr>
+              <w:t xml:space="preserve"> access check before returning selector items, including selected-item injection.</w:t>
             </w:r>
           </w:p>
         </w:tc>
+      </w:tr>
+      <w:tr>
         <w:tc>
           <w:tcPr>
-            <w:tcW w:type="dxa" w:w="3672"/>
-            <w:tcBorders>
-              <w:top w:val="single" w:sz="6" w:space="0" w:color="D9E2EC"/>
-              <w:left w:val="single" w:sz="6" w:space="0" w:color="D9E2EC"/>
-              <w:bottom w:val="single" w:sz="6" w:space="0" w:color="D9E2EC"/>
-              <w:right w:val="single" w:sz="6" w:space="0" w:color="D9E2EC"/>
-            </w:tcBorders>
+            <w:tcW w:type="dxa" w:w="1800"/>
             <w:tcMar>
-              <w:top w:w="100" w:type="dxa"/>
-              <w:start w:w="140" w:type="dxa"/>
-              <w:bottom w:w="100" w:type="dxa"/>
-              <w:end w:w="140" w:type="dxa"/>
+              <w:top w:w="120" w:type="dxa"/>
+              <w:start w:w="120" w:type="dxa"/>
+              <w:bottom w:w="120" w:type="dxa"/>
+              <w:end w:w="120" w:type="dxa"/>
             </w:tcMar>
             <w:vAlign w:val="center"/>
           </w:tcPr>
@@ -1055,52 +1355,24 @@
             </w:pPr>
             <w:r>
               <w:rPr>
-                <w:rFonts w:ascii="Arial" w:hAnsi="Arial"/>
-                <w:b w:val="0"/>
-                <w:color w:val="111827"/>
-                <w:sz w:val="20"/>
+                <w:rFonts w:ascii="Aptos" w:hAnsi="Aptos"/>
+                <w:color w:val="27364A"/>
+                <w:sz w:val="15"/>
               </w:rPr>
-              <w:t>Choose first view-permitted project in stable order.</w:t>
+              <w:t>Default Foundation/Project selection</w:t>
             </w:r>
           </w:p>
         </w:tc>
-      </w:tr>
-    </w:tbl>
-    <w:p>
-      <w:pPr>
-        <w:pStyle w:val="Heading1"/>
-        <w:keepNext/>
-      </w:pPr>
-      <w:r>
-        <w:t>Implementation Priority</w:t>
-      </w:r>
-    </w:p>
-    <w:tbl>
-      <w:tblPr>
-        <w:tblW w:type="auto" w:w="0"/>
-        <w:tblLayout w:type="fixed"/>
-        <w:tblLook w:firstColumn="1" w:firstRow="1" w:lastColumn="0" w:lastRow="0" w:noHBand="0" w:noVBand="1" w:val="04A0"/>
-      </w:tblPr>
-      <w:tblGrid>
-        <w:gridCol w:w="9360"/>
-      </w:tblGrid>
-      <w:tr>
         <w:tc>
           <w:tcPr>
-            <w:tcW w:type="dxa" w:w="9792"/>
-            <w:shd w:fill="F3F6FA"/>
-            <w:tcBorders>
-              <w:top w:val="single" w:sz="6" w:space="0" w:color="D5DEE8"/>
-              <w:left w:val="single" w:sz="6" w:space="0" w:color="D5DEE8"/>
-              <w:bottom w:val="single" w:sz="6" w:space="0" w:color="D5DEE8"/>
-              <w:right w:val="single" w:sz="6" w:space="0" w:color="D5DEE8"/>
-            </w:tcBorders>
+            <w:tcW w:type="dxa" w:w="2232"/>
             <w:tcMar>
-              <w:top w:w="140" w:type="dxa"/>
-              <w:start w:w="180" w:type="dxa"/>
-              <w:bottom w:w="140" w:type="dxa"/>
-              <w:end w:w="180" w:type="dxa"/>
+              <w:top w:w="120" w:type="dxa"/>
+              <w:start w:w="120" w:type="dxa"/>
+              <w:bottom w:w="120" w:type="dxa"/>
+              <w:end w:w="120" w:type="dxa"/>
             </w:tcMar>
+            <w:vAlign w:val="center"/>
           </w:tcPr>
           <w:p>
             <w:pPr>
@@ -1108,30 +1380,2064 @@
             </w:pPr>
             <w:r>
               <w:rPr>
-                <w:rFonts w:ascii="Courier New" w:hAnsi="Courier New"/>
-                <w:color w:val="111827"/>
-                <w:sz w:val="20"/>
+                <w:rFonts w:ascii="Aptos" w:hAnsi="Aptos"/>
+                <w:color w:val="27364A"/>
+                <w:sz w:val="15"/>
               </w:rPr>
-              <w:t>Priority 1:</w:t>
-              <w:br/>
-              <w:t>Make Foundation/Project selector eligibility explicitly view-permission scoped.</w:t>
-              <w:br/>
-              <w:br/>
-              <w:t>Candidate contexts + view permission check = selector items</w:t>
+              <w:t>Default only from view-permitted contexts, then use persona priority.</w:t>
+            </w:r>
+          </w:p>
+        </w:tc>
+        <w:tc>
+          <w:tcPr>
+            <w:tcW w:type="dxa" w:w="1655"/>
+            <w:tcMar>
+              <w:top w:w="120" w:type="dxa"/>
+              <w:start w:w="120" w:type="dxa"/>
+              <w:bottom w:w="120" w:type="dxa"/>
+              <w:end w:w="120" w:type="dxa"/>
+            </w:tcMar>
+            <w:vAlign w:val="center"/>
+          </w:tcPr>
+          <w:p>
+            <w:pPr>
+              <w:spacing w:after="0"/>
+            </w:pPr>
+            <w:r>
+              <w:rPr>
+                <w:rFonts w:ascii="Aptos" w:hAnsi="Aptos"/>
+                <w:color w:val="27364A"/>
+                <w:sz w:val="15"/>
+              </w:rPr>
+              <w:t>Mostly aligned.</w:t>
+            </w:r>
+          </w:p>
+        </w:tc>
+        <w:tc>
+          <w:tcPr>
+            <w:tcW w:type="dxa" w:w="2880"/>
+            <w:tcMar>
+              <w:top w:w="120" w:type="dxa"/>
+              <w:start w:w="120" w:type="dxa"/>
+              <w:bottom w:w="120" w:type="dxa"/>
+              <w:end w:w="120" w:type="dxa"/>
+            </w:tcMar>
+            <w:vAlign w:val="center"/>
+          </w:tcPr>
+          <w:p>
+            <w:pPr>
+              <w:spacing w:after="0"/>
+            </w:pPr>
+            <w:r>
+              <w:rPr>
+                <w:rFonts w:ascii="Aptos" w:hAnsi="Aptos"/>
+                <w:color w:val="27364A"/>
+                <w:sz w:val="15"/>
+              </w:rPr>
+              <w:t>The frontend keeps the existing selected context if still present, then chooses by persona priority, then falls back to the first returned item. Foundation and project priorities are separated.</w:t>
+            </w:r>
+          </w:p>
+        </w:tc>
+        <w:tc>
+          <w:tcPr>
+            <w:tcW w:type="dxa" w:w="3096"/>
+            <w:tcMar>
+              <w:top w:w="120" w:type="dxa"/>
+              <w:start w:w="120" w:type="dxa"/>
+              <w:bottom w:w="120" w:type="dxa"/>
+              <w:end w:w="120" w:type="dxa"/>
+            </w:tcMar>
+            <w:vAlign w:val="center"/>
+          </w:tcPr>
+          <w:p>
+            <w:pPr>
+              <w:spacing w:after="0"/>
+            </w:pPr>
+            <w:r>
+              <w:rPr>
+                <w:rFonts w:ascii="Aptos" w:hAnsi="Aptos"/>
+                <w:color w:val="27364A"/>
+                <w:sz w:val="15"/>
+              </w:rPr>
+              <w:t>Keep this logic, but make the dependency clear: persona priority should only run after the candidate list has already been filtered by view permission. Add focused tests for multiple-foundation and multiple-project users.</w:t>
+            </w:r>
+          </w:p>
+        </w:tc>
+      </w:tr>
+      <w:tr>
+        <w:tc>
+          <w:tcPr>
+            <w:tcW w:type="dxa" w:w="1800"/>
+            <w:tcMar>
+              <w:top w:w="120" w:type="dxa"/>
+              <w:start w:w="120" w:type="dxa"/>
+              <w:bottom w:w="120" w:type="dxa"/>
+              <w:end w:w="120" w:type="dxa"/>
+            </w:tcMar>
+            <w:vAlign w:val="center"/>
+          </w:tcPr>
+          <w:p>
+            <w:pPr>
+              <w:spacing w:after="0"/>
+            </w:pPr>
+            <w:r>
+              <w:rPr>
+                <w:rFonts w:ascii="Aptos" w:hAnsi="Aptos"/>
+                <w:color w:val="27364A"/>
+                <w:sz w:val="15"/>
+              </w:rPr>
+              <w:t>Lens availability</w:t>
+            </w:r>
+          </w:p>
+        </w:tc>
+        <w:tc>
+          <w:tcPr>
+            <w:tcW w:type="dxa" w:w="2232"/>
+            <w:tcMar>
+              <w:top w:w="120" w:type="dxa"/>
+              <w:start w:w="120" w:type="dxa"/>
+              <w:bottom w:w="120" w:type="dxa"/>
+              <w:end w:w="120" w:type="dxa"/>
+            </w:tcMar>
+            <w:vAlign w:val="center"/>
+          </w:tcPr>
+          <w:p>
+            <w:pPr>
+              <w:spacing w:after="0"/>
+            </w:pPr>
+            <w:r>
+              <w:rPr>
+                <w:rFonts w:ascii="Aptos" w:hAnsi="Aptos"/>
+                <w:color w:val="27364A"/>
+                <w:sz w:val="15"/>
+              </w:rPr>
+              <w:t>Show available lenses based on the user's valid product context and persona.</w:t>
+            </w:r>
+          </w:p>
+        </w:tc>
+        <w:tc>
+          <w:tcPr>
+            <w:tcW w:type="dxa" w:w="1655"/>
+            <w:tcMar>
+              <w:top w:w="120" w:type="dxa"/>
+              <w:start w:w="120" w:type="dxa"/>
+              <w:bottom w:w="120" w:type="dxa"/>
+              <w:end w:w="120" w:type="dxa"/>
+            </w:tcMar>
+            <w:vAlign w:val="center"/>
+          </w:tcPr>
+          <w:p>
+            <w:pPr>
+              <w:spacing w:after="0"/>
+            </w:pPr>
+            <w:r>
+              <w:rPr>
+                <w:rFonts w:ascii="Aptos" w:hAnsi="Aptos"/>
+                <w:color w:val="27364A"/>
+                <w:sz w:val="15"/>
+              </w:rPr>
+              <w:t>Partially aligned.</w:t>
+            </w:r>
+          </w:p>
+        </w:tc>
+        <w:tc>
+          <w:tcPr>
+            <w:tcW w:type="dxa" w:w="2880"/>
+            <w:tcMar>
+              <w:top w:w="120" w:type="dxa"/>
+              <w:start w:w="120" w:type="dxa"/>
+              <w:bottom w:w="120" w:type="dxa"/>
+              <w:end w:w="120" w:type="dxa"/>
+            </w:tcMar>
+            <w:vAlign w:val="center"/>
+          </w:tcPr>
+          <w:p>
+            <w:pPr>
+              <w:spacing w:after="0"/>
+            </w:pPr>
+            <w:r>
+              <w:rPr>
+                <w:rFonts w:ascii="Aptos" w:hAnsi="Aptos"/>
+                <w:color w:val="27364A"/>
+                <w:sz w:val="15"/>
+              </w:rPr>
+              <w:t xml:space="preserve">Lens availability is persona/root-writer based today. </w:t>
+            </w:r>
+            <w:r>
+              <w:rPr>
+                <w:rFonts w:ascii="Aptos Mono" w:hAnsi="Aptos Mono"/>
+                <w:b/>
+                <w:color w:val="27364A"/>
+                <w:sz w:val="15"/>
+              </w:rPr>
+              <w:t>Me</w:t>
+            </w:r>
+            <w:r>
+              <w:rPr>
+                <w:rFonts w:ascii="Aptos" w:hAnsi="Aptos"/>
+                <w:color w:val="27364A"/>
+                <w:sz w:val="15"/>
+              </w:rPr>
+              <w:t xml:space="preserve"> and </w:t>
+            </w:r>
+            <w:r>
+              <w:rPr>
+                <w:rFonts w:ascii="Aptos Mono" w:hAnsi="Aptos Mono"/>
+                <w:b/>
+                <w:color w:val="27364A"/>
+                <w:sz w:val="15"/>
+              </w:rPr>
+              <w:t>Organization</w:t>
+            </w:r>
+            <w:r>
+              <w:rPr>
+                <w:rFonts w:ascii="Aptos" w:hAnsi="Aptos"/>
+                <w:color w:val="27364A"/>
+                <w:sz w:val="15"/>
+              </w:rPr>
+              <w:t xml:space="preserve"> are always available; Foundation and Project lenses depend on board/project persona or root writer.</w:t>
+            </w:r>
+          </w:p>
+        </w:tc>
+        <w:tc>
+          <w:tcPr>
+            <w:tcW w:type="dxa" w:w="3096"/>
+            <w:tcMar>
+              <w:top w:w="120" w:type="dxa"/>
+              <w:start w:w="120" w:type="dxa"/>
+              <w:bottom w:w="120" w:type="dxa"/>
+              <w:end w:w="120" w:type="dxa"/>
+            </w:tcMar>
+            <w:vAlign w:val="center"/>
+          </w:tcPr>
+          <w:p>
+            <w:pPr>
+              <w:spacing w:after="0"/>
+            </w:pPr>
+            <w:r>
+              <w:rPr>
+                <w:rFonts w:ascii="Aptos" w:hAnsi="Aptos"/>
+                <w:color w:val="27364A"/>
+                <w:sz w:val="15"/>
+              </w:rPr>
+              <w:t>Decide whether Foundation/Project lens buttons should also require at least one view-permitted Foundation/Project candidate. If yes, wire lens availability to selector/context availability without coupling it to page content rules.</w:t>
+            </w:r>
+          </w:p>
+        </w:tc>
+      </w:tr>
+      <w:tr>
+        <w:tc>
+          <w:tcPr>
+            <w:tcW w:type="dxa" w:w="1800"/>
+            <w:tcMar>
+              <w:top w:w="120" w:type="dxa"/>
+              <w:start w:w="120" w:type="dxa"/>
+              <w:bottom w:w="120" w:type="dxa"/>
+              <w:end w:w="120" w:type="dxa"/>
+            </w:tcMar>
+            <w:vAlign w:val="center"/>
+          </w:tcPr>
+          <w:p>
+            <w:pPr>
+              <w:spacing w:after="0"/>
+            </w:pPr>
+            <w:r>
+              <w:rPr>
+                <w:rFonts w:ascii="Aptos" w:hAnsi="Aptos"/>
+                <w:color w:val="27364A"/>
+                <w:sz w:val="15"/>
+              </w:rPr>
+              <w:t>Sidebar links</w:t>
+            </w:r>
+          </w:p>
+        </w:tc>
+        <w:tc>
+          <w:tcPr>
+            <w:tcW w:type="dxa" w:w="2232"/>
+            <w:tcMar>
+              <w:top w:w="120" w:type="dxa"/>
+              <w:start w:w="120" w:type="dxa"/>
+              <w:bottom w:w="120" w:type="dxa"/>
+              <w:end w:w="120" w:type="dxa"/>
+            </w:tcMar>
+            <w:vAlign w:val="center"/>
+          </w:tcPr>
+          <w:p>
+            <w:pPr>
+              <w:spacing w:after="0"/>
+            </w:pPr>
+            <w:r>
+              <w:rPr>
+                <w:rFonts w:ascii="Aptos" w:hAnsi="Aptos"/>
+                <w:color w:val="27364A"/>
+                <w:sz w:val="15"/>
+              </w:rPr>
+              <w:t>Decide visible links by persona/role once the user is inside a valid context.</w:t>
+            </w:r>
+          </w:p>
+        </w:tc>
+        <w:tc>
+          <w:tcPr>
+            <w:tcW w:type="dxa" w:w="1655"/>
+            <w:tcMar>
+              <w:top w:w="120" w:type="dxa"/>
+              <w:start w:w="120" w:type="dxa"/>
+              <w:bottom w:w="120" w:type="dxa"/>
+              <w:end w:w="120" w:type="dxa"/>
+            </w:tcMar>
+            <w:vAlign w:val="center"/>
+          </w:tcPr>
+          <w:p>
+            <w:pPr>
+              <w:spacing w:after="0"/>
+            </w:pPr>
+            <w:r>
+              <w:rPr>
+                <w:rFonts w:ascii="Aptos" w:hAnsi="Aptos"/>
+                <w:color w:val="27364A"/>
+                <w:sz w:val="15"/>
+              </w:rPr>
+              <w:t>Mostly aligned.</w:t>
+            </w:r>
+          </w:p>
+        </w:tc>
+        <w:tc>
+          <w:tcPr>
+            <w:tcW w:type="dxa" w:w="2880"/>
+            <w:tcMar>
+              <w:top w:w="120" w:type="dxa"/>
+              <w:start w:w="120" w:type="dxa"/>
+              <w:bottom w:w="120" w:type="dxa"/>
+              <w:end w:w="120" w:type="dxa"/>
+            </w:tcMar>
+            <w:vAlign w:val="center"/>
+          </w:tcPr>
+          <w:p>
+            <w:pPr>
+              <w:spacing w:after="0"/>
+            </w:pPr>
+            <w:r>
+              <w:rPr>
+                <w:rFonts w:ascii="Aptos" w:hAnsi="Aptos"/>
+                <w:color w:val="27364A"/>
+                <w:sz w:val="15"/>
+              </w:rPr>
+              <w:t>Sidebar content is lens/persona driven. For example, Foundation Health Metrics is Executive Director only, and Project navigation changes for board-scoped versus project-scoped personas.</w:t>
+            </w:r>
+          </w:p>
+        </w:tc>
+        <w:tc>
+          <w:tcPr>
+            <w:tcW w:type="dxa" w:w="3096"/>
+            <w:tcMar>
+              <w:top w:w="120" w:type="dxa"/>
+              <w:start w:w="120" w:type="dxa"/>
+              <w:bottom w:w="120" w:type="dxa"/>
+              <w:end w:w="120" w:type="dxa"/>
+            </w:tcMar>
+            <w:vAlign w:val="center"/>
+          </w:tcPr>
+          <w:p>
+            <w:pPr>
+              <w:spacing w:after="0"/>
+            </w:pPr>
+            <w:r>
+              <w:rPr>
+                <w:rFonts w:ascii="Aptos" w:hAnsi="Aptos"/>
+                <w:color w:val="27364A"/>
+                <w:sz w:val="15"/>
+              </w:rPr>
+              <w:t xml:space="preserve">Document the persona-to-link matrix and add regression tests. Keep sidebar visibility separate from action authorization. Review data-driven exceptions such as the Foundation </w:t>
+            </w:r>
+            <w:r>
+              <w:rPr>
+                <w:rFonts w:ascii="Aptos Mono" w:hAnsi="Aptos Mono"/>
+                <w:b/>
+                <w:color w:val="27364A"/>
+                <w:sz w:val="15"/>
+              </w:rPr>
+              <w:t>Projects</w:t>
+            </w:r>
+            <w:r>
+              <w:rPr>
+                <w:rFonts w:ascii="Aptos" w:hAnsi="Aptos"/>
+                <w:color w:val="27364A"/>
+                <w:sz w:val="15"/>
+              </w:rPr>
+              <w:t xml:space="preserve"> link.</w:t>
+            </w:r>
+          </w:p>
+        </w:tc>
+      </w:tr>
+      <w:tr>
+        <w:tc>
+          <w:tcPr>
+            <w:tcW w:type="dxa" w:w="1800"/>
+            <w:tcMar>
+              <w:top w:w="120" w:type="dxa"/>
+              <w:start w:w="120" w:type="dxa"/>
+              <w:bottom w:w="120" w:type="dxa"/>
+              <w:end w:w="120" w:type="dxa"/>
+            </w:tcMar>
+            <w:vAlign w:val="center"/>
+          </w:tcPr>
+          <w:p>
+            <w:pPr>
+              <w:spacing w:after="0"/>
+            </w:pPr>
+            <w:r>
+              <w:rPr>
+                <w:rFonts w:ascii="Aptos" w:hAnsi="Aptos"/>
+                <w:color w:val="27364A"/>
+                <w:sz w:val="15"/>
+              </w:rPr>
+              <w:t>Page content</w:t>
+            </w:r>
+          </w:p>
+        </w:tc>
+        <w:tc>
+          <w:tcPr>
+            <w:tcW w:type="dxa" w:w="2232"/>
+            <w:tcMar>
+              <w:top w:w="120" w:type="dxa"/>
+              <w:start w:w="120" w:type="dxa"/>
+              <w:bottom w:w="120" w:type="dxa"/>
+              <w:end w:w="120" w:type="dxa"/>
+            </w:tcMar>
+            <w:vAlign w:val="center"/>
+          </w:tcPr>
+          <w:p>
+            <w:pPr>
+              <w:spacing w:after="0"/>
+            </w:pPr>
+            <w:r>
+              <w:rPr>
+                <w:rFonts w:ascii="Aptos" w:hAnsi="Aptos"/>
+                <w:color w:val="27364A"/>
+                <w:sz w:val="15"/>
+              </w:rPr>
+              <w:t>Shape dashboards, sections, cards, tabs, and metrics by persona.</w:t>
+            </w:r>
+          </w:p>
+        </w:tc>
+        <w:tc>
+          <w:tcPr>
+            <w:tcW w:type="dxa" w:w="1655"/>
+            <w:tcMar>
+              <w:top w:w="120" w:type="dxa"/>
+              <w:start w:w="120" w:type="dxa"/>
+              <w:bottom w:w="120" w:type="dxa"/>
+              <w:end w:w="120" w:type="dxa"/>
+            </w:tcMar>
+            <w:vAlign w:val="center"/>
+          </w:tcPr>
+          <w:p>
+            <w:pPr>
+              <w:spacing w:after="0"/>
+            </w:pPr>
+            <w:r>
+              <w:rPr>
+                <w:rFonts w:ascii="Aptos" w:hAnsi="Aptos"/>
+                <w:color w:val="27364A"/>
+                <w:sz w:val="15"/>
+              </w:rPr>
+              <w:t>Partially aligned.</w:t>
+            </w:r>
+          </w:p>
+        </w:tc>
+        <w:tc>
+          <w:tcPr>
+            <w:tcW w:type="dxa" w:w="2880"/>
+            <w:tcMar>
+              <w:top w:w="120" w:type="dxa"/>
+              <w:start w:w="120" w:type="dxa"/>
+              <w:bottom w:w="120" w:type="dxa"/>
+              <w:end w:w="120" w:type="dxa"/>
+            </w:tcMar>
+            <w:vAlign w:val="center"/>
+          </w:tcPr>
+          <w:p>
+            <w:pPr>
+              <w:spacing w:after="0"/>
+            </w:pPr>
+            <w:r>
+              <w:rPr>
+                <w:rFonts w:ascii="Aptos" w:hAnsi="Aptos"/>
+                <w:color w:val="27364A"/>
+                <w:sz w:val="15"/>
+              </w:rPr>
+              <w:t>Some content variants already use persona and lens-specific logic.</w:t>
+            </w:r>
+          </w:p>
+        </w:tc>
+        <w:tc>
+          <w:tcPr>
+            <w:tcW w:type="dxa" w:w="3096"/>
+            <w:tcMar>
+              <w:top w:w="120" w:type="dxa"/>
+              <w:start w:w="120" w:type="dxa"/>
+              <w:bottom w:w="120" w:type="dxa"/>
+              <w:end w:w="120" w:type="dxa"/>
+            </w:tcMar>
+            <w:vAlign w:val="center"/>
+          </w:tcPr>
+          <w:p>
+            <w:pPr>
+              <w:spacing w:after="0"/>
+            </w:pPr>
+            <w:r>
+              <w:rPr>
+                <w:rFonts w:ascii="Aptos" w:hAnsi="Aptos"/>
+                <w:color w:val="27364A"/>
+                <w:sz w:val="15"/>
+              </w:rPr>
+              <w:t>Create an explicit page-content matrix for key personas: Executive Director, Board Member, Maintainer, Contributor, committee roles. Add tests for high-risk pages.</w:t>
+            </w:r>
+          </w:p>
+        </w:tc>
+      </w:tr>
+      <w:tr>
+        <w:tc>
+          <w:tcPr>
+            <w:tcW w:type="dxa" w:w="1800"/>
+            <w:tcMar>
+              <w:top w:w="120" w:type="dxa"/>
+              <w:start w:w="120" w:type="dxa"/>
+              <w:bottom w:w="120" w:type="dxa"/>
+              <w:end w:w="120" w:type="dxa"/>
+            </w:tcMar>
+            <w:vAlign w:val="center"/>
+          </w:tcPr>
+          <w:p>
+            <w:pPr>
+              <w:spacing w:after="0"/>
+            </w:pPr>
+            <w:r>
+              <w:rPr>
+                <w:rFonts w:ascii="Aptos" w:hAnsi="Aptos"/>
+                <w:color w:val="27364A"/>
+                <w:sz w:val="15"/>
+              </w:rPr>
+              <w:t>Quick links and create buttons</w:t>
+            </w:r>
+          </w:p>
+        </w:tc>
+        <w:tc>
+          <w:tcPr>
+            <w:tcW w:type="dxa" w:w="2232"/>
+            <w:tcMar>
+              <w:top w:w="120" w:type="dxa"/>
+              <w:start w:w="120" w:type="dxa"/>
+              <w:bottom w:w="120" w:type="dxa"/>
+              <w:end w:w="120" w:type="dxa"/>
+            </w:tcMar>
+            <w:vAlign w:val="center"/>
+          </w:tcPr>
+          <w:p>
+            <w:pPr>
+              <w:spacing w:after="0"/>
+            </w:pPr>
+            <w:r>
+              <w:rPr>
+                <w:rFonts w:ascii="Aptos" w:hAnsi="Aptos"/>
+                <w:color w:val="27364A"/>
+                <w:sz w:val="15"/>
+              </w:rPr>
+              <w:t>Show write/manage actions only when the user can perform them.</w:t>
+            </w:r>
+          </w:p>
+        </w:tc>
+        <w:tc>
+          <w:tcPr>
+            <w:tcW w:type="dxa" w:w="1655"/>
+            <w:tcMar>
+              <w:top w:w="120" w:type="dxa"/>
+              <w:start w:w="120" w:type="dxa"/>
+              <w:bottom w:w="120" w:type="dxa"/>
+              <w:end w:w="120" w:type="dxa"/>
+            </w:tcMar>
+            <w:vAlign w:val="center"/>
+          </w:tcPr>
+          <w:p>
+            <w:pPr>
+              <w:spacing w:after="0"/>
+            </w:pPr>
+            <w:r>
+              <w:rPr>
+                <w:rFonts w:ascii="Aptos" w:hAnsi="Aptos"/>
+                <w:color w:val="27364A"/>
+                <w:sz w:val="15"/>
+              </w:rPr>
+              <w:t>Mostly aligned for common dashboard actions.</w:t>
+            </w:r>
+          </w:p>
+        </w:tc>
+        <w:tc>
+          <w:tcPr>
+            <w:tcW w:type="dxa" w:w="2880"/>
+            <w:tcMar>
+              <w:top w:w="120" w:type="dxa"/>
+              <w:start w:w="120" w:type="dxa"/>
+              <w:bottom w:w="120" w:type="dxa"/>
+              <w:end w:w="120" w:type="dxa"/>
+            </w:tcMar>
+            <w:vAlign w:val="center"/>
+          </w:tcPr>
+          <w:p>
+            <w:pPr>
+              <w:spacing w:after="0"/>
+            </w:pPr>
+            <w:r>
+              <w:rPr>
+                <w:rFonts w:ascii="Aptos" w:hAnsi="Aptos"/>
+                <w:color w:val="27364A"/>
+                <w:sz w:val="15"/>
+              </w:rPr>
+              <w:t xml:space="preserve">Many quick links and dashboard create actions are gated by </w:t>
+            </w:r>
+            <w:r>
+              <w:rPr>
+                <w:rFonts w:ascii="Aptos Mono" w:hAnsi="Aptos Mono"/>
+                <w:b/>
+                <w:color w:val="27364A"/>
+                <w:sz w:val="15"/>
+              </w:rPr>
+              <w:t>canWrite()</w:t>
+            </w:r>
+            <w:r>
+              <w:rPr>
+                <w:rFonts w:ascii="Aptos" w:hAnsi="Aptos"/>
+                <w:color w:val="27364A"/>
+                <w:sz w:val="15"/>
+              </w:rPr>
+              <w:t xml:space="preserve"> or </w:t>
+            </w:r>
+            <w:r>
+              <w:rPr>
+                <w:rFonts w:ascii="Aptos Mono" w:hAnsi="Aptos Mono"/>
+                <w:b/>
+                <w:color w:val="27364A"/>
+                <w:sz w:val="15"/>
+              </w:rPr>
+              <w:t>writer</w:t>
+            </w:r>
+            <w:r>
+              <w:rPr>
+                <w:rFonts w:ascii="Aptos" w:hAnsi="Aptos"/>
+                <w:color w:val="27364A"/>
+                <w:sz w:val="15"/>
+              </w:rPr>
+              <w:t>.</w:t>
+            </w:r>
+          </w:p>
+        </w:tc>
+        <w:tc>
+          <w:tcPr>
+            <w:tcW w:type="dxa" w:w="3096"/>
+            <w:tcMar>
+              <w:top w:w="120" w:type="dxa"/>
+              <w:start w:w="120" w:type="dxa"/>
+              <w:bottom w:w="120" w:type="dxa"/>
+              <w:end w:w="120" w:type="dxa"/>
+            </w:tcMar>
+            <w:vAlign w:val="center"/>
+          </w:tcPr>
+          <w:p>
+            <w:pPr>
+              <w:spacing w:after="0"/>
+            </w:pPr>
+            <w:r>
+              <w:rPr>
+                <w:rFonts w:ascii="Aptos" w:hAnsi="Aptos"/>
+                <w:color w:val="27364A"/>
+                <w:sz w:val="15"/>
+              </w:rPr>
+              <w:t>Audit all action surfaces so buttons, menus, empty states, and inline actions consistently use manage/write permission.</w:t>
+            </w:r>
+          </w:p>
+        </w:tc>
+      </w:tr>
+      <w:tr>
+        <w:tc>
+          <w:tcPr>
+            <w:tcW w:type="dxa" w:w="1800"/>
+            <w:tcMar>
+              <w:top w:w="120" w:type="dxa"/>
+              <w:start w:w="120" w:type="dxa"/>
+              <w:bottom w:w="120" w:type="dxa"/>
+              <w:end w:w="120" w:type="dxa"/>
+            </w:tcMar>
+            <w:vAlign w:val="center"/>
+          </w:tcPr>
+          <w:p>
+            <w:pPr>
+              <w:spacing w:after="0"/>
+            </w:pPr>
+            <w:r>
+              <w:rPr>
+                <w:rFonts w:ascii="Aptos" w:hAnsi="Aptos"/>
+                <w:color w:val="27364A"/>
+                <w:sz w:val="15"/>
+              </w:rPr>
+              <w:t>Direct create/edit routes</w:t>
+            </w:r>
+          </w:p>
+        </w:tc>
+        <w:tc>
+          <w:tcPr>
+            <w:tcW w:type="dxa" w:w="2232"/>
+            <w:tcMar>
+              <w:top w:w="120" w:type="dxa"/>
+              <w:start w:w="120" w:type="dxa"/>
+              <w:bottom w:w="120" w:type="dxa"/>
+              <w:end w:w="120" w:type="dxa"/>
+            </w:tcMar>
+            <w:vAlign w:val="center"/>
+          </w:tcPr>
+          <w:p>
+            <w:pPr>
+              <w:spacing w:after="0"/>
+            </w:pPr>
+            <w:r>
+              <w:rPr>
+                <w:rFonts w:ascii="Aptos" w:hAnsi="Aptos"/>
+                <w:color w:val="27364A"/>
+                <w:sz w:val="15"/>
+              </w:rPr>
+              <w:t>Prevent navigation to write flows without manage/write permission.</w:t>
+            </w:r>
+          </w:p>
+        </w:tc>
+        <w:tc>
+          <w:tcPr>
+            <w:tcW w:type="dxa" w:w="1655"/>
+            <w:tcMar>
+              <w:top w:w="120" w:type="dxa"/>
+              <w:start w:w="120" w:type="dxa"/>
+              <w:bottom w:w="120" w:type="dxa"/>
+              <w:end w:w="120" w:type="dxa"/>
+            </w:tcMar>
+            <w:vAlign w:val="center"/>
+          </w:tcPr>
+          <w:p>
+            <w:pPr>
+              <w:spacing w:after="0"/>
+            </w:pPr>
+            <w:r>
+              <w:rPr>
+                <w:rFonts w:ascii="Aptos" w:hAnsi="Aptos"/>
+                <w:color w:val="27364A"/>
+                <w:sz w:val="15"/>
+              </w:rPr>
+              <w:t>Gap remains.</w:t>
+            </w:r>
+          </w:p>
+        </w:tc>
+        <w:tc>
+          <w:tcPr>
+            <w:tcW w:type="dxa" w:w="2880"/>
+            <w:tcMar>
+              <w:top w:w="120" w:type="dxa"/>
+              <w:start w:w="120" w:type="dxa"/>
+              <w:bottom w:w="120" w:type="dxa"/>
+              <w:end w:w="120" w:type="dxa"/>
+            </w:tcMar>
+            <w:vAlign w:val="center"/>
+          </w:tcPr>
+          <w:p>
+            <w:pPr>
+              <w:spacing w:after="0"/>
+            </w:pPr>
+            <w:r>
+              <w:rPr>
+                <w:rFonts w:ascii="Aptos" w:hAnsi="Aptos"/>
+                <w:color w:val="27364A"/>
+                <w:sz w:val="15"/>
+              </w:rPr>
+              <w:t>A writer guard exists.</w:t>
+            </w:r>
+          </w:p>
+        </w:tc>
+        <w:tc>
+          <w:tcPr>
+            <w:tcW w:type="dxa" w:w="3096"/>
+            <w:tcMar>
+              <w:top w:w="120" w:type="dxa"/>
+              <w:start w:w="120" w:type="dxa"/>
+              <w:bottom w:w="120" w:type="dxa"/>
+              <w:end w:w="120" w:type="dxa"/>
+            </w:tcMar>
+            <w:vAlign w:val="center"/>
+          </w:tcPr>
+          <w:p>
+            <w:pPr>
+              <w:spacing w:after="0"/>
+            </w:pPr>
+            <w:r>
+              <w:rPr>
+                <w:rFonts w:ascii="Aptos" w:hAnsi="Aptos"/>
+                <w:color w:val="27364A"/>
+                <w:sz w:val="15"/>
+              </w:rPr>
+              <w:t xml:space="preserve">Wire create/edit/admin routes through manage/write guards, not only </w:t>
+            </w:r>
+            <w:r>
+              <w:rPr>
+                <w:rFonts w:ascii="Aptos Mono" w:hAnsi="Aptos Mono"/>
+                <w:b/>
+                <w:color w:val="27364A"/>
+                <w:sz w:val="15"/>
+              </w:rPr>
+              <w:t>authGuard</w:t>
+            </w:r>
+            <w:r>
+              <w:rPr>
+                <w:rFonts w:ascii="Aptos" w:hAnsi="Aptos"/>
+                <w:color w:val="27364A"/>
+                <w:sz w:val="15"/>
+              </w:rPr>
+              <w:t>. This includes committees, meetings, mailing lists, votes, surveys, settings/admin flows, and any new management routes.</w:t>
+            </w:r>
+          </w:p>
+        </w:tc>
+      </w:tr>
+      <w:tr>
+        <w:tc>
+          <w:tcPr>
+            <w:tcW w:type="dxa" w:w="1800"/>
+            <w:tcMar>
+              <w:top w:w="120" w:type="dxa"/>
+              <w:start w:w="120" w:type="dxa"/>
+              <w:bottom w:w="120" w:type="dxa"/>
+              <w:end w:w="120" w:type="dxa"/>
+            </w:tcMar>
+            <w:vAlign w:val="center"/>
+          </w:tcPr>
+          <w:p>
+            <w:pPr>
+              <w:spacing w:after="0"/>
+            </w:pPr>
+            <w:r>
+              <w:rPr>
+                <w:rFonts w:ascii="Aptos" w:hAnsi="Aptos"/>
+                <w:color w:val="27364A"/>
+                <w:sz w:val="15"/>
+              </w:rPr>
+              <w:t>Settings and permission management</w:t>
+            </w:r>
+          </w:p>
+        </w:tc>
+        <w:tc>
+          <w:tcPr>
+            <w:tcW w:type="dxa" w:w="2232"/>
+            <w:tcMar>
+              <w:top w:w="120" w:type="dxa"/>
+              <w:start w:w="120" w:type="dxa"/>
+              <w:bottom w:w="120" w:type="dxa"/>
+              <w:end w:w="120" w:type="dxa"/>
+            </w:tcMar>
+            <w:vAlign w:val="center"/>
+          </w:tcPr>
+          <w:p>
+            <w:pPr>
+              <w:spacing w:after="0"/>
+            </w:pPr>
+            <w:r>
+              <w:rPr>
+                <w:rFonts w:ascii="Aptos" w:hAnsi="Aptos"/>
+                <w:color w:val="27364A"/>
+                <w:sz w:val="15"/>
+              </w:rPr>
+              <w:t>Admin actions require manage/write/admin authority.</w:t>
+            </w:r>
+          </w:p>
+        </w:tc>
+        <w:tc>
+          <w:tcPr>
+            <w:tcW w:type="dxa" w:w="1655"/>
+            <w:tcMar>
+              <w:top w:w="120" w:type="dxa"/>
+              <w:start w:w="120" w:type="dxa"/>
+              <w:bottom w:w="120" w:type="dxa"/>
+              <w:end w:w="120" w:type="dxa"/>
+            </w:tcMar>
+            <w:vAlign w:val="center"/>
+          </w:tcPr>
+          <w:p>
+            <w:pPr>
+              <w:spacing w:after="0"/>
+            </w:pPr>
+            <w:r>
+              <w:rPr>
+                <w:rFonts w:ascii="Aptos" w:hAnsi="Aptos"/>
+                <w:color w:val="27364A"/>
+                <w:sz w:val="15"/>
+              </w:rPr>
+              <w:t>Gap remains.</w:t>
+            </w:r>
+          </w:p>
+        </w:tc>
+        <w:tc>
+          <w:tcPr>
+            <w:tcW w:type="dxa" w:w="2880"/>
+            <w:tcMar>
+              <w:top w:w="120" w:type="dxa"/>
+              <w:start w:w="120" w:type="dxa"/>
+              <w:bottom w:w="120" w:type="dxa"/>
+              <w:end w:w="120" w:type="dxa"/>
+            </w:tcMar>
+            <w:vAlign w:val="center"/>
+          </w:tcPr>
+          <w:p>
+            <w:pPr>
+              <w:spacing w:after="0"/>
+            </w:pPr>
+            <w:r>
+              <w:rPr>
+                <w:rFonts w:ascii="Aptos" w:hAnsi="Aptos"/>
+                <w:color w:val="27364A"/>
+                <w:sz w:val="15"/>
+              </w:rPr>
+              <w:t>Settings screens exist and route through authentication.</w:t>
+            </w:r>
+          </w:p>
+        </w:tc>
+        <w:tc>
+          <w:tcPr>
+            <w:tcW w:type="dxa" w:w="3096"/>
+            <w:tcMar>
+              <w:top w:w="120" w:type="dxa"/>
+              <w:start w:w="120" w:type="dxa"/>
+              <w:bottom w:w="120" w:type="dxa"/>
+              <w:end w:w="120" w:type="dxa"/>
+            </w:tcMar>
+            <w:vAlign w:val="center"/>
+          </w:tcPr>
+          <w:p>
+            <w:pPr>
+              <w:spacing w:after="0"/>
+            </w:pPr>
+            <w:r>
+              <w:rPr>
+                <w:rFonts w:ascii="Aptos" w:hAnsi="Aptos"/>
+                <w:color w:val="27364A"/>
+                <w:sz w:val="15"/>
+              </w:rPr>
+              <w:t>Gate actions such as Add User, role update, and removal by manage/write/admin permission. Hide or disable UI affordances and protect direct routes/API calls.</w:t>
+            </w:r>
+          </w:p>
+        </w:tc>
+      </w:tr>
+      <w:tr>
+        <w:tc>
+          <w:tcPr>
+            <w:tcW w:type="dxa" w:w="1800"/>
+            <w:tcMar>
+              <w:top w:w="120" w:type="dxa"/>
+              <w:start w:w="120" w:type="dxa"/>
+              <w:bottom w:w="120" w:type="dxa"/>
+              <w:end w:w="120" w:type="dxa"/>
+            </w:tcMar>
+            <w:vAlign w:val="center"/>
+          </w:tcPr>
+          <w:p>
+            <w:pPr>
+              <w:spacing w:after="0"/>
+            </w:pPr>
+            <w:r>
+              <w:rPr>
+                <w:rFonts w:ascii="Aptos" w:hAnsi="Aptos"/>
+                <w:color w:val="27364A"/>
+                <w:sz w:val="15"/>
+              </w:rPr>
+              <w:t>Backend/downstream authorization</w:t>
+            </w:r>
+          </w:p>
+        </w:tc>
+        <w:tc>
+          <w:tcPr>
+            <w:tcW w:type="dxa" w:w="2232"/>
+            <w:tcMar>
+              <w:top w:w="120" w:type="dxa"/>
+              <w:start w:w="120" w:type="dxa"/>
+              <w:bottom w:w="120" w:type="dxa"/>
+              <w:end w:w="120" w:type="dxa"/>
+            </w:tcMar>
+            <w:vAlign w:val="center"/>
+          </w:tcPr>
+          <w:p>
+            <w:pPr>
+              <w:spacing w:after="0"/>
+            </w:pPr>
+            <w:r>
+              <w:rPr>
+                <w:rFonts w:ascii="Aptos" w:hAnsi="Aptos"/>
+                <w:color w:val="27364A"/>
+                <w:sz w:val="15"/>
+              </w:rPr>
+              <w:t>Backend remains authoritative even if UI hides something.</w:t>
+            </w:r>
+          </w:p>
+        </w:tc>
+        <w:tc>
+          <w:tcPr>
+            <w:tcW w:type="dxa" w:w="1655"/>
+            <w:tcMar>
+              <w:top w:w="120" w:type="dxa"/>
+              <w:start w:w="120" w:type="dxa"/>
+              <w:bottom w:w="120" w:type="dxa"/>
+              <w:end w:w="120" w:type="dxa"/>
+            </w:tcMar>
+            <w:vAlign w:val="center"/>
+          </w:tcPr>
+          <w:p>
+            <w:pPr>
+              <w:spacing w:after="0"/>
+            </w:pPr>
+            <w:r>
+              <w:rPr>
+                <w:rFonts w:ascii="Aptos" w:hAnsi="Aptos"/>
+                <w:color w:val="27364A"/>
+                <w:sz w:val="15"/>
+              </w:rPr>
+              <w:t>Needs confirmation per surface.</w:t>
+            </w:r>
+          </w:p>
+        </w:tc>
+        <w:tc>
+          <w:tcPr>
+            <w:tcW w:type="dxa" w:w="2880"/>
+            <w:tcMar>
+              <w:top w:w="120" w:type="dxa"/>
+              <w:start w:w="120" w:type="dxa"/>
+              <w:bottom w:w="120" w:type="dxa"/>
+              <w:end w:w="120" w:type="dxa"/>
+            </w:tcMar>
+            <w:vAlign w:val="center"/>
+          </w:tcPr>
+          <w:p>
+            <w:pPr>
+              <w:spacing w:after="0"/>
+            </w:pPr>
+            <w:r>
+              <w:rPr>
+                <w:rFonts w:ascii="Aptos" w:hAnsi="Aptos"/>
+                <w:color w:val="27364A"/>
+                <w:sz w:val="15"/>
+              </w:rPr>
+              <w:t>Several services enrich resources with writer/organizer flags through access-check patterns.</w:t>
+            </w:r>
+          </w:p>
+        </w:tc>
+        <w:tc>
+          <w:tcPr>
+            <w:tcW w:type="dxa" w:w="3096"/>
+            <w:tcMar>
+              <w:top w:w="120" w:type="dxa"/>
+              <w:start w:w="120" w:type="dxa"/>
+              <w:bottom w:w="120" w:type="dxa"/>
+              <w:end w:w="120" w:type="dxa"/>
+            </w:tcMar>
+            <w:vAlign w:val="center"/>
+          </w:tcPr>
+          <w:p>
+            <w:pPr>
+              <w:spacing w:after="0"/>
+            </w:pPr>
+            <w:r>
+              <w:rPr>
+                <w:rFonts w:ascii="Aptos" w:hAnsi="Aptos"/>
+                <w:color w:val="27364A"/>
+                <w:sz w:val="15"/>
+              </w:rPr>
+              <w:t>Confirm downstream APIs reject unauthorized writes. UI guards should improve UX, not become the only enforcement layer.</w:t>
             </w:r>
           </w:p>
         </w:tc>
       </w:tr>
     </w:tbl>
-    <w:p>
-      <w:pPr>
-        <w:spacing w:after="40"/>
-      </w:pPr>
-    </w:p>
+    <w:p/>
     <w:p>
       <w:pPr>
         <w:pStyle w:val="Heading1"/>
-        <w:keepNext/>
+      </w:pPr>
+      <w:r>
+        <w:t>Proposed Work Plan and Estimate</w:t>
+      </w:r>
+    </w:p>
+    <w:tbl>
+      <w:tblPr>
+        <w:tblStyle w:val="TableGrid"/>
+        <w:tblW w:type="auto" w:w="0"/>
+        <w:jc w:val="center"/>
+        <w:tblLayout w:type="fixed"/>
+        <w:tblLook w:firstColumn="1" w:firstRow="1" w:lastColumn="0" w:lastRow="0" w:noHBand="0" w:noVBand="1" w:val="04A0"/>
+        <w:tblBorders>
+          <w:top w:val="single" w:sz="6" w:space="0" w:color="B7C6D8"/>
+          <w:left w:val="single" w:sz="6" w:space="0" w:color="B7C6D8"/>
+          <w:bottom w:val="single" w:sz="6" w:space="0" w:color="B7C6D8"/>
+          <w:right w:val="single" w:sz="6" w:space="0" w:color="B7C6D8"/>
+          <w:insideH w:val="single" w:sz="6" w:space="0" w:color="B7C6D8"/>
+          <w:insideV w:val="single" w:sz="6" w:space="0" w:color="B7C6D8"/>
+        </w:tblBorders>
+      </w:tblPr>
+      <w:tblGrid>
+        <w:gridCol w:w="2556"/>
+        <w:gridCol w:w="2556"/>
+        <w:gridCol w:w="2556"/>
+        <w:gridCol w:w="2556"/>
+      </w:tblGrid>
+      <w:tr>
+        <w:trPr>
+          <w:tblHeader w:val="true"/>
+        </w:trPr>
+        <w:tc>
+          <w:tcPr>
+            <w:tcW w:type="dxa" w:w="1655"/>
+            <w:shd w:fill="D9E7F5"/>
+            <w:tcMar>
+              <w:top w:w="120" w:type="dxa"/>
+              <w:start w:w="120" w:type="dxa"/>
+              <w:bottom w:w="120" w:type="dxa"/>
+              <w:end w:w="120" w:type="dxa"/>
+            </w:tcMar>
+            <w:vAlign w:val="center"/>
+          </w:tcPr>
+          <w:p>
+            <w:pPr>
+              <w:jc w:val="left"/>
+            </w:pPr>
+            <w:r>
+              <w:rPr>
+                <w:rFonts w:ascii="Aptos" w:hAnsi="Aptos"/>
+                <w:b/>
+                <w:color w:val="17324D"/>
+                <w:sz w:val="16"/>
+              </w:rPr>
+              <w:t>Priority</w:t>
+            </w:r>
+          </w:p>
+        </w:tc>
+        <w:tc>
+          <w:tcPr>
+            <w:tcW w:type="dxa" w:w="3024"/>
+            <w:shd w:fill="D9E7F5"/>
+            <w:tcMar>
+              <w:top w:w="120" w:type="dxa"/>
+              <w:start w:w="120" w:type="dxa"/>
+              <w:bottom w:w="120" w:type="dxa"/>
+              <w:end w:w="120" w:type="dxa"/>
+            </w:tcMar>
+            <w:vAlign w:val="center"/>
+          </w:tcPr>
+          <w:p>
+            <w:pPr>
+              <w:jc w:val="left"/>
+            </w:pPr>
+            <w:r>
+              <w:rPr>
+                <w:rFonts w:ascii="Aptos" w:hAnsi="Aptos"/>
+                <w:b/>
+                <w:color w:val="17324D"/>
+                <w:sz w:val="16"/>
+              </w:rPr>
+              <w:t>Work item</w:t>
+            </w:r>
+          </w:p>
+        </w:tc>
+        <w:tc>
+          <w:tcPr>
+            <w:tcW w:type="dxa" w:w="3024"/>
+            <w:shd w:fill="D9E7F5"/>
+            <w:tcMar>
+              <w:top w:w="120" w:type="dxa"/>
+              <w:start w:w="120" w:type="dxa"/>
+              <w:bottom w:w="120" w:type="dxa"/>
+              <w:end w:w="120" w:type="dxa"/>
+            </w:tcMar>
+            <w:vAlign w:val="center"/>
+          </w:tcPr>
+          <w:p>
+            <w:pPr>
+              <w:jc w:val="left"/>
+            </w:pPr>
+            <w:r>
+              <w:rPr>
+                <w:rFonts w:ascii="Aptos" w:hAnsi="Aptos"/>
+                <w:b/>
+                <w:color w:val="17324D"/>
+                <w:sz w:val="16"/>
+              </w:rPr>
+              <w:t>Why it matters</w:t>
+            </w:r>
+          </w:p>
+        </w:tc>
+        <w:tc>
+          <w:tcPr>
+            <w:tcW w:type="dxa" w:w="2520"/>
+            <w:shd w:fill="D9E7F5"/>
+            <w:tcMar>
+              <w:top w:w="120" w:type="dxa"/>
+              <w:start w:w="120" w:type="dxa"/>
+              <w:bottom w:w="120" w:type="dxa"/>
+              <w:end w:w="120" w:type="dxa"/>
+            </w:tcMar>
+            <w:vAlign w:val="center"/>
+          </w:tcPr>
+          <w:p>
+            <w:pPr>
+              <w:jc w:val="left"/>
+            </w:pPr>
+            <w:r>
+              <w:rPr>
+                <w:rFonts w:ascii="Aptos" w:hAnsi="Aptos"/>
+                <w:b/>
+                <w:color w:val="17324D"/>
+                <w:sz w:val="16"/>
+              </w:rPr>
+              <w:t>Estimated effort</w:t>
+            </w:r>
+          </w:p>
+        </w:tc>
+      </w:tr>
+      <w:tr>
+        <w:tc>
+          <w:tcPr>
+            <w:tcW w:type="dxa" w:w="1655"/>
+            <w:tcMar>
+              <w:top w:w="120" w:type="dxa"/>
+              <w:start w:w="120" w:type="dxa"/>
+              <w:bottom w:w="120" w:type="dxa"/>
+              <w:end w:w="120" w:type="dxa"/>
+            </w:tcMar>
+            <w:vAlign w:val="center"/>
+          </w:tcPr>
+          <w:p>
+            <w:pPr>
+              <w:spacing w:after="0"/>
+            </w:pPr>
+            <w:r>
+              <w:rPr>
+                <w:rFonts w:ascii="Aptos" w:hAnsi="Aptos"/>
+                <w:color w:val="27364A"/>
+                <w:sz w:val="15"/>
+              </w:rPr>
+              <w:t>P0</w:t>
+            </w:r>
+          </w:p>
+        </w:tc>
+        <w:tc>
+          <w:tcPr>
+            <w:tcW w:type="dxa" w:w="3024"/>
+            <w:tcMar>
+              <w:top w:w="120" w:type="dxa"/>
+              <w:start w:w="120" w:type="dxa"/>
+              <w:bottom w:w="120" w:type="dxa"/>
+              <w:end w:w="120" w:type="dxa"/>
+            </w:tcMar>
+            <w:vAlign w:val="center"/>
+          </w:tcPr>
+          <w:p>
+            <w:pPr>
+              <w:spacing w:after="0"/>
+            </w:pPr>
+            <w:r>
+              <w:rPr>
+                <w:rFonts w:ascii="Aptos" w:hAnsi="Aptos"/>
+                <w:color w:val="27364A"/>
+                <w:sz w:val="15"/>
+              </w:rPr>
+              <w:t>Confirm selector permission contract with query/resource API owners.</w:t>
+            </w:r>
+          </w:p>
+        </w:tc>
+        <w:tc>
+          <w:tcPr>
+            <w:tcW w:type="dxa" w:w="3024"/>
+            <w:tcMar>
+              <w:top w:w="120" w:type="dxa"/>
+              <w:start w:w="120" w:type="dxa"/>
+              <w:bottom w:w="120" w:type="dxa"/>
+              <w:end w:w="120" w:type="dxa"/>
+            </w:tcMar>
+            <w:vAlign w:val="center"/>
+          </w:tcPr>
+          <w:p>
+            <w:pPr>
+              <w:spacing w:after="0"/>
+            </w:pPr>
+            <w:r>
+              <w:rPr>
+                <w:rFonts w:ascii="Aptos" w:hAnsi="Aptos"/>
+                <w:color w:val="27364A"/>
+                <w:sz w:val="15"/>
+              </w:rPr>
+              <w:t xml:space="preserve">This decides whether the BFF can rely on upstream filtering or must explicitly check </w:t>
+            </w:r>
+            <w:r>
+              <w:rPr>
+                <w:rFonts w:ascii="Aptos Mono" w:hAnsi="Aptos Mono"/>
+                <w:b/>
+                <w:color w:val="27364A"/>
+                <w:sz w:val="15"/>
+              </w:rPr>
+              <w:t>viewer</w:t>
+            </w:r>
+            <w:r>
+              <w:rPr>
+                <w:rFonts w:ascii="Aptos" w:hAnsi="Aptos"/>
+                <w:color w:val="27364A"/>
+                <w:sz w:val="15"/>
+              </w:rPr>
+              <w:t>.</w:t>
+            </w:r>
+          </w:p>
+        </w:tc>
+        <w:tc>
+          <w:tcPr>
+            <w:tcW w:type="dxa" w:w="2520"/>
+            <w:tcMar>
+              <w:top w:w="120" w:type="dxa"/>
+              <w:start w:w="120" w:type="dxa"/>
+              <w:bottom w:w="120" w:type="dxa"/>
+              <w:end w:w="120" w:type="dxa"/>
+            </w:tcMar>
+            <w:vAlign w:val="center"/>
+          </w:tcPr>
+          <w:p>
+            <w:pPr>
+              <w:spacing w:after="0"/>
+            </w:pPr>
+            <w:r>
+              <w:rPr>
+                <w:rFonts w:ascii="Aptos" w:hAnsi="Aptos"/>
+                <w:color w:val="27364A"/>
+                <w:sz w:val="15"/>
+              </w:rPr>
+              <w:t>0.5 day</w:t>
+            </w:r>
+          </w:p>
+        </w:tc>
+      </w:tr>
+      <w:tr>
+        <w:tc>
+          <w:tcPr>
+            <w:tcW w:type="dxa" w:w="1655"/>
+            <w:tcMar>
+              <w:top w:w="120" w:type="dxa"/>
+              <w:start w:w="120" w:type="dxa"/>
+              <w:bottom w:w="120" w:type="dxa"/>
+              <w:end w:w="120" w:type="dxa"/>
+            </w:tcMar>
+            <w:vAlign w:val="center"/>
+          </w:tcPr>
+          <w:p>
+            <w:pPr>
+              <w:spacing w:after="0"/>
+            </w:pPr>
+            <w:r>
+              <w:rPr>
+                <w:rFonts w:ascii="Aptos" w:hAnsi="Aptos"/>
+                <w:color w:val="27364A"/>
+                <w:sz w:val="15"/>
+              </w:rPr>
+              <w:t>P1</w:t>
+            </w:r>
+          </w:p>
+        </w:tc>
+        <w:tc>
+          <w:tcPr>
+            <w:tcW w:type="dxa" w:w="3024"/>
+            <w:tcMar>
+              <w:top w:w="120" w:type="dxa"/>
+              <w:start w:w="120" w:type="dxa"/>
+              <w:bottom w:w="120" w:type="dxa"/>
+              <w:end w:w="120" w:type="dxa"/>
+            </w:tcMar>
+            <w:vAlign w:val="center"/>
+          </w:tcPr>
+          <w:p>
+            <w:pPr>
+              <w:spacing w:after="0"/>
+            </w:pPr>
+            <w:r>
+              <w:rPr>
+                <w:rFonts w:ascii="Aptos" w:hAnsi="Aptos"/>
+                <w:color w:val="27364A"/>
+                <w:sz w:val="15"/>
+              </w:rPr>
+              <w:t>Add explicit selector viewer check if upstream contract is not strong enough.</w:t>
+            </w:r>
+          </w:p>
+        </w:tc>
+        <w:tc>
+          <w:tcPr>
+            <w:tcW w:type="dxa" w:w="3024"/>
+            <w:tcMar>
+              <w:top w:w="120" w:type="dxa"/>
+              <w:start w:w="120" w:type="dxa"/>
+              <w:bottom w:w="120" w:type="dxa"/>
+              <w:end w:w="120" w:type="dxa"/>
+            </w:tcMar>
+            <w:vAlign w:val="center"/>
+          </w:tcPr>
+          <w:p>
+            <w:pPr>
+              <w:spacing w:after="0"/>
+            </w:pPr>
+            <w:r>
+              <w:rPr>
+                <w:rFonts w:ascii="Aptos" w:hAnsi="Aptos"/>
+                <w:color w:val="27364A"/>
+                <w:sz w:val="15"/>
+              </w:rPr>
+              <w:t>Makes "where can I go" locally testable and prevents persona from acting as access control.</w:t>
+            </w:r>
+          </w:p>
+        </w:tc>
+        <w:tc>
+          <w:tcPr>
+            <w:tcW w:type="dxa" w:w="2520"/>
+            <w:tcMar>
+              <w:top w:w="120" w:type="dxa"/>
+              <w:start w:w="120" w:type="dxa"/>
+              <w:bottom w:w="120" w:type="dxa"/>
+              <w:end w:w="120" w:type="dxa"/>
+            </w:tcMar>
+            <w:vAlign w:val="center"/>
+          </w:tcPr>
+          <w:p>
+            <w:pPr>
+              <w:spacing w:after="0"/>
+            </w:pPr>
+            <w:r>
+              <w:rPr>
+                <w:rFonts w:ascii="Aptos" w:hAnsi="Aptos"/>
+                <w:color w:val="27364A"/>
+                <w:sz w:val="15"/>
+              </w:rPr>
+              <w:t>1-2 days</w:t>
+            </w:r>
+          </w:p>
+        </w:tc>
+      </w:tr>
+      <w:tr>
+        <w:tc>
+          <w:tcPr>
+            <w:tcW w:type="dxa" w:w="1655"/>
+            <w:tcMar>
+              <w:top w:w="120" w:type="dxa"/>
+              <w:start w:w="120" w:type="dxa"/>
+              <w:bottom w:w="120" w:type="dxa"/>
+              <w:end w:w="120" w:type="dxa"/>
+            </w:tcMar>
+            <w:vAlign w:val="center"/>
+          </w:tcPr>
+          <w:p>
+            <w:pPr>
+              <w:spacing w:after="0"/>
+            </w:pPr>
+            <w:r>
+              <w:rPr>
+                <w:rFonts w:ascii="Aptos" w:hAnsi="Aptos"/>
+                <w:color w:val="27364A"/>
+                <w:sz w:val="15"/>
+              </w:rPr>
+              <w:t>P1</w:t>
+            </w:r>
+          </w:p>
+        </w:tc>
+        <w:tc>
+          <w:tcPr>
+            <w:tcW w:type="dxa" w:w="3024"/>
+            <w:tcMar>
+              <w:top w:w="120" w:type="dxa"/>
+              <w:start w:w="120" w:type="dxa"/>
+              <w:bottom w:w="120" w:type="dxa"/>
+              <w:end w:w="120" w:type="dxa"/>
+            </w:tcMar>
+            <w:vAlign w:val="center"/>
+          </w:tcPr>
+          <w:p>
+            <w:pPr>
+              <w:spacing w:after="0"/>
+            </w:pPr>
+            <w:r>
+              <w:rPr>
+                <w:rFonts w:ascii="Aptos" w:hAnsi="Aptos"/>
+                <w:color w:val="27364A"/>
+                <w:sz w:val="15"/>
+              </w:rPr>
+              <w:t>Add tests for default Foundation/Project selection.</w:t>
+            </w:r>
+          </w:p>
+        </w:tc>
+        <w:tc>
+          <w:tcPr>
+            <w:tcW w:type="dxa" w:w="3024"/>
+            <w:tcMar>
+              <w:top w:w="120" w:type="dxa"/>
+              <w:start w:w="120" w:type="dxa"/>
+              <w:bottom w:w="120" w:type="dxa"/>
+              <w:end w:w="120" w:type="dxa"/>
+            </w:tcMar>
+            <w:vAlign w:val="center"/>
+          </w:tcPr>
+          <w:p>
+            <w:pPr>
+              <w:spacing w:after="0"/>
+            </w:pPr>
+            <w:r>
+              <w:rPr>
+                <w:rFonts w:ascii="Aptos" w:hAnsi="Aptos"/>
+                <w:color w:val="27364A"/>
+                <w:sz w:val="15"/>
+              </w:rPr>
+              <w:t>Protects the highest-priority flow: multiple contexts, persona priority, and fallback behavior.</w:t>
+            </w:r>
+          </w:p>
+        </w:tc>
+        <w:tc>
+          <w:tcPr>
+            <w:tcW w:type="dxa" w:w="2520"/>
+            <w:tcMar>
+              <w:top w:w="120" w:type="dxa"/>
+              <w:start w:w="120" w:type="dxa"/>
+              <w:bottom w:w="120" w:type="dxa"/>
+              <w:end w:w="120" w:type="dxa"/>
+            </w:tcMar>
+            <w:vAlign w:val="center"/>
+          </w:tcPr>
+          <w:p>
+            <w:pPr>
+              <w:spacing w:after="0"/>
+            </w:pPr>
+            <w:r>
+              <w:rPr>
+                <w:rFonts w:ascii="Aptos" w:hAnsi="Aptos"/>
+                <w:color w:val="27364A"/>
+                <w:sz w:val="15"/>
+              </w:rPr>
+              <w:t>1 day</w:t>
+            </w:r>
+          </w:p>
+        </w:tc>
+      </w:tr>
+      <w:tr>
+        <w:tc>
+          <w:tcPr>
+            <w:tcW w:type="dxa" w:w="1655"/>
+            <w:tcMar>
+              <w:top w:w="120" w:type="dxa"/>
+              <w:start w:w="120" w:type="dxa"/>
+              <w:bottom w:w="120" w:type="dxa"/>
+              <w:end w:w="120" w:type="dxa"/>
+            </w:tcMar>
+            <w:vAlign w:val="center"/>
+          </w:tcPr>
+          <w:p>
+            <w:pPr>
+              <w:spacing w:after="0"/>
+            </w:pPr>
+            <w:r>
+              <w:rPr>
+                <w:rFonts w:ascii="Aptos" w:hAnsi="Aptos"/>
+                <w:color w:val="27364A"/>
+                <w:sz w:val="15"/>
+              </w:rPr>
+              <w:t>P1</w:t>
+            </w:r>
+          </w:p>
+        </w:tc>
+        <w:tc>
+          <w:tcPr>
+            <w:tcW w:type="dxa" w:w="3024"/>
+            <w:tcMar>
+              <w:top w:w="120" w:type="dxa"/>
+              <w:start w:w="120" w:type="dxa"/>
+              <w:bottom w:w="120" w:type="dxa"/>
+              <w:end w:w="120" w:type="dxa"/>
+            </w:tcMar>
+            <w:vAlign w:val="center"/>
+          </w:tcPr>
+          <w:p>
+            <w:pPr>
+              <w:spacing w:after="0"/>
+            </w:pPr>
+            <w:r>
+              <w:rPr>
+                <w:rFonts w:ascii="Aptos" w:hAnsi="Aptos"/>
+                <w:color w:val="27364A"/>
+                <w:sz w:val="15"/>
+              </w:rPr>
+              <w:t>Wire manage/write guard to direct create/edit/admin routes.</w:t>
+            </w:r>
+          </w:p>
+        </w:tc>
+        <w:tc>
+          <w:tcPr>
+            <w:tcW w:type="dxa" w:w="3024"/>
+            <w:tcMar>
+              <w:top w:w="120" w:type="dxa"/>
+              <w:start w:w="120" w:type="dxa"/>
+              <w:bottom w:w="120" w:type="dxa"/>
+              <w:end w:w="120" w:type="dxa"/>
+            </w:tcMar>
+            <w:vAlign w:val="center"/>
+          </w:tcPr>
+          <w:p>
+            <w:pPr>
+              <w:spacing w:after="0"/>
+            </w:pPr>
+            <w:r>
+              <w:rPr>
+                <w:rFonts w:ascii="Aptos" w:hAnsi="Aptos"/>
+                <w:color w:val="27364A"/>
+                <w:sz w:val="15"/>
+              </w:rPr>
+              <w:t>Hidden buttons are not enough; direct URLs must be protected.</w:t>
+            </w:r>
+          </w:p>
+        </w:tc>
+        <w:tc>
+          <w:tcPr>
+            <w:tcW w:type="dxa" w:w="2520"/>
+            <w:tcMar>
+              <w:top w:w="120" w:type="dxa"/>
+              <w:start w:w="120" w:type="dxa"/>
+              <w:bottom w:w="120" w:type="dxa"/>
+              <w:end w:w="120" w:type="dxa"/>
+            </w:tcMar>
+            <w:vAlign w:val="center"/>
+          </w:tcPr>
+          <w:p>
+            <w:pPr>
+              <w:spacing w:after="0"/>
+            </w:pPr>
+            <w:r>
+              <w:rPr>
+                <w:rFonts w:ascii="Aptos" w:hAnsi="Aptos"/>
+                <w:color w:val="27364A"/>
+                <w:sz w:val="15"/>
+              </w:rPr>
+              <w:t>1-2 days</w:t>
+            </w:r>
+          </w:p>
+        </w:tc>
+      </w:tr>
+      <w:tr>
+        <w:tc>
+          <w:tcPr>
+            <w:tcW w:type="dxa" w:w="1655"/>
+            <w:tcMar>
+              <w:top w:w="120" w:type="dxa"/>
+              <w:start w:w="120" w:type="dxa"/>
+              <w:bottom w:w="120" w:type="dxa"/>
+              <w:end w:w="120" w:type="dxa"/>
+            </w:tcMar>
+            <w:vAlign w:val="center"/>
+          </w:tcPr>
+          <w:p>
+            <w:pPr>
+              <w:spacing w:after="0"/>
+            </w:pPr>
+            <w:r>
+              <w:rPr>
+                <w:rFonts w:ascii="Aptos" w:hAnsi="Aptos"/>
+                <w:color w:val="27364A"/>
+                <w:sz w:val="15"/>
+              </w:rPr>
+              <w:t>P1</w:t>
+            </w:r>
+          </w:p>
+        </w:tc>
+        <w:tc>
+          <w:tcPr>
+            <w:tcW w:type="dxa" w:w="3024"/>
+            <w:tcMar>
+              <w:top w:w="120" w:type="dxa"/>
+              <w:start w:w="120" w:type="dxa"/>
+              <w:bottom w:w="120" w:type="dxa"/>
+              <w:end w:w="120" w:type="dxa"/>
+            </w:tcMar>
+            <w:vAlign w:val="center"/>
+          </w:tcPr>
+          <w:p>
+            <w:pPr>
+              <w:spacing w:after="0"/>
+            </w:pPr>
+            <w:r>
+              <w:rPr>
+                <w:rFonts w:ascii="Aptos" w:hAnsi="Aptos"/>
+                <w:color w:val="27364A"/>
+                <w:sz w:val="15"/>
+              </w:rPr>
+              <w:t>Gate Settings and permission-management actions.</w:t>
+            </w:r>
+          </w:p>
+        </w:tc>
+        <w:tc>
+          <w:tcPr>
+            <w:tcW w:type="dxa" w:w="3024"/>
+            <w:tcMar>
+              <w:top w:w="120" w:type="dxa"/>
+              <w:start w:w="120" w:type="dxa"/>
+              <w:bottom w:w="120" w:type="dxa"/>
+              <w:end w:w="120" w:type="dxa"/>
+            </w:tcMar>
+            <w:vAlign w:val="center"/>
+          </w:tcPr>
+          <w:p>
+            <w:pPr>
+              <w:spacing w:after="0"/>
+            </w:pPr>
+            <w:r>
+              <w:rPr>
+                <w:rFonts w:ascii="Aptos" w:hAnsi="Aptos"/>
+                <w:color w:val="27364A"/>
+                <w:sz w:val="15"/>
+              </w:rPr>
+              <w:t>These are high-impact admin operations and should not be visible or executable without authority.</w:t>
+            </w:r>
+          </w:p>
+        </w:tc>
+        <w:tc>
+          <w:tcPr>
+            <w:tcW w:type="dxa" w:w="2520"/>
+            <w:tcMar>
+              <w:top w:w="120" w:type="dxa"/>
+              <w:start w:w="120" w:type="dxa"/>
+              <w:bottom w:w="120" w:type="dxa"/>
+              <w:end w:w="120" w:type="dxa"/>
+            </w:tcMar>
+            <w:vAlign w:val="center"/>
+          </w:tcPr>
+          <w:p>
+            <w:pPr>
+              <w:spacing w:after="0"/>
+            </w:pPr>
+            <w:r>
+              <w:rPr>
+                <w:rFonts w:ascii="Aptos" w:hAnsi="Aptos"/>
+                <w:color w:val="27364A"/>
+                <w:sz w:val="15"/>
+              </w:rPr>
+              <w:t>1 day</w:t>
+            </w:r>
+          </w:p>
+        </w:tc>
+      </w:tr>
+      <w:tr>
+        <w:tc>
+          <w:tcPr>
+            <w:tcW w:type="dxa" w:w="1655"/>
+            <w:tcMar>
+              <w:top w:w="120" w:type="dxa"/>
+              <w:start w:w="120" w:type="dxa"/>
+              <w:bottom w:w="120" w:type="dxa"/>
+              <w:end w:w="120" w:type="dxa"/>
+            </w:tcMar>
+            <w:vAlign w:val="center"/>
+          </w:tcPr>
+          <w:p>
+            <w:pPr>
+              <w:spacing w:after="0"/>
+            </w:pPr>
+            <w:r>
+              <w:rPr>
+                <w:rFonts w:ascii="Aptos" w:hAnsi="Aptos"/>
+                <w:color w:val="27364A"/>
+                <w:sz w:val="15"/>
+              </w:rPr>
+              <w:t>P2</w:t>
+            </w:r>
+          </w:p>
+        </w:tc>
+        <w:tc>
+          <w:tcPr>
+            <w:tcW w:type="dxa" w:w="3024"/>
+            <w:tcMar>
+              <w:top w:w="120" w:type="dxa"/>
+              <w:start w:w="120" w:type="dxa"/>
+              <w:bottom w:w="120" w:type="dxa"/>
+              <w:end w:w="120" w:type="dxa"/>
+            </w:tcMar>
+            <w:vAlign w:val="center"/>
+          </w:tcPr>
+          <w:p>
+            <w:pPr>
+              <w:spacing w:after="0"/>
+            </w:pPr>
+            <w:r>
+              <w:rPr>
+                <w:rFonts w:ascii="Aptos" w:hAnsi="Aptos"/>
+                <w:color w:val="27364A"/>
+                <w:sz w:val="15"/>
+              </w:rPr>
+              <w:t>Document persona-to-sidebar and persona-to-page-content matrix.</w:t>
+            </w:r>
+          </w:p>
+        </w:tc>
+        <w:tc>
+          <w:tcPr>
+            <w:tcW w:type="dxa" w:w="3024"/>
+            <w:tcMar>
+              <w:top w:w="120" w:type="dxa"/>
+              <w:start w:w="120" w:type="dxa"/>
+              <w:bottom w:w="120" w:type="dxa"/>
+              <w:end w:w="120" w:type="dxa"/>
+            </w:tcMar>
+            <w:vAlign w:val="center"/>
+          </w:tcPr>
+          <w:p>
+            <w:pPr>
+              <w:spacing w:after="0"/>
+            </w:pPr>
+            <w:r>
+              <w:rPr>
+                <w:rFonts w:ascii="Aptos" w:hAnsi="Aptos"/>
+                <w:color w:val="27364A"/>
+                <w:sz w:val="15"/>
+              </w:rPr>
+              <w:t>Gives product, architecture, and engineering one shared contract for "what I see."</w:t>
+            </w:r>
+          </w:p>
+        </w:tc>
+        <w:tc>
+          <w:tcPr>
+            <w:tcW w:type="dxa" w:w="2520"/>
+            <w:tcMar>
+              <w:top w:w="120" w:type="dxa"/>
+              <w:start w:w="120" w:type="dxa"/>
+              <w:bottom w:w="120" w:type="dxa"/>
+              <w:end w:w="120" w:type="dxa"/>
+            </w:tcMar>
+            <w:vAlign w:val="center"/>
+          </w:tcPr>
+          <w:p>
+            <w:pPr>
+              <w:spacing w:after="0"/>
+            </w:pPr>
+            <w:r>
+              <w:rPr>
+                <w:rFonts w:ascii="Aptos" w:hAnsi="Aptos"/>
+                <w:color w:val="27364A"/>
+                <w:sz w:val="15"/>
+              </w:rPr>
+              <w:t>0.5-1 day</w:t>
+            </w:r>
+          </w:p>
+        </w:tc>
+      </w:tr>
+      <w:tr>
+        <w:tc>
+          <w:tcPr>
+            <w:tcW w:type="dxa" w:w="1655"/>
+            <w:tcMar>
+              <w:top w:w="120" w:type="dxa"/>
+              <w:start w:w="120" w:type="dxa"/>
+              <w:bottom w:w="120" w:type="dxa"/>
+              <w:end w:w="120" w:type="dxa"/>
+            </w:tcMar>
+            <w:vAlign w:val="center"/>
+          </w:tcPr>
+          <w:p>
+            <w:pPr>
+              <w:spacing w:after="0"/>
+            </w:pPr>
+            <w:r>
+              <w:rPr>
+                <w:rFonts w:ascii="Aptos" w:hAnsi="Aptos"/>
+                <w:color w:val="27364A"/>
+                <w:sz w:val="15"/>
+              </w:rPr>
+              <w:t>P2</w:t>
+            </w:r>
+          </w:p>
+        </w:tc>
+        <w:tc>
+          <w:tcPr>
+            <w:tcW w:type="dxa" w:w="3024"/>
+            <w:tcMar>
+              <w:top w:w="120" w:type="dxa"/>
+              <w:start w:w="120" w:type="dxa"/>
+              <w:bottom w:w="120" w:type="dxa"/>
+              <w:end w:w="120" w:type="dxa"/>
+            </w:tcMar>
+            <w:vAlign w:val="center"/>
+          </w:tcPr>
+          <w:p>
+            <w:pPr>
+              <w:spacing w:after="0"/>
+            </w:pPr>
+            <w:r>
+              <w:rPr>
+                <w:rFonts w:ascii="Aptos" w:hAnsi="Aptos"/>
+                <w:color w:val="27364A"/>
+                <w:sz w:val="15"/>
+              </w:rPr>
+              <w:t>Add persona/navigation regression tests for sidebar and key page content.</w:t>
+            </w:r>
+          </w:p>
+        </w:tc>
+        <w:tc>
+          <w:tcPr>
+            <w:tcW w:type="dxa" w:w="3024"/>
+            <w:tcMar>
+              <w:top w:w="120" w:type="dxa"/>
+              <w:start w:w="120" w:type="dxa"/>
+              <w:bottom w:w="120" w:type="dxa"/>
+              <w:end w:w="120" w:type="dxa"/>
+            </w:tcMar>
+            <w:vAlign w:val="center"/>
+          </w:tcPr>
+          <w:p>
+            <w:pPr>
+              <w:spacing w:after="0"/>
+            </w:pPr>
+            <w:r>
+              <w:rPr>
+                <w:rFonts w:ascii="Aptos" w:hAnsi="Aptos"/>
+                <w:color w:val="27364A"/>
+                <w:sz w:val="15"/>
+              </w:rPr>
+              <w:t>Prevents future accidental coupling between persona visibility and permission authority.</w:t>
+            </w:r>
+          </w:p>
+        </w:tc>
+        <w:tc>
+          <w:tcPr>
+            <w:tcW w:type="dxa" w:w="2520"/>
+            <w:tcMar>
+              <w:top w:w="120" w:type="dxa"/>
+              <w:start w:w="120" w:type="dxa"/>
+              <w:bottom w:w="120" w:type="dxa"/>
+              <w:end w:w="120" w:type="dxa"/>
+            </w:tcMar>
+            <w:vAlign w:val="center"/>
+          </w:tcPr>
+          <w:p>
+            <w:pPr>
+              <w:spacing w:after="0"/>
+            </w:pPr>
+            <w:r>
+              <w:rPr>
+                <w:rFonts w:ascii="Aptos" w:hAnsi="Aptos"/>
+                <w:color w:val="27364A"/>
+                <w:sz w:val="15"/>
+              </w:rPr>
+              <w:t>1-2 days</w:t>
+            </w:r>
+          </w:p>
+        </w:tc>
+      </w:tr>
+      <w:tr>
+        <w:tc>
+          <w:tcPr>
+            <w:tcW w:type="dxa" w:w="1655"/>
+            <w:tcMar>
+              <w:top w:w="120" w:type="dxa"/>
+              <w:start w:w="120" w:type="dxa"/>
+              <w:bottom w:w="120" w:type="dxa"/>
+              <w:end w:w="120" w:type="dxa"/>
+            </w:tcMar>
+            <w:vAlign w:val="center"/>
+          </w:tcPr>
+          <w:p>
+            <w:pPr>
+              <w:spacing w:after="0"/>
+            </w:pPr>
+            <w:r>
+              <w:rPr>
+                <w:rFonts w:ascii="Aptos" w:hAnsi="Aptos"/>
+                <w:color w:val="27364A"/>
+                <w:sz w:val="15"/>
+              </w:rPr>
+              <w:t>P2</w:t>
+            </w:r>
+          </w:p>
+        </w:tc>
+        <w:tc>
+          <w:tcPr>
+            <w:tcW w:type="dxa" w:w="3024"/>
+            <w:tcMar>
+              <w:top w:w="120" w:type="dxa"/>
+              <w:start w:w="120" w:type="dxa"/>
+              <w:bottom w:w="120" w:type="dxa"/>
+              <w:end w:w="120" w:type="dxa"/>
+            </w:tcMar>
+            <w:vAlign w:val="center"/>
+          </w:tcPr>
+          <w:p>
+            <w:pPr>
+              <w:spacing w:after="0"/>
+            </w:pPr>
+            <w:r>
+              <w:rPr>
+                <w:rFonts w:ascii="Aptos" w:hAnsi="Aptos"/>
+                <w:color w:val="27364A"/>
+                <w:sz w:val="15"/>
+              </w:rPr>
+              <w:t>Review backend write enforcement for each managed domain.</w:t>
+            </w:r>
+          </w:p>
+        </w:tc>
+        <w:tc>
+          <w:tcPr>
+            <w:tcW w:type="dxa" w:w="3024"/>
+            <w:tcMar>
+              <w:top w:w="120" w:type="dxa"/>
+              <w:start w:w="120" w:type="dxa"/>
+              <w:bottom w:w="120" w:type="dxa"/>
+              <w:end w:w="120" w:type="dxa"/>
+            </w:tcMar>
+            <w:vAlign w:val="center"/>
+          </w:tcPr>
+          <w:p>
+            <w:pPr>
+              <w:spacing w:after="0"/>
+            </w:pPr>
+            <w:r>
+              <w:rPr>
+                <w:rFonts w:ascii="Aptos" w:hAnsi="Aptos"/>
+                <w:color w:val="27364A"/>
+                <w:sz w:val="15"/>
+              </w:rPr>
+              <w:t>Confirms UI guards are UX helpers, not the only security control.</w:t>
+            </w:r>
+          </w:p>
+        </w:tc>
+        <w:tc>
+          <w:tcPr>
+            <w:tcW w:type="dxa" w:w="2520"/>
+            <w:tcMar>
+              <w:top w:w="120" w:type="dxa"/>
+              <w:start w:w="120" w:type="dxa"/>
+              <w:bottom w:w="120" w:type="dxa"/>
+              <w:end w:w="120" w:type="dxa"/>
+            </w:tcMar>
+            <w:vAlign w:val="center"/>
+          </w:tcPr>
+          <w:p>
+            <w:pPr>
+              <w:spacing w:after="0"/>
+            </w:pPr>
+            <w:r>
+              <w:rPr>
+                <w:rFonts w:ascii="Aptos" w:hAnsi="Aptos"/>
+                <w:color w:val="27364A"/>
+                <w:sz w:val="15"/>
+              </w:rPr>
+              <w:t>1 day</w:t>
+            </w:r>
+          </w:p>
+        </w:tc>
+      </w:tr>
+    </w:tbl>
+    <w:p/>
+    <w:p>
+      <w:pPr>
+        <w:pStyle w:val="Heading1"/>
       </w:pPr>
       <w:r>
         <w:t>Known Follow-Up Areas</w:t>
@@ -1140,110 +3446,102 @@
     <w:p>
       <w:pPr>
         <w:pStyle w:val="ListBullet"/>
-        <w:spacing w:after="80"/>
+        <w:spacing w:after="120" w:line="259" w:lineRule="auto"/>
       </w:pPr>
       <w:r>
+        <w:rPr>
+          <w:rFonts w:ascii="Aptos" w:hAnsi="Aptos"/>
+          <w:color w:val="1F2937"/>
+          <w:sz w:val="20"/>
+        </w:rPr>
         <w:t>Confirm whether upstream query/resource APIs already enforce view permission; if not, add explicit batch view checks.</w:t>
       </w:r>
     </w:p>
     <w:p>
       <w:pPr>
         <w:pStyle w:val="ListBullet"/>
-        <w:spacing w:after="80"/>
+        <w:spacing w:after="120" w:line="259" w:lineRule="auto"/>
       </w:pPr>
       <w:r>
+        <w:rPr>
+          <w:rFonts w:ascii="Aptos" w:hAnsi="Aptos"/>
+          <w:color w:val="1F2937"/>
+          <w:sz w:val="20"/>
+        </w:rPr>
         <w:t>Keep persona/lens logic for sidebar and page composition, but avoid using persona as action authority.</w:t>
       </w:r>
     </w:p>
     <w:p>
       <w:pPr>
         <w:pStyle w:val="ListBullet"/>
-        <w:spacing w:after="80"/>
+        <w:spacing w:after="120" w:line="259" w:lineRule="auto"/>
       </w:pPr>
       <w:r>
+        <w:rPr>
+          <w:rFonts w:ascii="Aptos" w:hAnsi="Aptos"/>
+          <w:color w:val="1F2937"/>
+          <w:sz w:val="20"/>
+        </w:rPr>
         <w:t>Guard direct create/edit/admin routes with manage/write permission, not only hidden buttons.</w:t>
       </w:r>
     </w:p>
     <w:p>
       <w:pPr>
         <w:pStyle w:val="ListBullet"/>
-        <w:spacing w:after="80"/>
+        <w:spacing w:after="120" w:line="259" w:lineRule="auto"/>
       </w:pPr>
       <w:r>
+        <w:rPr>
+          <w:rFonts w:ascii="Aptos" w:hAnsi="Aptos"/>
+          <w:color w:val="1F2937"/>
+          <w:sz w:val="20"/>
+        </w:rPr>
         <w:t>Gate Permissions page admin actions such as Add User, role update, and removal by manage/write permission.</w:t>
       </w:r>
     </w:p>
     <w:p>
       <w:pPr>
         <w:pStyle w:val="Heading1"/>
-        <w:keepNext/>
       </w:pPr>
       <w:r>
         <w:t>Meeting Ask</w:t>
       </w:r>
     </w:p>
     <w:p>
+      <w:pPr>
+        <w:spacing w:after="120" w:line="259" w:lineRule="auto"/>
+      </w:pPr>
       <w:r>
+        <w:rPr>
+          <w:rFonts w:ascii="Aptos" w:hAnsi="Aptos"/>
+          <w:color w:val="1F2937"/>
+          <w:sz w:val="20"/>
+        </w:rPr>
         <w:t>Can we agree on this contract?</w:t>
       </w:r>
     </w:p>
-    <w:tbl>
-      <w:tblPr>
-        <w:tblW w:type="auto" w:w="0"/>
-        <w:tblLayout w:type="fixed"/>
-        <w:tblLook w:firstColumn="1" w:firstRow="1" w:lastColumn="0" w:lastRow="0" w:noHBand="0" w:noVBand="1" w:val="04A0"/>
-      </w:tblPr>
-      <w:tblGrid>
-        <w:gridCol w:w="9360"/>
-      </w:tblGrid>
-      <w:tr>
-        <w:tc>
-          <w:tcPr>
-            <w:tcW w:type="dxa" w:w="9792"/>
-            <w:shd w:fill="F3F6FA"/>
-            <w:tcBorders>
-              <w:top w:val="single" w:sz="6" w:space="0" w:color="D5DEE8"/>
-              <w:left w:val="single" w:sz="6" w:space="0" w:color="D5DEE8"/>
-              <w:bottom w:val="single" w:sz="6" w:space="0" w:color="D5DEE8"/>
-              <w:right w:val="single" w:sz="6" w:space="0" w:color="D5DEE8"/>
-            </w:tcBorders>
-            <w:tcMar>
-              <w:top w:w="140" w:type="dxa"/>
-              <w:start w:w="180" w:type="dxa"/>
-              <w:bottom w:w="140" w:type="dxa"/>
-              <w:end w:w="180" w:type="dxa"/>
-            </w:tcMar>
-          </w:tcPr>
-          <w:p>
-            <w:pPr>
-              <w:spacing w:after="0"/>
-            </w:pPr>
-            <w:r>
-              <w:rPr>
-                <w:rFonts w:ascii="Courier New" w:hAnsi="Courier New"/>
-                <w:color w:val="111827"/>
-                <w:sz w:val="20"/>
-              </w:rPr>
-              <w:t>Context selector eligibility -&gt; view permission</w:t>
-              <w:br/>
-              <w:t>Sidebar/page/content visibility -&gt; persona/role</w:t>
-              <w:br/>
-              <w:t>Action authority -&gt; manage/write permission</w:t>
-            </w:r>
-          </w:p>
-        </w:tc>
-      </w:tr>
-    </w:tbl>
     <w:p>
       <w:pPr>
-        <w:spacing w:after="40"/>
+        <w:spacing w:before="40" w:after="160"/>
+        <w:ind w:left="259"/>
       </w:pPr>
+      <w:r>
+        <w:rPr>
+          <w:rFonts w:ascii="Aptos Mono" w:hAnsi="Aptos Mono"/>
+          <w:color w:val="17324D"/>
+          <w:sz w:val="18"/>
+        </w:rPr>
+        <w:t>Context selector eligibility -&gt; view permission</w:t>
+        <w:br/>
+        <w:t>Sidebar/page/content visibility -&gt; persona/role</w:t>
+        <w:br/>
+        <w:t>Action authority -&gt; manage/write permission</w:t>
+      </w:r>
     </w:p>
     <w:sectPr>
-      <w:headerReference w:type="default" r:id="rId9"/>
-      <w:footerReference w:type="default" r:id="rId10"/>
+      <w:footerReference w:type="default" r:id="rId9"/>
       <w:pgSz w:w="12240" w:h="15840"/>
-      <w:pgMar w:top="1152" w:right="1224" w:bottom="1152" w:left="1224" w:header="720" w:footer="720" w:gutter="0"/>
+      <w:pgMar w:top="1008" w:right="1008" w:bottom="1008" w:left="1008" w:header="720" w:footer="720" w:gutter="0"/>
       <w:cols w:space="720"/>
       <w:docGrid w:linePitch="360"/>
     </w:sectPr>
@@ -1256,37 +3554,18 @@
   <w:p>
     <w:pPr>
       <w:pStyle w:val="Footer"/>
-      <w:jc w:val="right"/>
+      <w:jc w:val="center"/>
     </w:pPr>
     <w:r>
       <w:rPr>
-        <w:rFonts w:ascii="Arial" w:hAnsi="Arial"/>
+        <w:rFonts w:ascii="Aptos" w:hAnsi="Aptos"/>
         <w:color w:val="6B7280"/>
-        <w:sz w:val="17"/>
-      </w:rPr>
-      <w:t>Meeting preread</w:t>
+        <w:sz w:val="16"/>
+      </w:rPr>
+      <w:t>LFX One permission, persona, and navigation model</w:t>
     </w:r>
   </w:p>
 </w:ftr>
-</file>
-
-<file path=word/header1.xml><?xml version="1.0" encoding="utf-8"?>
-<w:hdr xmlns:m="http://schemas.openxmlformats.org/officeDocument/2006/math" xmlns:mc="http://schemas.openxmlformats.org/markup-compatibility/2006" xmlns:mo="http://schemas.microsoft.com/office/mac/office/2008/main" xmlns:mv="urn:schemas-microsoft-com:mac:vml" xmlns:o="urn:schemas-microsoft-com:office:office" xmlns:r="http://schemas.openxmlformats.org/officeDocument/2006/relationships" xmlns:v="urn:schemas-microsoft-com:vml" xmlns:w10="urn:schemas-microsoft-com:office:word" xmlns:w14="http://schemas.microsoft.com/office/word/2010/wordml" xmlns:w="http://schemas.openxmlformats.org/wordprocessingml/2006/main" xmlns:wne="http://schemas.microsoft.com/office/word/2006/wordml" xmlns:wp14="http://schemas.microsoft.com/office/word/2010/wordprocessingDrawing" xmlns:wp="http://schemas.openxmlformats.org/drawingml/2006/wordprocessingDrawing" xmlns:wpc="http://schemas.microsoft.com/office/word/2010/wordprocessingCanvas" xmlns:wpg="http://schemas.microsoft.com/office/word/2010/wordprocessingGroup" xmlns:wpi="http://schemas.microsoft.com/office/word/2010/wordprocessingInk" xmlns:wps="http://schemas.microsoft.com/office/word/2010/wordprocessingShape" mc:Ignorable="w14 wp14">
-  <w:p>
-    <w:pPr>
-      <w:pStyle w:val="Header"/>
-      <w:jc w:val="right"/>
-    </w:pPr>
-    <w:r>
-      <w:rPr>
-        <w:rFonts w:ascii="Arial" w:hAnsi="Arial"/>
-        <w:color w:val="6B7280"/>
-        <w:sz w:val="17"/>
-      </w:rPr>
-      <w:t>LFX One Authorization Model</w:t>
-    </w:r>
-  </w:p>
-</w:hdr>
 </file>
 
 <file path=word/numbering.xml><?xml version="1.0" encoding="utf-8"?>
@@ -1652,12 +3931,9 @@
     <w:name w:val="Normal"/>
     <w:qFormat/>
     <w:rsid w:val="00FC693F"/>
-    <w:pPr>
-      <w:spacing w:after="120" w:line="259" w:lineRule="auto"/>
-    </w:pPr>
     <w:rPr>
-      <w:rFonts w:ascii="Arial" w:hAnsi="Arial"/>
-      <w:sz w:val="21"/>
+      <w:rFonts w:ascii="Aptos" w:hAnsi="Aptos"/>
+      <w:sz w:val="20"/>
     </w:rPr>
   </w:style>
   <w:style w:type="paragraph" w:styleId="Header">
@@ -1715,15 +3991,15 @@
     <w:pPr>
       <w:keepNext/>
       <w:keepLines/>
-      <w:spacing w:before="480" w:after="0"/>
+      <w:spacing w:before="160" w:after="80"/>
       <w:outlineLvl w:val="0"/>
     </w:pPr>
     <w:rPr>
-      <w:rFonts w:asciiTheme="majorHAnsi" w:eastAsiaTheme="majorEastAsia" w:hAnsiTheme="majorHAnsi" w:cstheme="majorBidi" w:ascii="Arial" w:hAnsi="Arial"/>
+      <w:rFonts w:asciiTheme="majorHAnsi" w:eastAsiaTheme="majorEastAsia" w:hAnsiTheme="majorHAnsi" w:cstheme="majorBidi" w:ascii="Aptos" w:hAnsi="Aptos"/>
       <w:b/>
       <w:bCs/>
-      <w:color w:val="0F172A"/>
-      <w:sz w:val="30"/>
+      <w:color w:val="244C7A"/>
+      <w:sz w:val="28"/>
       <w:szCs w:val="28"/>
     </w:rPr>
   </w:style>
@@ -1739,15 +4015,15 @@
     <w:pPr>
       <w:keepNext/>
       <w:keepLines/>
-      <w:spacing w:before="200" w:after="0"/>
+      <w:spacing w:before="160" w:after="80"/>
       <w:outlineLvl w:val="1"/>
     </w:pPr>
     <w:rPr>
-      <w:rFonts w:asciiTheme="majorHAnsi" w:eastAsiaTheme="majorEastAsia" w:hAnsiTheme="majorHAnsi" w:cstheme="majorBidi" w:ascii="Arial" w:hAnsi="Arial"/>
+      <w:rFonts w:asciiTheme="majorHAnsi" w:eastAsiaTheme="majorEastAsia" w:hAnsiTheme="majorHAnsi" w:cstheme="majorBidi" w:ascii="Aptos" w:hAnsi="Aptos"/>
       <w:b/>
       <w:bCs/>
-      <w:color w:val="1F2937"/>
-      <w:sz w:val="25"/>
+      <w:color w:val="244C7A"/>
+      <w:sz w:val="23"/>
       <w:szCs w:val="26"/>
     </w:rPr>
   </w:style>
@@ -1763,14 +4039,15 @@
     <w:pPr>
       <w:keepNext/>
       <w:keepLines/>
-      <w:spacing w:before="200" w:after="0"/>
+      <w:spacing w:before="160" w:after="80"/>
       <w:outlineLvl w:val="2"/>
     </w:pPr>
     <w:rPr>
-      <w:rFonts w:asciiTheme="majorHAnsi" w:eastAsiaTheme="majorEastAsia" w:hAnsiTheme="majorHAnsi" w:cstheme="majorBidi"/>
+      <w:rFonts w:asciiTheme="majorHAnsi" w:eastAsiaTheme="majorEastAsia" w:hAnsiTheme="majorHAnsi" w:cstheme="majorBidi" w:ascii="Aptos" w:hAnsi="Aptos"/>
       <w:b/>
       <w:bCs/>
-      <w:color w:val="4F81BD" w:themeColor="accent1"/>
+      <w:color w:val="244C7A"/>
+      <w:sz w:val="21"/>
     </w:rPr>
   </w:style>
   <w:style w:type="paragraph" w:styleId="Heading4">
@@ -2004,16 +4281,16 @@
       <w:pBdr>
         <w:bottom w:val="single" w:sz="8" w:space="4" w:color="4F81BD" w:themeColor="accent1"/>
       </w:pBdr>
-      <w:spacing w:after="300" w:line="240" w:lineRule="auto"/>
+      <w:spacing w:after="80" w:line="240" w:lineRule="auto" w:before="160"/>
       <w:contextualSpacing/>
     </w:pPr>
     <w:rPr>
-      <w:rFonts w:asciiTheme="majorHAnsi" w:eastAsiaTheme="majorEastAsia" w:hAnsiTheme="majorHAnsi" w:cstheme="majorBidi" w:ascii="Arial" w:hAnsi="Arial"/>
+      <w:rFonts w:asciiTheme="majorHAnsi" w:eastAsiaTheme="majorEastAsia" w:hAnsiTheme="majorHAnsi" w:cstheme="majorBidi" w:ascii="Aptos" w:hAnsi="Aptos"/>
       <w:b/>
-      <w:color w:val="111827"/>
+      <w:color w:val="244C7A"/>
       <w:spacing w:val="5"/>
       <w:kern w:val="28"/>
-      <w:sz w:val="44"/>
+      <w:sz w:val="40"/>
       <w:szCs w:val="52"/>
     </w:rPr>
   </w:style>

</xml_diff>

<commit_message>
docs: link permission persona epic
</commit_message>
<xml_diff>
--- a/docs/architecture/frontend/permission-persona-navigation-model-preread.docx
+++ b/docs/architecture/frontend/permission-persona-navigation-model-preread.docx
@@ -30,6 +30,92 @@
     </w:p>
     <w:p>
       <w:pPr>
+        <w:spacing w:after="120" w:line="259" w:lineRule="auto"/>
+      </w:pPr>
+      <w:r>
+        <w:rPr>
+          <w:rFonts w:ascii="Aptos" w:hAnsi="Aptos"/>
+          <w:color w:val="1F2937"/>
+          <w:sz w:val="20"/>
+        </w:rPr>
+        <w:t>Tracking epic: LFXV2-1654 - https://linuxfoundation.atlassian.net/browse/LFXV2-1654</w:t>
+      </w:r>
+    </w:p>
+    <w:p>
+      <w:pPr>
+        <w:pStyle w:val="Heading1"/>
+      </w:pPr>
+      <w:r>
+        <w:t>How to Read This</w:t>
+      </w:r>
+    </w:p>
+    <w:p>
+      <w:pPr>
+        <w:spacing w:after="120" w:line="259" w:lineRule="auto"/>
+      </w:pPr>
+      <w:r>
+        <w:rPr>
+          <w:rFonts w:ascii="Aptos" w:hAnsi="Aptos"/>
+          <w:color w:val="1F2937"/>
+          <w:sz w:val="20"/>
+        </w:rPr>
+        <w:t>This document is meant to drive one team conversation:</w:t>
+      </w:r>
+    </w:p>
+    <w:p>
+      <w:pPr>
+        <w:spacing w:after="120" w:line="259" w:lineRule="auto"/>
+      </w:pPr>
+      <w:r>
+        <w:rPr>
+          <w:rFonts w:ascii="Aptos" w:hAnsi="Aptos"/>
+          <w:color w:val="1F2937"/>
+          <w:sz w:val="20"/>
+        </w:rPr>
+        <w:t>1. Agree on the product/security contract.</w:t>
+      </w:r>
+    </w:p>
+    <w:p>
+      <w:pPr>
+        <w:spacing w:after="120" w:line="259" w:lineRule="auto"/>
+      </w:pPr>
+      <w:r>
+        <w:rPr>
+          <w:rFonts w:ascii="Aptos" w:hAnsi="Aptos"/>
+          <w:color w:val="1F2937"/>
+          <w:sz w:val="20"/>
+        </w:rPr>
+        <w:t>2. Confirm where the current code already follows that contract.</w:t>
+      </w:r>
+    </w:p>
+    <w:p>
+      <w:pPr>
+        <w:spacing w:after="120" w:line="259" w:lineRule="auto"/>
+      </w:pPr>
+      <w:r>
+        <w:rPr>
+          <w:rFonts w:ascii="Aptos" w:hAnsi="Aptos"/>
+          <w:color w:val="1F2937"/>
+          <w:sz w:val="20"/>
+        </w:rPr>
+        <w:t>3. Decide what work belongs under the epic.</w:t>
+      </w:r>
+    </w:p>
+    <w:p>
+      <w:pPr>
+        <w:spacing w:after="120" w:line="259" w:lineRule="auto"/>
+      </w:pPr>
+      <w:r>
+        <w:rPr>
+          <w:rFonts w:ascii="Aptos" w:hAnsi="Aptos"/>
+          <w:color w:val="1F2937"/>
+          <w:sz w:val="20"/>
+        </w:rPr>
+        <w:t>4. Sequence the remaining implementation work by risk and priority.</w:t>
+      </w:r>
+    </w:p>
+    <w:p>
+      <w:pPr>
         <w:pStyle w:val="Heading1"/>
       </w:pPr>
       <w:r>
@@ -47,6 +133,37 @@
           <w:sz w:val="20"/>
         </w:rPr>
         <w:t>This preread proposes a clear separation between access, experience, and authority. The goal is to make the product easier to reason about and to keep persona-driven UX from accidentally becoming authorization logic.</w:t>
+      </w:r>
+    </w:p>
+    <w:p>
+      <w:pPr>
+        <w:spacing w:after="120" w:line="259" w:lineRule="auto"/>
+      </w:pPr>
+      <w:r>
+        <w:rPr>
+          <w:rFonts w:ascii="Aptos" w:hAnsi="Aptos"/>
+          <w:color w:val="1F2937"/>
+          <w:sz w:val="20"/>
+        </w:rPr>
+        <w:t>The simplest way to state the model:</w:t>
+      </w:r>
+    </w:p>
+    <w:p>
+      <w:pPr>
+        <w:spacing w:before="40" w:after="160"/>
+        <w:ind w:left="259"/>
+      </w:pPr>
+      <w:r>
+        <w:rPr>
+          <w:rFonts w:ascii="Aptos Mono" w:hAnsi="Aptos Mono"/>
+          <w:color w:val="17324D"/>
+          <w:sz w:val="18"/>
+        </w:rPr>
+        <w:t>View permission decides where the user can go.</w:t>
+        <w:br/>
+        <w:t>Persona/role decides what the user sees there.</w:t>
+        <w:br/>
+        <w:t>Manage/write permission decides what the user can do there.</w:t>
       </w:r>
     </w:p>
     <w:p>

</xml_diff>

<commit_message>
docs: map permission persona work to jira
</commit_message>
<xml_diff>
--- a/docs/architecture/frontend/permission-persona-navigation-model-preread.docx
+++ b/docs/architecture/frontend/permission-persona-navigation-model-preread.docx
@@ -2582,6 +2582,19 @@
         <w:t>Proposed Work Plan and Estimate</w:t>
       </w:r>
     </w:p>
+    <w:p>
+      <w:pPr>
+        <w:spacing w:after="120" w:line="259" w:lineRule="auto"/>
+      </w:pPr>
+      <w:r>
+        <w:rPr>
+          <w:rFonts w:ascii="Aptos" w:hAnsi="Aptos"/>
+          <w:color w:val="1F2937"/>
+          <w:sz w:val="20"/>
+        </w:rPr>
+        <w:t>All work below rolls up to epic LFXV2-1654.</w:t>
+      </w:r>
+    </w:p>
     <w:tbl>
       <w:tblPr>
         <w:tblStyle w:val="TableGrid"/>
@@ -2599,10 +2612,12 @@
         </w:tblBorders>
       </w:tblPr>
       <w:tblGrid>
-        <w:gridCol w:w="2556"/>
-        <w:gridCol w:w="2556"/>
-        <w:gridCol w:w="2556"/>
-        <w:gridCol w:w="2556"/>
+        <w:gridCol w:w="1704"/>
+        <w:gridCol w:w="1704"/>
+        <w:gridCol w:w="1704"/>
+        <w:gridCol w:w="1704"/>
+        <w:gridCol w:w="1704"/>
+        <w:gridCol w:w="1704"/>
       </w:tblGrid>
       <w:tr>
         <w:trPr>
@@ -2610,7 +2625,34 @@
         </w:trPr>
         <w:tc>
           <w:tcPr>
-            <w:tcW w:type="dxa" w:w="1655"/>
+            <w:tcW w:type="dxa" w:w="1180"/>
+            <w:shd w:fill="D9E7F5"/>
+            <w:tcMar>
+              <w:top w:w="120" w:type="dxa"/>
+              <w:start w:w="120" w:type="dxa"/>
+              <w:bottom w:w="120" w:type="dxa"/>
+              <w:end w:w="120" w:type="dxa"/>
+            </w:tcMar>
+            <w:vAlign w:val="center"/>
+          </w:tcPr>
+          <w:p>
+            <w:pPr>
+              <w:jc w:val="left"/>
+            </w:pPr>
+            <w:r>
+              <w:rPr>
+                <w:rFonts w:ascii="Aptos" w:hAnsi="Aptos"/>
+                <w:b/>
+                <w:color w:val="17324D"/>
+                <w:sz w:val="16"/>
+              </w:rPr>
+              <w:t>Jira</w:t>
+            </w:r>
+          </w:p>
+        </w:tc>
+        <w:tc>
+          <w:tcPr>
+            <w:tcW w:type="dxa" w:w="720"/>
             <w:shd w:fill="D9E7F5"/>
             <w:tcMar>
               <w:top w:w="120" w:type="dxa"/>
@@ -2637,7 +2679,34 @@
         </w:tc>
         <w:tc>
           <w:tcPr>
-            <w:tcW w:type="dxa" w:w="3024"/>
+            <w:tcW w:type="dxa" w:w="1036"/>
+            <w:shd w:fill="D9E7F5"/>
+            <w:tcMar>
+              <w:top w:w="120" w:type="dxa"/>
+              <w:start w:w="120" w:type="dxa"/>
+              <w:bottom w:w="120" w:type="dxa"/>
+              <w:end w:w="120" w:type="dxa"/>
+            </w:tcMar>
+            <w:vAlign w:val="center"/>
+          </w:tcPr>
+          <w:p>
+            <w:pPr>
+              <w:jc w:val="left"/>
+            </w:pPr>
+            <w:r>
+              <w:rPr>
+                <w:rFonts w:ascii="Aptos" w:hAnsi="Aptos"/>
+                <w:b/>
+                <w:color w:val="17324D"/>
+                <w:sz w:val="16"/>
+              </w:rPr>
+              <w:t>Current Jira status</w:t>
+            </w:r>
+          </w:p>
+        </w:tc>
+        <w:tc>
+          <w:tcPr>
+            <w:tcW w:type="dxa" w:w="3096"/>
             <w:shd w:fill="D9E7F5"/>
             <w:tcMar>
               <w:top w:w="120" w:type="dxa"/>
@@ -2664,7 +2733,7 @@
         </w:tc>
         <w:tc>
           <w:tcPr>
-            <w:tcW w:type="dxa" w:w="3024"/>
+            <w:tcW w:type="dxa" w:w="3240"/>
             <w:shd w:fill="D9E7F5"/>
             <w:tcMar>
               <w:top w:w="120" w:type="dxa"/>
@@ -2691,7 +2760,7 @@
         </w:tc>
         <w:tc>
           <w:tcPr>
-            <w:tcW w:type="dxa" w:w="2520"/>
+            <w:tcW w:type="dxa" w:w="950"/>
             <w:shd w:fill="D9E7F5"/>
             <w:tcMar>
               <w:top w:w="120" w:type="dxa"/>
@@ -2720,7 +2789,32 @@
       <w:tr>
         <w:tc>
           <w:tcPr>
-            <w:tcW w:type="dxa" w:w="1655"/>
+            <w:tcW w:type="dxa" w:w="1180"/>
+            <w:tcMar>
+              <w:top w:w="120" w:type="dxa"/>
+              <w:start w:w="120" w:type="dxa"/>
+              <w:bottom w:w="120" w:type="dxa"/>
+              <w:end w:w="120" w:type="dxa"/>
+            </w:tcMar>
+            <w:vAlign w:val="center"/>
+          </w:tcPr>
+          <w:p>
+            <w:pPr>
+              <w:spacing w:after="0"/>
+            </w:pPr>
+            <w:r>
+              <w:rPr>
+                <w:rFonts w:ascii="Aptos" w:hAnsi="Aptos"/>
+                <w:color w:val="27364A"/>
+                <w:sz w:val="15"/>
+              </w:rPr>
+              <w:t>LFXV2-1655</w:t>
+            </w:r>
+          </w:p>
+        </w:tc>
+        <w:tc>
+          <w:tcPr>
+            <w:tcW w:type="dxa" w:w="720"/>
             <w:tcMar>
               <w:top w:w="120" w:type="dxa"/>
               <w:start w:w="120" w:type="dxa"/>
@@ -2745,7 +2839,7 @@
         </w:tc>
         <w:tc>
           <w:tcPr>
-            <w:tcW w:type="dxa" w:w="3024"/>
+            <w:tcW w:type="dxa" w:w="1036"/>
             <w:tcMar>
               <w:top w:w="120" w:type="dxa"/>
               <w:start w:w="120" w:type="dxa"/>
@@ -2764,13 +2858,38 @@
                 <w:color w:val="27364A"/>
                 <w:sz w:val="15"/>
               </w:rPr>
-              <w:t>Confirm selector permission contract with query/resource API owners.</w:t>
+              <w:t>Backlog</w:t>
             </w:r>
           </w:p>
         </w:tc>
         <w:tc>
           <w:tcPr>
-            <w:tcW w:type="dxa" w:w="3024"/>
+            <w:tcW w:type="dxa" w:w="3096"/>
+            <w:tcMar>
+              <w:top w:w="120" w:type="dxa"/>
+              <w:start w:w="120" w:type="dxa"/>
+              <w:bottom w:w="120" w:type="dxa"/>
+              <w:end w:w="120" w:type="dxa"/>
+            </w:tcMar>
+            <w:vAlign w:val="center"/>
+          </w:tcPr>
+          <w:p>
+            <w:pPr>
+              <w:spacing w:after="0"/>
+            </w:pPr>
+            <w:r>
+              <w:rPr>
+                <w:rFonts w:ascii="Aptos" w:hAnsi="Aptos"/>
+                <w:color w:val="27364A"/>
+                <w:sz w:val="15"/>
+              </w:rPr>
+              <w:t>Confirm Foundation/Project selector permission contract with query/resource API owners.</w:t>
+            </w:r>
+          </w:p>
+        </w:tc>
+        <w:tc>
+          <w:tcPr>
+            <w:tcW w:type="dxa" w:w="3240"/>
             <w:tcMar>
               <w:top w:w="120" w:type="dxa"/>
               <w:start w:w="120" w:type="dxa"/>
@@ -2812,7 +2931,7 @@
         </w:tc>
         <w:tc>
           <w:tcPr>
-            <w:tcW w:type="dxa" w:w="2520"/>
+            <w:tcW w:type="dxa" w:w="950"/>
             <w:tcMar>
               <w:top w:w="120" w:type="dxa"/>
               <w:start w:w="120" w:type="dxa"/>
@@ -2839,7 +2958,32 @@
       <w:tr>
         <w:tc>
           <w:tcPr>
-            <w:tcW w:type="dxa" w:w="1655"/>
+            <w:tcW w:type="dxa" w:w="1180"/>
+            <w:tcMar>
+              <w:top w:w="120" w:type="dxa"/>
+              <w:start w:w="120" w:type="dxa"/>
+              <w:bottom w:w="120" w:type="dxa"/>
+              <w:end w:w="120" w:type="dxa"/>
+            </w:tcMar>
+            <w:vAlign w:val="center"/>
+          </w:tcPr>
+          <w:p>
+            <w:pPr>
+              <w:spacing w:after="0"/>
+            </w:pPr>
+            <w:r>
+              <w:rPr>
+                <w:rFonts w:ascii="Aptos" w:hAnsi="Aptos"/>
+                <w:color w:val="27364A"/>
+                <w:sz w:val="15"/>
+              </w:rPr>
+              <w:t>LFXV2-1656</w:t>
+            </w:r>
+          </w:p>
+        </w:tc>
+        <w:tc>
+          <w:tcPr>
+            <w:tcW w:type="dxa" w:w="720"/>
             <w:tcMar>
               <w:top w:w="120" w:type="dxa"/>
               <w:start w:w="120" w:type="dxa"/>
@@ -2864,7 +3008,7 @@
         </w:tc>
         <w:tc>
           <w:tcPr>
-            <w:tcW w:type="dxa" w:w="3024"/>
+            <w:tcW w:type="dxa" w:w="1036"/>
             <w:tcMar>
               <w:top w:w="120" w:type="dxa"/>
               <w:start w:w="120" w:type="dxa"/>
@@ -2883,13 +3027,38 @@
                 <w:color w:val="27364A"/>
                 <w:sz w:val="15"/>
               </w:rPr>
-              <w:t>Add explicit selector viewer check if upstream contract is not strong enough.</w:t>
+              <w:t>Backlog</w:t>
             </w:r>
           </w:p>
         </w:tc>
         <w:tc>
           <w:tcPr>
-            <w:tcW w:type="dxa" w:w="3024"/>
+            <w:tcW w:type="dxa" w:w="3096"/>
+            <w:tcMar>
+              <w:top w:w="120" w:type="dxa"/>
+              <w:start w:w="120" w:type="dxa"/>
+              <w:bottom w:w="120" w:type="dxa"/>
+              <w:end w:w="120" w:type="dxa"/>
+            </w:tcMar>
+            <w:vAlign w:val="center"/>
+          </w:tcPr>
+          <w:p>
+            <w:pPr>
+              <w:spacing w:after="0"/>
+            </w:pPr>
+            <w:r>
+              <w:rPr>
+                <w:rFonts w:ascii="Aptos" w:hAnsi="Aptos"/>
+                <w:color w:val="27364A"/>
+                <w:sz w:val="15"/>
+              </w:rPr>
+              <w:t>Add explicit viewer check to Foundation/Project selector in BFF.</w:t>
+            </w:r>
+          </w:p>
+        </w:tc>
+        <w:tc>
+          <w:tcPr>
+            <w:tcW w:type="dxa" w:w="3240"/>
             <w:tcMar>
               <w:top w:w="120" w:type="dxa"/>
               <w:start w:w="120" w:type="dxa"/>
@@ -2914,7 +3083,7 @@
         </w:tc>
         <w:tc>
           <w:tcPr>
-            <w:tcW w:type="dxa" w:w="2520"/>
+            <w:tcW w:type="dxa" w:w="950"/>
             <w:tcMar>
               <w:top w:w="120" w:type="dxa"/>
               <w:start w:w="120" w:type="dxa"/>
@@ -2941,7 +3110,32 @@
       <w:tr>
         <w:tc>
           <w:tcPr>
-            <w:tcW w:type="dxa" w:w="1655"/>
+            <w:tcW w:type="dxa" w:w="1180"/>
+            <w:tcMar>
+              <w:top w:w="120" w:type="dxa"/>
+              <w:start w:w="120" w:type="dxa"/>
+              <w:bottom w:w="120" w:type="dxa"/>
+              <w:end w:w="120" w:type="dxa"/>
+            </w:tcMar>
+            <w:vAlign w:val="center"/>
+          </w:tcPr>
+          <w:p>
+            <w:pPr>
+              <w:spacing w:after="0"/>
+            </w:pPr>
+            <w:r>
+              <w:rPr>
+                <w:rFonts w:ascii="Aptos" w:hAnsi="Aptos"/>
+                <w:color w:val="27364A"/>
+                <w:sz w:val="15"/>
+              </w:rPr>
+              <w:t>LFXV2-1657</w:t>
+            </w:r>
+          </w:p>
+        </w:tc>
+        <w:tc>
+          <w:tcPr>
+            <w:tcW w:type="dxa" w:w="720"/>
             <w:tcMar>
               <w:top w:w="120" w:type="dxa"/>
               <w:start w:w="120" w:type="dxa"/>
@@ -2966,7 +3160,32 @@
         </w:tc>
         <w:tc>
           <w:tcPr>
-            <w:tcW w:type="dxa" w:w="3024"/>
+            <w:tcW w:type="dxa" w:w="1036"/>
+            <w:tcMar>
+              <w:top w:w="120" w:type="dxa"/>
+              <w:start w:w="120" w:type="dxa"/>
+              <w:bottom w:w="120" w:type="dxa"/>
+              <w:end w:w="120" w:type="dxa"/>
+            </w:tcMar>
+            <w:vAlign w:val="center"/>
+          </w:tcPr>
+          <w:p>
+            <w:pPr>
+              <w:spacing w:after="0"/>
+            </w:pPr>
+            <w:r>
+              <w:rPr>
+                <w:rFonts w:ascii="Aptos" w:hAnsi="Aptos"/>
+                <w:color w:val="27364A"/>
+                <w:sz w:val="15"/>
+              </w:rPr>
+              <w:t>Backlog</w:t>
+            </w:r>
+          </w:p>
+        </w:tc>
+        <w:tc>
+          <w:tcPr>
+            <w:tcW w:type="dxa" w:w="3096"/>
             <w:tcMar>
               <w:top w:w="120" w:type="dxa"/>
               <w:start w:w="120" w:type="dxa"/>
@@ -2991,7 +3210,7 @@
         </w:tc>
         <w:tc>
           <w:tcPr>
-            <w:tcW w:type="dxa" w:w="3024"/>
+            <w:tcW w:type="dxa" w:w="3240"/>
             <w:tcMar>
               <w:top w:w="120" w:type="dxa"/>
               <w:start w:w="120" w:type="dxa"/>
@@ -3016,7 +3235,7 @@
         </w:tc>
         <w:tc>
           <w:tcPr>
-            <w:tcW w:type="dxa" w:w="2520"/>
+            <w:tcW w:type="dxa" w:w="950"/>
             <w:tcMar>
               <w:top w:w="120" w:type="dxa"/>
               <w:start w:w="120" w:type="dxa"/>
@@ -3043,7 +3262,32 @@
       <w:tr>
         <w:tc>
           <w:tcPr>
-            <w:tcW w:type="dxa" w:w="1655"/>
+            <w:tcW w:type="dxa" w:w="1180"/>
+            <w:tcMar>
+              <w:top w:w="120" w:type="dxa"/>
+              <w:start w:w="120" w:type="dxa"/>
+              <w:bottom w:w="120" w:type="dxa"/>
+              <w:end w:w="120" w:type="dxa"/>
+            </w:tcMar>
+            <w:vAlign w:val="center"/>
+          </w:tcPr>
+          <w:p>
+            <w:pPr>
+              <w:spacing w:after="0"/>
+            </w:pPr>
+            <w:r>
+              <w:rPr>
+                <w:rFonts w:ascii="Aptos" w:hAnsi="Aptos"/>
+                <w:color w:val="27364A"/>
+                <w:sz w:val="15"/>
+              </w:rPr>
+              <w:t>LFXV2-1658</w:t>
+            </w:r>
+          </w:p>
+        </w:tc>
+        <w:tc>
+          <w:tcPr>
+            <w:tcW w:type="dxa" w:w="720"/>
             <w:tcMar>
               <w:top w:w="120" w:type="dxa"/>
               <w:start w:w="120" w:type="dxa"/>
@@ -3068,7 +3312,32 @@
         </w:tc>
         <w:tc>
           <w:tcPr>
-            <w:tcW w:type="dxa" w:w="3024"/>
+            <w:tcW w:type="dxa" w:w="1036"/>
+            <w:tcMar>
+              <w:top w:w="120" w:type="dxa"/>
+              <w:start w:w="120" w:type="dxa"/>
+              <w:bottom w:w="120" w:type="dxa"/>
+              <w:end w:w="120" w:type="dxa"/>
+            </w:tcMar>
+            <w:vAlign w:val="center"/>
+          </w:tcPr>
+          <w:p>
+            <w:pPr>
+              <w:spacing w:after="0"/>
+            </w:pPr>
+            <w:r>
+              <w:rPr>
+                <w:rFonts w:ascii="Aptos" w:hAnsi="Aptos"/>
+                <w:color w:val="27364A"/>
+                <w:sz w:val="15"/>
+              </w:rPr>
+              <w:t>Backlog</w:t>
+            </w:r>
+          </w:p>
+        </w:tc>
+        <w:tc>
+          <w:tcPr>
+            <w:tcW w:type="dxa" w:w="3096"/>
             <w:tcMar>
               <w:top w:w="120" w:type="dxa"/>
               <w:start w:w="120" w:type="dxa"/>
@@ -3093,7 +3362,7 @@
         </w:tc>
         <w:tc>
           <w:tcPr>
-            <w:tcW w:type="dxa" w:w="3024"/>
+            <w:tcW w:type="dxa" w:w="3240"/>
             <w:tcMar>
               <w:top w:w="120" w:type="dxa"/>
               <w:start w:w="120" w:type="dxa"/>
@@ -3118,7 +3387,7 @@
         </w:tc>
         <w:tc>
           <w:tcPr>
-            <w:tcW w:type="dxa" w:w="2520"/>
+            <w:tcW w:type="dxa" w:w="950"/>
             <w:tcMar>
               <w:top w:w="120" w:type="dxa"/>
               <w:start w:w="120" w:type="dxa"/>
@@ -3145,7 +3414,32 @@
       <w:tr>
         <w:tc>
           <w:tcPr>
-            <w:tcW w:type="dxa" w:w="1655"/>
+            <w:tcW w:type="dxa" w:w="1180"/>
+            <w:tcMar>
+              <w:top w:w="120" w:type="dxa"/>
+              <w:start w:w="120" w:type="dxa"/>
+              <w:bottom w:w="120" w:type="dxa"/>
+              <w:end w:w="120" w:type="dxa"/>
+            </w:tcMar>
+            <w:vAlign w:val="center"/>
+          </w:tcPr>
+          <w:p>
+            <w:pPr>
+              <w:spacing w:after="0"/>
+            </w:pPr>
+            <w:r>
+              <w:rPr>
+                <w:rFonts w:ascii="Aptos" w:hAnsi="Aptos"/>
+                <w:color w:val="27364A"/>
+                <w:sz w:val="15"/>
+              </w:rPr>
+              <w:t>LFXV2-1659</w:t>
+            </w:r>
+          </w:p>
+        </w:tc>
+        <w:tc>
+          <w:tcPr>
+            <w:tcW w:type="dxa" w:w="720"/>
             <w:tcMar>
               <w:top w:w="120" w:type="dxa"/>
               <w:start w:w="120" w:type="dxa"/>
@@ -3170,7 +3464,7 @@
         </w:tc>
         <w:tc>
           <w:tcPr>
-            <w:tcW w:type="dxa" w:w="3024"/>
+            <w:tcW w:type="dxa" w:w="1036"/>
             <w:tcMar>
               <w:top w:w="120" w:type="dxa"/>
               <w:start w:w="120" w:type="dxa"/>
@@ -3189,13 +3483,38 @@
                 <w:color w:val="27364A"/>
                 <w:sz w:val="15"/>
               </w:rPr>
-              <w:t>Gate Settings and permission-management actions.</w:t>
+              <w:t>Backlog</w:t>
             </w:r>
           </w:p>
         </w:tc>
         <w:tc>
           <w:tcPr>
-            <w:tcW w:type="dxa" w:w="3024"/>
+            <w:tcW w:type="dxa" w:w="3096"/>
+            <w:tcMar>
+              <w:top w:w="120" w:type="dxa"/>
+              <w:start w:w="120" w:type="dxa"/>
+              <w:bottom w:w="120" w:type="dxa"/>
+              <w:end w:w="120" w:type="dxa"/>
+            </w:tcMar>
+            <w:vAlign w:val="center"/>
+          </w:tcPr>
+          <w:p>
+            <w:pPr>
+              <w:spacing w:after="0"/>
+            </w:pPr>
+            <w:r>
+              <w:rPr>
+                <w:rFonts w:ascii="Aptos" w:hAnsi="Aptos"/>
+                <w:color w:val="27364A"/>
+                <w:sz w:val="15"/>
+              </w:rPr>
+              <w:t>Gate Settings and permission-management admin actions by manage/write/admin.</w:t>
+            </w:r>
+          </w:p>
+        </w:tc>
+        <w:tc>
+          <w:tcPr>
+            <w:tcW w:type="dxa" w:w="3240"/>
             <w:tcMar>
               <w:top w:w="120" w:type="dxa"/>
               <w:start w:w="120" w:type="dxa"/>
@@ -3220,7 +3539,7 @@
         </w:tc>
         <w:tc>
           <w:tcPr>
-            <w:tcW w:type="dxa" w:w="2520"/>
+            <w:tcW w:type="dxa" w:w="950"/>
             <w:tcMar>
               <w:top w:w="120" w:type="dxa"/>
               <w:start w:w="120" w:type="dxa"/>
@@ -3247,7 +3566,32 @@
       <w:tr>
         <w:tc>
           <w:tcPr>
-            <w:tcW w:type="dxa" w:w="1655"/>
+            <w:tcW w:type="dxa" w:w="1180"/>
+            <w:tcMar>
+              <w:top w:w="120" w:type="dxa"/>
+              <w:start w:w="120" w:type="dxa"/>
+              <w:bottom w:w="120" w:type="dxa"/>
+              <w:end w:w="120" w:type="dxa"/>
+            </w:tcMar>
+            <w:vAlign w:val="center"/>
+          </w:tcPr>
+          <w:p>
+            <w:pPr>
+              <w:spacing w:after="0"/>
+            </w:pPr>
+            <w:r>
+              <w:rPr>
+                <w:rFonts w:ascii="Aptos" w:hAnsi="Aptos"/>
+                <w:color w:val="27364A"/>
+                <w:sz w:val="15"/>
+              </w:rPr>
+              <w:t>LFXV2-1660</w:t>
+            </w:r>
+          </w:p>
+        </w:tc>
+        <w:tc>
+          <w:tcPr>
+            <w:tcW w:type="dxa" w:w="720"/>
             <w:tcMar>
               <w:top w:w="120" w:type="dxa"/>
               <w:start w:w="120" w:type="dxa"/>
@@ -3272,7 +3616,32 @@
         </w:tc>
         <w:tc>
           <w:tcPr>
-            <w:tcW w:type="dxa" w:w="3024"/>
+            <w:tcW w:type="dxa" w:w="1036"/>
+            <w:tcMar>
+              <w:top w:w="120" w:type="dxa"/>
+              <w:start w:w="120" w:type="dxa"/>
+              <w:bottom w:w="120" w:type="dxa"/>
+              <w:end w:w="120" w:type="dxa"/>
+            </w:tcMar>
+            <w:vAlign w:val="center"/>
+          </w:tcPr>
+          <w:p>
+            <w:pPr>
+              <w:spacing w:after="0"/>
+            </w:pPr>
+            <w:r>
+              <w:rPr>
+                <w:rFonts w:ascii="Aptos" w:hAnsi="Aptos"/>
+                <w:color w:val="27364A"/>
+                <w:sz w:val="15"/>
+              </w:rPr>
+              <w:t>Backlog</w:t>
+            </w:r>
+          </w:p>
+        </w:tc>
+        <w:tc>
+          <w:tcPr>
+            <w:tcW w:type="dxa" w:w="3096"/>
             <w:tcMar>
               <w:top w:w="120" w:type="dxa"/>
               <w:start w:w="120" w:type="dxa"/>
@@ -3297,7 +3666,7 @@
         </w:tc>
         <w:tc>
           <w:tcPr>
-            <w:tcW w:type="dxa" w:w="3024"/>
+            <w:tcW w:type="dxa" w:w="3240"/>
             <w:tcMar>
               <w:top w:w="120" w:type="dxa"/>
               <w:start w:w="120" w:type="dxa"/>
@@ -3322,7 +3691,7 @@
         </w:tc>
         <w:tc>
           <w:tcPr>
-            <w:tcW w:type="dxa" w:w="2520"/>
+            <w:tcW w:type="dxa" w:w="950"/>
             <w:tcMar>
               <w:top w:w="120" w:type="dxa"/>
               <w:start w:w="120" w:type="dxa"/>
@@ -3349,7 +3718,32 @@
       <w:tr>
         <w:tc>
           <w:tcPr>
-            <w:tcW w:type="dxa" w:w="1655"/>
+            <w:tcW w:type="dxa" w:w="1180"/>
+            <w:tcMar>
+              <w:top w:w="120" w:type="dxa"/>
+              <w:start w:w="120" w:type="dxa"/>
+              <w:bottom w:w="120" w:type="dxa"/>
+              <w:end w:w="120" w:type="dxa"/>
+            </w:tcMar>
+            <w:vAlign w:val="center"/>
+          </w:tcPr>
+          <w:p>
+            <w:pPr>
+              <w:spacing w:after="0"/>
+            </w:pPr>
+            <w:r>
+              <w:rPr>
+                <w:rFonts w:ascii="Aptos" w:hAnsi="Aptos"/>
+                <w:color w:val="27364A"/>
+                <w:sz w:val="15"/>
+              </w:rPr>
+              <w:t>LFXV2-1661</w:t>
+            </w:r>
+          </w:p>
+        </w:tc>
+        <w:tc>
+          <w:tcPr>
+            <w:tcW w:type="dxa" w:w="720"/>
             <w:tcMar>
               <w:top w:w="120" w:type="dxa"/>
               <w:start w:w="120" w:type="dxa"/>
@@ -3374,7 +3768,32 @@
         </w:tc>
         <w:tc>
           <w:tcPr>
-            <w:tcW w:type="dxa" w:w="3024"/>
+            <w:tcW w:type="dxa" w:w="1036"/>
+            <w:tcMar>
+              <w:top w:w="120" w:type="dxa"/>
+              <w:start w:w="120" w:type="dxa"/>
+              <w:bottom w:w="120" w:type="dxa"/>
+              <w:end w:w="120" w:type="dxa"/>
+            </w:tcMar>
+            <w:vAlign w:val="center"/>
+          </w:tcPr>
+          <w:p>
+            <w:pPr>
+              <w:spacing w:after="0"/>
+            </w:pPr>
+            <w:r>
+              <w:rPr>
+                <w:rFonts w:ascii="Aptos" w:hAnsi="Aptos"/>
+                <w:color w:val="27364A"/>
+                <w:sz w:val="15"/>
+              </w:rPr>
+              <w:t>Backlog</w:t>
+            </w:r>
+          </w:p>
+        </w:tc>
+        <w:tc>
+          <w:tcPr>
+            <w:tcW w:type="dxa" w:w="3096"/>
             <w:tcMar>
               <w:top w:w="120" w:type="dxa"/>
               <w:start w:w="120" w:type="dxa"/>
@@ -3399,7 +3818,7 @@
         </w:tc>
         <w:tc>
           <w:tcPr>
-            <w:tcW w:type="dxa" w:w="3024"/>
+            <w:tcW w:type="dxa" w:w="3240"/>
             <w:tcMar>
               <w:top w:w="120" w:type="dxa"/>
               <w:start w:w="120" w:type="dxa"/>
@@ -3424,7 +3843,7 @@
         </w:tc>
         <w:tc>
           <w:tcPr>
-            <w:tcW w:type="dxa" w:w="2520"/>
+            <w:tcW w:type="dxa" w:w="950"/>
             <w:tcMar>
               <w:top w:w="120" w:type="dxa"/>
               <w:start w:w="120" w:type="dxa"/>
@@ -3451,7 +3870,32 @@
       <w:tr>
         <w:tc>
           <w:tcPr>
-            <w:tcW w:type="dxa" w:w="1655"/>
+            <w:tcW w:type="dxa" w:w="1180"/>
+            <w:tcMar>
+              <w:top w:w="120" w:type="dxa"/>
+              <w:start w:w="120" w:type="dxa"/>
+              <w:bottom w:w="120" w:type="dxa"/>
+              <w:end w:w="120" w:type="dxa"/>
+            </w:tcMar>
+            <w:vAlign w:val="center"/>
+          </w:tcPr>
+          <w:p>
+            <w:pPr>
+              <w:spacing w:after="0"/>
+            </w:pPr>
+            <w:r>
+              <w:rPr>
+                <w:rFonts w:ascii="Aptos" w:hAnsi="Aptos"/>
+                <w:color w:val="27364A"/>
+                <w:sz w:val="15"/>
+              </w:rPr>
+              <w:t>LFXV2-1662</w:t>
+            </w:r>
+          </w:p>
+        </w:tc>
+        <w:tc>
+          <w:tcPr>
+            <w:tcW w:type="dxa" w:w="720"/>
             <w:tcMar>
               <w:top w:w="120" w:type="dxa"/>
               <w:start w:w="120" w:type="dxa"/>
@@ -3476,7 +3920,7 @@
         </w:tc>
         <w:tc>
           <w:tcPr>
-            <w:tcW w:type="dxa" w:w="3024"/>
+            <w:tcW w:type="dxa" w:w="1036"/>
             <w:tcMar>
               <w:top w:w="120" w:type="dxa"/>
               <w:start w:w="120" w:type="dxa"/>
@@ -3495,13 +3939,38 @@
                 <w:color w:val="27364A"/>
                 <w:sz w:val="15"/>
               </w:rPr>
-              <w:t>Review backend write enforcement for each managed domain.</w:t>
+              <w:t>Backlog</w:t>
             </w:r>
           </w:p>
         </w:tc>
         <w:tc>
           <w:tcPr>
-            <w:tcW w:type="dxa" w:w="3024"/>
+            <w:tcW w:type="dxa" w:w="3096"/>
+            <w:tcMar>
+              <w:top w:w="120" w:type="dxa"/>
+              <w:start w:w="120" w:type="dxa"/>
+              <w:bottom w:w="120" w:type="dxa"/>
+              <w:end w:w="120" w:type="dxa"/>
+            </w:tcMar>
+            <w:vAlign w:val="center"/>
+          </w:tcPr>
+          <w:p>
+            <w:pPr>
+              <w:spacing w:after="0"/>
+            </w:pPr>
+            <w:r>
+              <w:rPr>
+                <w:rFonts w:ascii="Aptos" w:hAnsi="Aptos"/>
+                <w:color w:val="27364A"/>
+                <w:sz w:val="15"/>
+              </w:rPr>
+              <w:t>Review backend write enforcement per managed domain.</w:t>
+            </w:r>
+          </w:p>
+        </w:tc>
+        <w:tc>
+          <w:tcPr>
+            <w:tcW w:type="dxa" w:w="3240"/>
             <w:tcMar>
               <w:top w:w="120" w:type="dxa"/>
               <w:start w:w="120" w:type="dxa"/>
@@ -3526,7 +3995,7 @@
         </w:tc>
         <w:tc>
           <w:tcPr>
-            <w:tcW w:type="dxa" w:w="2520"/>
+            <w:tcW w:type="dxa" w:w="950"/>
             <w:tcMar>
               <w:top w:w="120" w:type="dxa"/>
               <w:start w:w="120" w:type="dxa"/>

</xml_diff>

<commit_message>
docs: link jira work items
</commit_message>
<xml_diff>
--- a/docs/architecture/frontend/permission-persona-navigation-model-preread.docx
+++ b/docs/architecture/frontend/permission-persona-navigation-model-preread.docx
@@ -2802,14 +2802,16 @@
             <w:pPr>
               <w:spacing w:after="0"/>
             </w:pPr>
-            <w:r>
-              <w:rPr>
-                <w:rFonts w:ascii="Aptos" w:hAnsi="Aptos"/>
-                <w:color w:val="27364A"/>
-                <w:sz w:val="15"/>
-              </w:rPr>
-              <w:t>LFXV2-1655</w:t>
-            </w:r>
+            <w:hyperlink r:id="rId9">
+              <w:r>
+                <w:rPr>
+                  <w:color w:val="0563C1"/>
+                  <w:u w:val="single"/>
+                  <w:sz w:val="15"/>
+                </w:rPr>
+                <w:t>LFXV2-1655</w:t>
+              </w:r>
+            </w:hyperlink>
           </w:p>
         </w:tc>
         <w:tc>
@@ -2971,14 +2973,16 @@
             <w:pPr>
               <w:spacing w:after="0"/>
             </w:pPr>
-            <w:r>
-              <w:rPr>
-                <w:rFonts w:ascii="Aptos" w:hAnsi="Aptos"/>
-                <w:color w:val="27364A"/>
-                <w:sz w:val="15"/>
-              </w:rPr>
-              <w:t>LFXV2-1656</w:t>
-            </w:r>
+            <w:hyperlink r:id="rId10">
+              <w:r>
+                <w:rPr>
+                  <w:color w:val="0563C1"/>
+                  <w:u w:val="single"/>
+                  <w:sz w:val="15"/>
+                </w:rPr>
+                <w:t>LFXV2-1656</w:t>
+              </w:r>
+            </w:hyperlink>
           </w:p>
         </w:tc>
         <w:tc>
@@ -3123,14 +3127,16 @@
             <w:pPr>
               <w:spacing w:after="0"/>
             </w:pPr>
-            <w:r>
-              <w:rPr>
-                <w:rFonts w:ascii="Aptos" w:hAnsi="Aptos"/>
-                <w:color w:val="27364A"/>
-                <w:sz w:val="15"/>
-              </w:rPr>
-              <w:t>LFXV2-1657</w:t>
-            </w:r>
+            <w:hyperlink r:id="rId11">
+              <w:r>
+                <w:rPr>
+                  <w:color w:val="0563C1"/>
+                  <w:u w:val="single"/>
+                  <w:sz w:val="15"/>
+                </w:rPr>
+                <w:t>LFXV2-1657</w:t>
+              </w:r>
+            </w:hyperlink>
           </w:p>
         </w:tc>
         <w:tc>
@@ -3275,14 +3281,16 @@
             <w:pPr>
               <w:spacing w:after="0"/>
             </w:pPr>
-            <w:r>
-              <w:rPr>
-                <w:rFonts w:ascii="Aptos" w:hAnsi="Aptos"/>
-                <w:color w:val="27364A"/>
-                <w:sz w:val="15"/>
-              </w:rPr>
-              <w:t>LFXV2-1658</w:t>
-            </w:r>
+            <w:hyperlink r:id="rId12">
+              <w:r>
+                <w:rPr>
+                  <w:color w:val="0563C1"/>
+                  <w:u w:val="single"/>
+                  <w:sz w:val="15"/>
+                </w:rPr>
+                <w:t>LFXV2-1658</w:t>
+              </w:r>
+            </w:hyperlink>
           </w:p>
         </w:tc>
         <w:tc>
@@ -3427,14 +3435,16 @@
             <w:pPr>
               <w:spacing w:after="0"/>
             </w:pPr>
-            <w:r>
-              <w:rPr>
-                <w:rFonts w:ascii="Aptos" w:hAnsi="Aptos"/>
-                <w:color w:val="27364A"/>
-                <w:sz w:val="15"/>
-              </w:rPr>
-              <w:t>LFXV2-1659</w:t>
-            </w:r>
+            <w:hyperlink r:id="rId13">
+              <w:r>
+                <w:rPr>
+                  <w:color w:val="0563C1"/>
+                  <w:u w:val="single"/>
+                  <w:sz w:val="15"/>
+                </w:rPr>
+                <w:t>LFXV2-1659</w:t>
+              </w:r>
+            </w:hyperlink>
           </w:p>
         </w:tc>
         <w:tc>
@@ -3579,14 +3589,16 @@
             <w:pPr>
               <w:spacing w:after="0"/>
             </w:pPr>
-            <w:r>
-              <w:rPr>
-                <w:rFonts w:ascii="Aptos" w:hAnsi="Aptos"/>
-                <w:color w:val="27364A"/>
-                <w:sz w:val="15"/>
-              </w:rPr>
-              <w:t>LFXV2-1660</w:t>
-            </w:r>
+            <w:hyperlink r:id="rId14">
+              <w:r>
+                <w:rPr>
+                  <w:color w:val="0563C1"/>
+                  <w:u w:val="single"/>
+                  <w:sz w:val="15"/>
+                </w:rPr>
+                <w:t>LFXV2-1660</w:t>
+              </w:r>
+            </w:hyperlink>
           </w:p>
         </w:tc>
         <w:tc>
@@ -3731,14 +3743,16 @@
             <w:pPr>
               <w:spacing w:after="0"/>
             </w:pPr>
-            <w:r>
-              <w:rPr>
-                <w:rFonts w:ascii="Aptos" w:hAnsi="Aptos"/>
-                <w:color w:val="27364A"/>
-                <w:sz w:val="15"/>
-              </w:rPr>
-              <w:t>LFXV2-1661</w:t>
-            </w:r>
+            <w:hyperlink r:id="rId15">
+              <w:r>
+                <w:rPr>
+                  <w:color w:val="0563C1"/>
+                  <w:u w:val="single"/>
+                  <w:sz w:val="15"/>
+                </w:rPr>
+                <w:t>LFXV2-1661</w:t>
+              </w:r>
+            </w:hyperlink>
           </w:p>
         </w:tc>
         <w:tc>
@@ -3883,14 +3897,16 @@
             <w:pPr>
               <w:spacing w:after="0"/>
             </w:pPr>
-            <w:r>
-              <w:rPr>
-                <w:rFonts w:ascii="Aptos" w:hAnsi="Aptos"/>
-                <w:color w:val="27364A"/>
-                <w:sz w:val="15"/>
-              </w:rPr>
-              <w:t>LFXV2-1662</w:t>
-            </w:r>
+            <w:hyperlink r:id="rId16">
+              <w:r>
+                <w:rPr>
+                  <w:color w:val="0563C1"/>
+                  <w:u w:val="single"/>
+                  <w:sz w:val="15"/>
+                </w:rPr>
+                <w:t>LFXV2-1662</w:t>
+              </w:r>
+            </w:hyperlink>
           </w:p>
         </w:tc>
         <w:tc>
@@ -4125,7 +4141,7 @@
       </w:r>
     </w:p>
     <w:sectPr>
-      <w:footerReference w:type="default" r:id="rId9"/>
+      <w:footerReference w:type="default" r:id="rId17"/>
       <w:pgSz w:w="12240" w:h="15840"/>
       <w:pgMar w:top="1008" w:right="1008" w:bottom="1008" w:left="1008" w:header="720" w:footer="720" w:gutter="0"/>
       <w:cols w:space="720"/>

</xml_diff>

<commit_message>
docs: record meeting agreement
</commit_message>
<xml_diff>
--- a/docs/architecture/frontend/permission-persona-navigation-model-preread.docx
+++ b/docs/architecture/frontend/permission-persona-navigation-model-preread.docx
@@ -4106,7 +4106,7 @@
         <w:pStyle w:val="Heading1"/>
       </w:pPr>
       <w:r>
-        <w:t>Meeting Ask</w:t>
+        <w:t>Meeting Agreement</w:t>
       </w:r>
     </w:p>
     <w:p>
@@ -4119,7 +4119,7 @@
           <w:color w:val="1F2937"/>
           <w:sz w:val="20"/>
         </w:rPr>
-        <w:t>Can we agree on this contract?</w:t>
+        <w:t>The team aligned on this contract in the meeting:</w:t>
       </w:r>
     </w:p>
     <w:p>
@@ -4140,8 +4140,39 @@
         <w:t>Action authority -&gt; manage/write permission</w:t>
       </w:r>
     </w:p>
+    <w:p>
+      <w:pPr>
+        <w:spacing w:after="120" w:line="259" w:lineRule="auto"/>
+      </w:pPr>
+      <w:r>
+        <w:rPr>
+          <w:rFonts w:ascii="Aptos" w:hAnsi="Aptos"/>
+          <w:color w:val="1F2937"/>
+          <w:sz w:val="20"/>
+        </w:rPr>
+        <w:t xml:space="preserve">The remaining work is tracked under epic </w:t>
+      </w:r>
+      <w:hyperlink r:id="rId17">
+        <w:r>
+          <w:rPr>
+            <w:color w:val="0563C1"/>
+            <w:u w:val="single"/>
+            <w:sz w:val="20"/>
+          </w:rPr>
+          <w:t>LFXV2-1654</w:t>
+        </w:r>
+      </w:hyperlink>
+      <w:r>
+        <w:rPr>
+          <w:rFonts w:ascii="Aptos" w:hAnsi="Aptos"/>
+          <w:color w:val="1F2937"/>
+          <w:sz w:val="20"/>
+        </w:rPr>
+        <w:t xml:space="preserve"> and the individual Jira items listed above.</w:t>
+      </w:r>
+    </w:p>
     <w:sectPr>
-      <w:footerReference w:type="default" r:id="rId17"/>
+      <w:footerReference w:type="default" r:id="rId18"/>
       <w:pgSz w:w="12240" w:h="15840"/>
       <w:pgMar w:top="1008" w:right="1008" w:bottom="1008" w:left="1008" w:header="720" w:footer="720" w:gutter="0"/>
       <w:cols w:space="720"/>

</xml_diff>

<commit_message>
docs: update permission persona current status
</commit_message>
<xml_diff>
--- a/docs/architecture/frontend/permission-persona-navigation-model-preread.docx
+++ b/docs/architecture/frontend/permission-persona-navigation-model-preread.docx
@@ -25,7 +25,7 @@
           <w:color w:val="1F2937"/>
           <w:sz w:val="20"/>
         </w:rPr>
-        <w:t>Meeting preread for aligning how LFX One decides where users can go, what they see, and what they can do.</w:t>
+        <w:t>Alignment record for how LFX One decides where users can go, what they see, and what they can do.</w:t>
       </w:r>
     </w:p>
     <w:p>
@@ -59,7 +59,67 @@
           <w:color w:val="1F2937"/>
           <w:sz w:val="20"/>
         </w:rPr>
-        <w:t>This document is meant to drive one team conversation:</w:t>
+        <w:t>This document started as a preread and now records the agreed model plus the implementation work that remains:</w:t>
+      </w:r>
+    </w:p>
+    <w:p>
+      <w:pPr>
+        <w:pStyle w:val="ListNumber"/>
+      </w:pPr>
+      <w:r>
+        <w:rPr>
+          <w:rFonts w:ascii="Aptos" w:hAnsi="Aptos"/>
+          <w:color w:val="1F2937"/>
+          <w:sz w:val="20"/>
+        </w:rPr>
+        <w:t>Agree on the product/security contract.</w:t>
+      </w:r>
+    </w:p>
+    <w:p>
+      <w:pPr>
+        <w:pStyle w:val="ListNumber"/>
+      </w:pPr>
+      <w:r>
+        <w:rPr>
+          <w:rFonts w:ascii="Aptos" w:hAnsi="Aptos"/>
+          <w:color w:val="1F2937"/>
+          <w:sz w:val="20"/>
+        </w:rPr>
+        <w:t>Confirm where the current code already follows that contract.</w:t>
+      </w:r>
+    </w:p>
+    <w:p>
+      <w:pPr>
+        <w:pStyle w:val="ListNumber"/>
+      </w:pPr>
+      <w:r>
+        <w:rPr>
+          <w:rFonts w:ascii="Aptos" w:hAnsi="Aptos"/>
+          <w:color w:val="1F2937"/>
+          <w:sz w:val="20"/>
+        </w:rPr>
+        <w:t>Decide what work belongs under the epic.</w:t>
+      </w:r>
+    </w:p>
+    <w:p>
+      <w:pPr>
+        <w:pStyle w:val="ListNumber"/>
+      </w:pPr>
+      <w:r>
+        <w:rPr>
+          <w:rFonts w:ascii="Aptos" w:hAnsi="Aptos"/>
+          <w:color w:val="1F2937"/>
+          <w:sz w:val="20"/>
+        </w:rPr>
+        <w:t>Sequence the remaining implementation work by risk and priority.</w:t>
+      </w:r>
+    </w:p>
+    <w:p>
+      <w:pPr>
+        <w:pStyle w:val="Heading1"/>
+      </w:pPr>
+      <w:r>
+        <w:t>Where We Are Now</w:t>
       </w:r>
     </w:p>
     <w:p>
@@ -72,48 +132,599 @@
           <w:color w:val="1F2937"/>
           <w:sz w:val="20"/>
         </w:rPr>
-        <w:t>1. Agree on the product/security contract.</w:t>
+        <w:t>Updated May 19, 2026.</w:t>
       </w:r>
     </w:p>
-    <w:p>
-      <w:pPr>
-        <w:spacing w:after="120" w:line="259" w:lineRule="auto"/>
-      </w:pPr>
-      <w:r>
-        <w:rPr>
-          <w:rFonts w:ascii="Aptos" w:hAnsi="Aptos"/>
-          <w:color w:val="1F2937"/>
-          <w:sz w:val="20"/>
-        </w:rPr>
-        <w:t>2. Confirm where the current code already follows that contract.</w:t>
-      </w:r>
-    </w:p>
-    <w:p>
-      <w:pPr>
-        <w:spacing w:after="120" w:line="259" w:lineRule="auto"/>
-      </w:pPr>
-      <w:r>
-        <w:rPr>
-          <w:rFonts w:ascii="Aptos" w:hAnsi="Aptos"/>
-          <w:color w:val="1F2937"/>
-          <w:sz w:val="20"/>
-        </w:rPr>
-        <w:t>3. Decide what work belongs under the epic.</w:t>
-      </w:r>
-    </w:p>
-    <w:p>
-      <w:pPr>
-        <w:spacing w:after="120" w:line="259" w:lineRule="auto"/>
-      </w:pPr>
-      <w:r>
-        <w:rPr>
-          <w:rFonts w:ascii="Aptos" w:hAnsi="Aptos"/>
-          <w:color w:val="1F2937"/>
-          <w:sz w:val="20"/>
-        </w:rPr>
-        <w:t>4. Sequence the remaining implementation work by risk and priority.</w:t>
-      </w:r>
-    </w:p>
+    <w:tbl>
+      <w:tblPr>
+        <w:tblStyle w:val="TableGrid"/>
+        <w:tblW w:type="auto" w:w="0"/>
+        <w:jc w:val="center"/>
+        <w:tblLayout w:type="fixed"/>
+        <w:tblLook w:firstColumn="1" w:firstRow="1" w:lastColumn="0" w:lastRow="0" w:noHBand="0" w:noVBand="1" w:val="04A0"/>
+        <w:tblBorders>
+          <w:top w:val="single" w:sz="6" w:space="0" w:color="B7C6D8"/>
+          <w:left w:val="single" w:sz="6" w:space="0" w:color="B7C6D8"/>
+          <w:bottom w:val="single" w:sz="6" w:space="0" w:color="B7C6D8"/>
+          <w:right w:val="single" w:sz="6" w:space="0" w:color="B7C6D8"/>
+          <w:insideH w:val="single" w:sz="6" w:space="0" w:color="B7C6D8"/>
+          <w:insideV w:val="single" w:sz="6" w:space="0" w:color="B7C6D8"/>
+        </w:tblBorders>
+      </w:tblPr>
+      <w:tblGrid>
+        <w:gridCol w:w="3408"/>
+        <w:gridCol w:w="3408"/>
+        <w:gridCol w:w="3408"/>
+      </w:tblGrid>
+      <w:tr>
+        <w:trPr>
+          <w:tblHeader w:val="true"/>
+        </w:trPr>
+        <w:tc>
+          <w:tcPr>
+            <w:tcW w:type="dxa" w:w="2304"/>
+            <w:shd w:fill="D9E7F5"/>
+            <w:tcMar>
+              <w:top w:w="120" w:type="dxa"/>
+              <w:start w:w="120" w:type="dxa"/>
+              <w:bottom w:w="120" w:type="dxa"/>
+              <w:end w:w="120" w:type="dxa"/>
+            </w:tcMar>
+            <w:vAlign w:val="center"/>
+          </w:tcPr>
+          <w:p>
+            <w:r>
+              <w:rPr>
+                <w:rFonts w:ascii="Aptos" w:hAnsi="Aptos"/>
+                <w:b/>
+                <w:color w:val="17324D"/>
+                <w:sz w:val="16"/>
+              </w:rPr>
+              <w:t>Area</w:t>
+            </w:r>
+          </w:p>
+        </w:tc>
+        <w:tc>
+          <w:tcPr>
+            <w:tcW w:type="dxa" w:w="3024"/>
+            <w:shd w:fill="D9E7F5"/>
+            <w:tcMar>
+              <w:top w:w="120" w:type="dxa"/>
+              <w:start w:w="120" w:type="dxa"/>
+              <w:bottom w:w="120" w:type="dxa"/>
+              <w:end w:w="120" w:type="dxa"/>
+            </w:tcMar>
+            <w:vAlign w:val="center"/>
+          </w:tcPr>
+          <w:p>
+            <w:r>
+              <w:rPr>
+                <w:rFonts w:ascii="Aptos" w:hAnsi="Aptos"/>
+                <w:b/>
+                <w:color w:val="17324D"/>
+                <w:sz w:val="16"/>
+              </w:rPr>
+              <w:t>Current state</w:t>
+            </w:r>
+          </w:p>
+        </w:tc>
+        <w:tc>
+          <w:tcPr>
+            <w:tcW w:type="dxa" w:w="4896"/>
+            <w:shd w:fill="D9E7F5"/>
+            <w:tcMar>
+              <w:top w:w="120" w:type="dxa"/>
+              <w:start w:w="120" w:type="dxa"/>
+              <w:bottom w:w="120" w:type="dxa"/>
+              <w:end w:w="120" w:type="dxa"/>
+            </w:tcMar>
+            <w:vAlign w:val="center"/>
+          </w:tcPr>
+          <w:p>
+            <w:r>
+              <w:rPr>
+                <w:rFonts w:ascii="Aptos" w:hAnsi="Aptos"/>
+                <w:b/>
+                <w:color w:val="17324D"/>
+                <w:sz w:val="16"/>
+              </w:rPr>
+              <w:t>Implication</w:t>
+            </w:r>
+          </w:p>
+        </w:tc>
+      </w:tr>
+      <w:tr>
+        <w:tc>
+          <w:tcPr>
+            <w:tcW w:type="dxa" w:w="2304"/>
+            <w:tcMar>
+              <w:top w:w="120" w:type="dxa"/>
+              <w:start w:w="120" w:type="dxa"/>
+              <w:bottom w:w="120" w:type="dxa"/>
+              <w:end w:w="120" w:type="dxa"/>
+            </w:tcMar>
+            <w:vAlign w:val="center"/>
+          </w:tcPr>
+          <w:p>
+            <w:pPr>
+              <w:spacing w:after="0"/>
+            </w:pPr>
+            <w:r>
+              <w:rPr>
+                <w:rFonts w:ascii="Aptos" w:hAnsi="Aptos"/>
+                <w:color w:val="27364A"/>
+                <w:sz w:val="15"/>
+              </w:rPr>
+              <w:t>Team agreement</w:t>
+            </w:r>
+          </w:p>
+        </w:tc>
+        <w:tc>
+          <w:tcPr>
+            <w:tcW w:type="dxa" w:w="3024"/>
+            <w:tcMar>
+              <w:top w:w="120" w:type="dxa"/>
+              <w:start w:w="120" w:type="dxa"/>
+              <w:bottom w:w="120" w:type="dxa"/>
+              <w:end w:w="120" w:type="dxa"/>
+            </w:tcMar>
+            <w:vAlign w:val="center"/>
+          </w:tcPr>
+          <w:p>
+            <w:pPr>
+              <w:spacing w:after="0"/>
+            </w:pPr>
+            <w:r>
+              <w:rPr>
+                <w:rFonts w:ascii="Aptos" w:hAnsi="Aptos"/>
+                <w:color w:val="27364A"/>
+                <w:sz w:val="15"/>
+              </w:rPr>
+              <w:t>The meeting agreement is captured below: view permission controls context eligibility, persona/role controls visible experience, and manage/write permission controls actions.</w:t>
+            </w:r>
+          </w:p>
+        </w:tc>
+        <w:tc>
+          <w:tcPr>
+            <w:tcW w:type="dxa" w:w="4896"/>
+            <w:tcMar>
+              <w:top w:w="120" w:type="dxa"/>
+              <w:start w:w="120" w:type="dxa"/>
+              <w:bottom w:w="120" w:type="dxa"/>
+              <w:end w:w="120" w:type="dxa"/>
+            </w:tcMar>
+            <w:vAlign w:val="center"/>
+          </w:tcPr>
+          <w:p>
+            <w:pPr>
+              <w:spacing w:after="0"/>
+            </w:pPr>
+            <w:r>
+              <w:rPr>
+                <w:rFonts w:ascii="Aptos" w:hAnsi="Aptos"/>
+                <w:color w:val="27364A"/>
+                <w:sz w:val="15"/>
+              </w:rPr>
+              <w:t>The model is no longer just a proposal; remaining work should implement and test the agreed contract.</w:t>
+            </w:r>
+          </w:p>
+        </w:tc>
+      </w:tr>
+      <w:tr>
+        <w:tc>
+          <w:tcPr>
+            <w:tcW w:type="dxa" w:w="2304"/>
+            <w:tcMar>
+              <w:top w:w="120" w:type="dxa"/>
+              <w:start w:w="120" w:type="dxa"/>
+              <w:bottom w:w="120" w:type="dxa"/>
+              <w:end w:w="120" w:type="dxa"/>
+            </w:tcMar>
+            <w:vAlign w:val="center"/>
+          </w:tcPr>
+          <w:p>
+            <w:pPr>
+              <w:spacing w:after="0"/>
+            </w:pPr>
+            <w:r>
+              <w:rPr>
+                <w:rFonts w:ascii="Aptos" w:hAnsi="Aptos"/>
+                <w:color w:val="27364A"/>
+                <w:sz w:val="15"/>
+              </w:rPr>
+              <w:t>Jira tracking</w:t>
+            </w:r>
+          </w:p>
+        </w:tc>
+        <w:tc>
+          <w:tcPr>
+            <w:tcW w:type="dxa" w:w="3024"/>
+            <w:tcMar>
+              <w:top w:w="120" w:type="dxa"/>
+              <w:start w:w="120" w:type="dxa"/>
+              <w:bottom w:w="120" w:type="dxa"/>
+              <w:end w:w="120" w:type="dxa"/>
+            </w:tcMar>
+            <w:vAlign w:val="center"/>
+          </w:tcPr>
+          <w:p>
+            <w:pPr>
+              <w:spacing w:after="0"/>
+            </w:pPr>
+            <w:r>
+              <w:rPr>
+                <w:rFonts w:ascii="Aptos" w:hAnsi="Aptos"/>
+                <w:color w:val="27364A"/>
+                <w:sz w:val="15"/>
+              </w:rPr>
+              <w:t xml:space="preserve">Epic </w:t>
+            </w:r>
+            <w:hyperlink r:id="rId9">
+              <w:r>
+                <w:rPr>
+                  <w:color w:val="0563C1"/>
+                  <w:u w:val="single"/>
+                  <w:sz w:val="15"/>
+                </w:rPr>
+                <w:t>LFXV2-1654</w:t>
+              </w:r>
+            </w:hyperlink>
+            <w:r>
+              <w:rPr>
+                <w:rFonts w:ascii="Aptos" w:hAnsi="Aptos"/>
+                <w:color w:val="27364A"/>
+                <w:sz w:val="15"/>
+              </w:rPr>
+              <w:t xml:space="preserve"> exists, with individual work items </w:t>
+            </w:r>
+            <w:hyperlink r:id="rId10">
+              <w:r>
+                <w:rPr>
+                  <w:color w:val="0563C1"/>
+                  <w:u w:val="single"/>
+                  <w:sz w:val="15"/>
+                </w:rPr>
+                <w:t>LFXV2-1655</w:t>
+              </w:r>
+            </w:hyperlink>
+            <w:r>
+              <w:rPr>
+                <w:rFonts w:ascii="Aptos" w:hAnsi="Aptos"/>
+                <w:color w:val="27364A"/>
+                <w:sz w:val="15"/>
+              </w:rPr>
+              <w:t xml:space="preserve"> through </w:t>
+            </w:r>
+            <w:hyperlink r:id="rId11">
+              <w:r>
+                <w:rPr>
+                  <w:color w:val="0563C1"/>
+                  <w:u w:val="single"/>
+                  <w:sz w:val="15"/>
+                </w:rPr>
+                <w:t>LFXV2-1662</w:t>
+              </w:r>
+            </w:hyperlink>
+            <w:r>
+              <w:rPr>
+                <w:rFonts w:ascii="Aptos" w:hAnsi="Aptos"/>
+                <w:color w:val="27364A"/>
+                <w:sz w:val="15"/>
+              </w:rPr>
+              <w:t xml:space="preserve"> mapped in this document.</w:t>
+            </w:r>
+          </w:p>
+        </w:tc>
+        <w:tc>
+          <w:tcPr>
+            <w:tcW w:type="dxa" w:w="4896"/>
+            <w:tcMar>
+              <w:top w:w="120" w:type="dxa"/>
+              <w:start w:w="120" w:type="dxa"/>
+              <w:bottom w:w="120" w:type="dxa"/>
+              <w:end w:w="120" w:type="dxa"/>
+            </w:tcMar>
+            <w:vAlign w:val="center"/>
+          </w:tcPr>
+          <w:p>
+            <w:pPr>
+              <w:spacing w:after="0"/>
+            </w:pPr>
+            <w:r>
+              <w:rPr>
+                <w:rFonts w:ascii="Aptos" w:hAnsi="Aptos"/>
+                <w:color w:val="27364A"/>
+                <w:sz w:val="15"/>
+              </w:rPr>
+              <w:t>Engineering work can be planned and reviewed independently by decision boundary.</w:t>
+            </w:r>
+          </w:p>
+        </w:tc>
+      </w:tr>
+      <w:tr>
+        <w:tc>
+          <w:tcPr>
+            <w:tcW w:type="dxa" w:w="2304"/>
+            <w:tcMar>
+              <w:top w:w="120" w:type="dxa"/>
+              <w:start w:w="120" w:type="dxa"/>
+              <w:bottom w:w="120" w:type="dxa"/>
+              <w:end w:w="120" w:type="dxa"/>
+            </w:tcMar>
+            <w:vAlign w:val="center"/>
+          </w:tcPr>
+          <w:p>
+            <w:pPr>
+              <w:spacing w:after="0"/>
+            </w:pPr>
+            <w:r>
+              <w:rPr>
+                <w:rFonts w:ascii="Aptos" w:hAnsi="Aptos"/>
+                <w:color w:val="27364A"/>
+                <w:sz w:val="15"/>
+              </w:rPr>
+              <w:t>GitHub document branch</w:t>
+            </w:r>
+          </w:p>
+        </w:tc>
+        <w:tc>
+          <w:tcPr>
+            <w:tcW w:type="dxa" w:w="3024"/>
+            <w:tcMar>
+              <w:top w:w="120" w:type="dxa"/>
+              <w:start w:w="120" w:type="dxa"/>
+              <w:bottom w:w="120" w:type="dxa"/>
+              <w:end w:w="120" w:type="dxa"/>
+            </w:tcMar>
+            <w:vAlign w:val="center"/>
+          </w:tcPr>
+          <w:p>
+            <w:pPr>
+              <w:spacing w:after="0"/>
+            </w:pPr>
+            <w:r>
+              <w:rPr>
+                <w:rFonts w:ascii="Aptos" w:hAnsi="Aptos"/>
+                <w:color w:val="27364A"/>
+                <w:sz w:val="15"/>
+              </w:rPr>
+              <w:t xml:space="preserve">The standalone docs branch </w:t>
+            </w:r>
+            <w:r>
+              <w:rPr>
+                <w:rFonts w:ascii="Aptos Mono" w:hAnsi="Aptos Mono"/>
+                <w:b/>
+                <w:color w:val="27364A"/>
+                <w:sz w:val="15"/>
+              </w:rPr>
+              <w:t>docs/permission-persona-preread</w:t>
+            </w:r>
+            <w:r>
+              <w:rPr>
+                <w:rFonts w:ascii="Aptos" w:hAnsi="Aptos"/>
+                <w:color w:val="27364A"/>
+                <w:sz w:val="15"/>
+              </w:rPr>
+              <w:t xml:space="preserve"> exists and is scoped to this markdown file plus the DOCX version.</w:t>
+            </w:r>
+          </w:p>
+        </w:tc>
+        <w:tc>
+          <w:tcPr>
+            <w:tcW w:type="dxa" w:w="4896"/>
+            <w:tcMar>
+              <w:top w:w="120" w:type="dxa"/>
+              <w:start w:w="120" w:type="dxa"/>
+              <w:bottom w:w="120" w:type="dxa"/>
+              <w:end w:w="120" w:type="dxa"/>
+            </w:tcMar>
+            <w:vAlign w:val="center"/>
+          </w:tcPr>
+          <w:p>
+            <w:pPr>
+              <w:spacing w:after="0"/>
+            </w:pPr>
+            <w:r>
+              <w:rPr>
+                <w:rFonts w:ascii="Aptos" w:hAnsi="Aptos"/>
+                <w:color w:val="27364A"/>
+                <w:sz w:val="15"/>
+              </w:rPr>
+              <w:t>The document work remains independent from unrelated feature branches.</w:t>
+            </w:r>
+          </w:p>
+        </w:tc>
+      </w:tr>
+      <w:tr>
+        <w:tc>
+          <w:tcPr>
+            <w:tcW w:type="dxa" w:w="2304"/>
+            <w:tcMar>
+              <w:top w:w="120" w:type="dxa"/>
+              <w:start w:w="120" w:type="dxa"/>
+              <w:bottom w:w="120" w:type="dxa"/>
+              <w:end w:w="120" w:type="dxa"/>
+            </w:tcMar>
+            <w:vAlign w:val="center"/>
+          </w:tcPr>
+          <w:p>
+            <w:pPr>
+              <w:spacing w:after="0"/>
+            </w:pPr>
+            <w:r>
+              <w:rPr>
+                <w:rFonts w:ascii="Aptos" w:hAnsi="Aptos"/>
+                <w:color w:val="27364A"/>
+                <w:sz w:val="15"/>
+              </w:rPr>
+              <w:t>Pull request</w:t>
+            </w:r>
+          </w:p>
+        </w:tc>
+        <w:tc>
+          <w:tcPr>
+            <w:tcW w:type="dxa" w:w="3024"/>
+            <w:tcMar>
+              <w:top w:w="120" w:type="dxa"/>
+              <w:start w:w="120" w:type="dxa"/>
+              <w:bottom w:w="120" w:type="dxa"/>
+              <w:end w:w="120" w:type="dxa"/>
+            </w:tcMar>
+            <w:vAlign w:val="center"/>
+          </w:tcPr>
+          <w:p>
+            <w:pPr>
+              <w:spacing w:after="0"/>
+            </w:pPr>
+            <w:r>
+              <w:rPr>
+                <w:rFonts w:ascii="Aptos" w:hAnsi="Aptos"/>
+                <w:color w:val="27364A"/>
+                <w:sz w:val="15"/>
+              </w:rPr>
+              <w:t xml:space="preserve">No PR is open yet for </w:t>
+            </w:r>
+            <w:r>
+              <w:rPr>
+                <w:rFonts w:ascii="Aptos Mono" w:hAnsi="Aptos Mono"/>
+                <w:b/>
+                <w:color w:val="27364A"/>
+                <w:sz w:val="15"/>
+              </w:rPr>
+              <w:t>docs/permission-persona-preread</w:t>
+            </w:r>
+            <w:r>
+              <w:rPr>
+                <w:rFonts w:ascii="Aptos" w:hAnsi="Aptos"/>
+                <w:color w:val="27364A"/>
+                <w:sz w:val="15"/>
+              </w:rPr>
+              <w:t>.</w:t>
+            </w:r>
+          </w:p>
+        </w:tc>
+        <w:tc>
+          <w:tcPr>
+            <w:tcW w:type="dxa" w:w="4896"/>
+            <w:tcMar>
+              <w:top w:w="120" w:type="dxa"/>
+              <w:start w:w="120" w:type="dxa"/>
+              <w:bottom w:w="120" w:type="dxa"/>
+              <w:end w:w="120" w:type="dxa"/>
+            </w:tcMar>
+            <w:vAlign w:val="center"/>
+          </w:tcPr>
+          <w:p>
+            <w:pPr>
+              <w:spacing w:after="0"/>
+            </w:pPr>
+            <w:r>
+              <w:rPr>
+                <w:rFonts w:ascii="Aptos" w:hAnsi="Aptos"/>
+                <w:color w:val="27364A"/>
+                <w:sz w:val="15"/>
+              </w:rPr>
+              <w:t>Next operational step is to open the docs-only PR for review.</w:t>
+            </w:r>
+          </w:p>
+        </w:tc>
+      </w:tr>
+      <w:tr>
+        <w:tc>
+          <w:tcPr>
+            <w:tcW w:type="dxa" w:w="2304"/>
+            <w:tcMar>
+              <w:top w:w="120" w:type="dxa"/>
+              <w:start w:w="120" w:type="dxa"/>
+              <w:bottom w:w="120" w:type="dxa"/>
+              <w:end w:w="120" w:type="dxa"/>
+            </w:tcMar>
+            <w:vAlign w:val="center"/>
+          </w:tcPr>
+          <w:p>
+            <w:pPr>
+              <w:spacing w:after="0"/>
+            </w:pPr>
+            <w:r>
+              <w:rPr>
+                <w:rFonts w:ascii="Aptos" w:hAnsi="Aptos"/>
+                <w:color w:val="27364A"/>
+                <w:sz w:val="15"/>
+              </w:rPr>
+              <w:t>Slack signal</w:t>
+            </w:r>
+          </w:p>
+        </w:tc>
+        <w:tc>
+          <w:tcPr>
+            <w:tcW w:type="dxa" w:w="3024"/>
+            <w:tcMar>
+              <w:top w:w="120" w:type="dxa"/>
+              <w:start w:w="120" w:type="dxa"/>
+              <w:bottom w:w="120" w:type="dxa"/>
+              <w:end w:w="120" w:type="dxa"/>
+            </w:tcMar>
+            <w:vAlign w:val="center"/>
+          </w:tcPr>
+          <w:p>
+            <w:pPr>
+              <w:spacing w:after="0"/>
+            </w:pPr>
+            <w:r>
+              <w:rPr>
+                <w:rFonts w:ascii="Aptos" w:hAnsi="Aptos"/>
+                <w:color w:val="27364A"/>
+                <w:sz w:val="15"/>
+              </w:rPr>
+              <w:t xml:space="preserve">The notification channel has GitHub bot activity but no visible discussion for </w:t>
+            </w:r>
+            <w:r>
+              <w:rPr>
+                <w:rFonts w:ascii="Aptos Mono" w:hAnsi="Aptos Mono"/>
+                <w:b/>
+                <w:color w:val="27364A"/>
+                <w:sz w:val="15"/>
+              </w:rPr>
+              <w:t>LFXV2-1654</w:t>
+            </w:r>
+            <w:r>
+              <w:rPr>
+                <w:rFonts w:ascii="Aptos" w:hAnsi="Aptos"/>
+                <w:color w:val="27364A"/>
+                <w:sz w:val="15"/>
+              </w:rPr>
+              <w:t>, the preread branch, or the document filename. Nirav separately raised the hybrid persona/lens simplification question: nested project dropdown under foundation, ideally three lenses rather than four.</w:t>
+            </w:r>
+          </w:p>
+        </w:tc>
+        <w:tc>
+          <w:tcPr>
+            <w:tcW w:type="dxa" w:w="4896"/>
+            <w:tcMar>
+              <w:top w:w="120" w:type="dxa"/>
+              <w:start w:w="120" w:type="dxa"/>
+              <w:bottom w:w="120" w:type="dxa"/>
+              <w:end w:w="120" w:type="dxa"/>
+            </w:tcMar>
+            <w:vAlign w:val="center"/>
+          </w:tcPr>
+          <w:p>
+            <w:pPr>
+              <w:spacing w:after="0"/>
+            </w:pPr>
+            <w:r>
+              <w:rPr>
+                <w:rFonts w:ascii="Aptos" w:hAnsi="Aptos"/>
+                <w:color w:val="27364A"/>
+                <w:sz w:val="15"/>
+              </w:rPr>
+              <w:t>The doc still matches the direction: simplify persona/lens presentation without using persona as the access-control mechanism.</w:t>
+            </w:r>
+          </w:p>
+        </w:tc>
+      </w:tr>
+    </w:tbl>
+    <w:p/>
     <w:p>
       <w:pPr>
         <w:pStyle w:val="Heading1"/>
@@ -150,7 +761,6 @@
     </w:p>
     <w:p>
       <w:pPr>
-        <w:spacing w:before="40" w:after="160"/>
         <w:ind w:left="259"/>
       </w:pPr>
       <w:r>
@@ -201,7 +811,7 @@
         </w:trPr>
         <w:tc>
           <w:tcPr>
-            <w:tcW w:type="dxa" w:w="2232"/>
+            <w:tcW w:type="dxa" w:w="2304"/>
             <w:shd w:fill="D9E7F5"/>
             <w:tcMar>
               <w:top w:w="120" w:type="dxa"/>
@@ -212,9 +822,6 @@
             <w:vAlign w:val="center"/>
           </w:tcPr>
           <w:p>
-            <w:pPr>
-              <w:jc w:val="left"/>
-            </w:pPr>
             <w:r>
               <w:rPr>
                 <w:rFonts w:ascii="Aptos" w:hAnsi="Aptos"/>
@@ -239,9 +846,6 @@
             <w:vAlign w:val="center"/>
           </w:tcPr>
           <w:p>
-            <w:pPr>
-              <w:jc w:val="left"/>
-            </w:pPr>
             <w:r>
               <w:rPr>
                 <w:rFonts w:ascii="Aptos" w:hAnsi="Aptos"/>
@@ -255,7 +859,7 @@
         </w:tc>
         <w:tc>
           <w:tcPr>
-            <w:tcW w:type="dxa" w:w="4968"/>
+            <w:tcW w:type="dxa" w:w="4896"/>
             <w:shd w:fill="D9E7F5"/>
             <w:tcMar>
               <w:top w:w="120" w:type="dxa"/>
@@ -266,9 +870,6 @@
             <w:vAlign w:val="center"/>
           </w:tcPr>
           <w:p>
-            <w:pPr>
-              <w:jc w:val="left"/>
-            </w:pPr>
             <w:r>
               <w:rPr>
                 <w:rFonts w:ascii="Aptos" w:hAnsi="Aptos"/>
@@ -284,7 +885,7 @@
       <w:tr>
         <w:tc>
           <w:tcPr>
-            <w:tcW w:type="dxa" w:w="2232"/>
+            <w:tcW w:type="dxa" w:w="2304"/>
             <w:tcMar>
               <w:top w:w="120" w:type="dxa"/>
               <w:start w:w="120" w:type="dxa"/>
@@ -334,7 +935,7 @@
         </w:tc>
         <w:tc>
           <w:tcPr>
-            <w:tcW w:type="dxa" w:w="4968"/>
+            <w:tcW w:type="dxa" w:w="4896"/>
             <w:tcMar>
               <w:top w:w="120" w:type="dxa"/>
               <w:start w:w="120" w:type="dxa"/>
@@ -361,7 +962,7 @@
       <w:tr>
         <w:tc>
           <w:tcPr>
-            <w:tcW w:type="dxa" w:w="2232"/>
+            <w:tcW w:type="dxa" w:w="2304"/>
             <w:tcMar>
               <w:top w:w="120" w:type="dxa"/>
               <w:start w:w="120" w:type="dxa"/>
@@ -411,7 +1012,7 @@
         </w:tc>
         <w:tc>
           <w:tcPr>
-            <w:tcW w:type="dxa" w:w="4968"/>
+            <w:tcW w:type="dxa" w:w="4896"/>
             <w:tcMar>
               <w:top w:w="120" w:type="dxa"/>
               <w:start w:w="120" w:type="dxa"/>
@@ -438,7 +1039,7 @@
       <w:tr>
         <w:tc>
           <w:tcPr>
-            <w:tcW w:type="dxa" w:w="2232"/>
+            <w:tcW w:type="dxa" w:w="2304"/>
             <w:tcMar>
               <w:top w:w="120" w:type="dxa"/>
               <w:start w:w="120" w:type="dxa"/>
@@ -488,7 +1089,7 @@
         </w:tc>
         <w:tc>
           <w:tcPr>
-            <w:tcW w:type="dxa" w:w="4968"/>
+            <w:tcW w:type="dxa" w:w="4896"/>
             <w:tcMar>
               <w:top w:w="120" w:type="dxa"/>
               <w:start w:w="120" w:type="dxa"/>
@@ -533,7 +1134,6 @@
     <w:p>
       <w:pPr>
         <w:pStyle w:val="ListBullet"/>
-        <w:spacing w:after="120" w:line="259" w:lineRule="auto"/>
       </w:pPr>
       <w:r>
         <w:rPr>
@@ -547,7 +1147,6 @@
     <w:p>
       <w:pPr>
         <w:pStyle w:val="ListBullet"/>
-        <w:spacing w:after="120" w:line="259" w:lineRule="auto"/>
       </w:pPr>
       <w:r>
         <w:rPr>
@@ -561,7 +1160,6 @@
     <w:p>
       <w:pPr>
         <w:pStyle w:val="ListBullet"/>
-        <w:spacing w:after="120" w:line="259" w:lineRule="auto"/>
       </w:pPr>
       <w:r>
         <w:rPr>
@@ -583,7 +1181,6 @@
     <w:p>
       <w:pPr>
         <w:pStyle w:val="ListBullet"/>
-        <w:spacing w:after="120" w:line="259" w:lineRule="auto"/>
       </w:pPr>
       <w:r>
         <w:rPr>
@@ -597,7 +1194,6 @@
     <w:p>
       <w:pPr>
         <w:pStyle w:val="ListBullet"/>
-        <w:spacing w:after="120" w:line="259" w:lineRule="auto"/>
       </w:pPr>
       <w:r>
         <w:rPr>
@@ -619,7 +1215,6 @@
     <w:p>
       <w:pPr>
         <w:pStyle w:val="ListBullet"/>
-        <w:spacing w:after="120" w:line="259" w:lineRule="auto"/>
       </w:pPr>
       <w:r>
         <w:rPr>
@@ -633,7 +1228,6 @@
     <w:p>
       <w:pPr>
         <w:pStyle w:val="ListBullet"/>
-        <w:spacing w:after="120" w:line="259" w:lineRule="auto"/>
       </w:pPr>
       <w:r>
         <w:rPr>
@@ -692,7 +1286,7 @@
         </w:trPr>
         <w:tc>
           <w:tcPr>
-            <w:tcW w:type="dxa" w:w="2232"/>
+            <w:tcW w:type="dxa" w:w="2304"/>
             <w:shd w:fill="D9E7F5"/>
             <w:tcMar>
               <w:top w:w="120" w:type="dxa"/>
@@ -703,9 +1297,6 @@
             <w:vAlign w:val="center"/>
           </w:tcPr>
           <w:p>
-            <w:pPr>
-              <w:jc w:val="left"/>
-            </w:pPr>
             <w:r>
               <w:rPr>
                 <w:rFonts w:ascii="Aptos" w:hAnsi="Aptos"/>
@@ -730,9 +1321,6 @@
             <w:vAlign w:val="center"/>
           </w:tcPr>
           <w:p>
-            <w:pPr>
-              <w:jc w:val="left"/>
-            </w:pPr>
             <w:r>
               <w:rPr>
                 <w:rFonts w:ascii="Aptos" w:hAnsi="Aptos"/>
@@ -746,7 +1334,7 @@
         </w:tc>
         <w:tc>
           <w:tcPr>
-            <w:tcW w:type="dxa" w:w="4968"/>
+            <w:tcW w:type="dxa" w:w="4896"/>
             <w:shd w:fill="D9E7F5"/>
             <w:tcMar>
               <w:top w:w="120" w:type="dxa"/>
@@ -757,9 +1345,6 @@
             <w:vAlign w:val="center"/>
           </w:tcPr>
           <w:p>
-            <w:pPr>
-              <w:jc w:val="left"/>
-            </w:pPr>
             <w:r>
               <w:rPr>
                 <w:rFonts w:ascii="Aptos" w:hAnsi="Aptos"/>
@@ -775,7 +1360,7 @@
       <w:tr>
         <w:tc>
           <w:tcPr>
-            <w:tcW w:type="dxa" w:w="2232"/>
+            <w:tcW w:type="dxa" w:w="2304"/>
             <w:tcMar>
               <w:top w:w="120" w:type="dxa"/>
               <w:start w:w="120" w:type="dxa"/>
@@ -825,7 +1410,7 @@
         </w:tc>
         <w:tc>
           <w:tcPr>
-            <w:tcW w:type="dxa" w:w="4968"/>
+            <w:tcW w:type="dxa" w:w="4896"/>
             <w:tcMar>
               <w:top w:w="120" w:type="dxa"/>
               <w:start w:w="120" w:type="dxa"/>
@@ -852,7 +1437,7 @@
       <w:tr>
         <w:tc>
           <w:tcPr>
-            <w:tcW w:type="dxa" w:w="2232"/>
+            <w:tcW w:type="dxa" w:w="2304"/>
             <w:tcMar>
               <w:top w:w="120" w:type="dxa"/>
               <w:start w:w="120" w:type="dxa"/>
@@ -902,7 +1487,7 @@
         </w:tc>
         <w:tc>
           <w:tcPr>
-            <w:tcW w:type="dxa" w:w="4968"/>
+            <w:tcW w:type="dxa" w:w="4896"/>
             <w:tcMar>
               <w:top w:w="120" w:type="dxa"/>
               <w:start w:w="120" w:type="dxa"/>
@@ -929,7 +1514,7 @@
       <w:tr>
         <w:tc>
           <w:tcPr>
-            <w:tcW w:type="dxa" w:w="2232"/>
+            <w:tcW w:type="dxa" w:w="2304"/>
             <w:tcMar>
               <w:top w:w="120" w:type="dxa"/>
               <w:start w:w="120" w:type="dxa"/>
@@ -979,7 +1564,7 @@
         </w:tc>
         <w:tc>
           <w:tcPr>
-            <w:tcW w:type="dxa" w:w="4968"/>
+            <w:tcW w:type="dxa" w:w="4896"/>
             <w:tcMar>
               <w:top w:w="120" w:type="dxa"/>
               <w:start w:w="120" w:type="dxa"/>
@@ -1006,7 +1591,7 @@
       <w:tr>
         <w:tc>
           <w:tcPr>
-            <w:tcW w:type="dxa" w:w="2232"/>
+            <w:tcW w:type="dxa" w:w="2304"/>
             <w:tcMar>
               <w:top w:w="120" w:type="dxa"/>
               <w:start w:w="120" w:type="dxa"/>
@@ -1056,7 +1641,7 @@
         </w:tc>
         <w:tc>
           <w:tcPr>
-            <w:tcW w:type="dxa" w:w="4968"/>
+            <w:tcW w:type="dxa" w:w="4896"/>
             <w:tcMar>
               <w:top w:w="120" w:type="dxa"/>
               <w:start w:w="120" w:type="dxa"/>
@@ -1092,7 +1677,6 @@
     </w:p>
     <w:p>
       <w:pPr>
-        <w:spacing w:before="40" w:after="160"/>
         <w:ind w:left="259"/>
       </w:pPr>
       <w:r>
@@ -1131,7 +1715,7 @@
       </w:r>
       <w:r>
         <w:rPr>
-          <w:rFonts w:ascii="Aptos" w:hAnsi="Aptos"/>
+          <w:rFonts w:ascii="Aptos Mono" w:hAnsi="Aptos Mono"/>
           <w:b/>
           <w:color w:val="1F2937"/>
           <w:sz w:val="20"/>
@@ -1176,7 +1760,7 @@
         </w:trPr>
         <w:tc>
           <w:tcPr>
-            <w:tcW w:type="dxa" w:w="1800"/>
+            <w:tcW w:type="dxa" w:w="1728"/>
             <w:shd w:fill="D9E7F5"/>
             <w:tcMar>
               <w:top w:w="120" w:type="dxa"/>
@@ -1187,9 +1771,6 @@
             <w:vAlign w:val="center"/>
           </w:tcPr>
           <w:p>
-            <w:pPr>
-              <w:jc w:val="left"/>
-            </w:pPr>
             <w:r>
               <w:rPr>
                 <w:rFonts w:ascii="Aptos" w:hAnsi="Aptos"/>
@@ -1203,7 +1784,7 @@
         </w:tc>
         <w:tc>
           <w:tcPr>
-            <w:tcW w:type="dxa" w:w="2232"/>
+            <w:tcW w:type="dxa" w:w="2088"/>
             <w:shd w:fill="D9E7F5"/>
             <w:tcMar>
               <w:top w:w="120" w:type="dxa"/>
@@ -1214,9 +1795,6 @@
             <w:vAlign w:val="center"/>
           </w:tcPr>
           <w:p>
-            <w:pPr>
-              <w:jc w:val="left"/>
-            </w:pPr>
             <w:r>
               <w:rPr>
                 <w:rFonts w:ascii="Aptos" w:hAnsi="Aptos"/>
@@ -1241,9 +1819,6 @@
             <w:vAlign w:val="center"/>
           </w:tcPr>
           <w:p>
-            <w:pPr>
-              <w:jc w:val="left"/>
-            </w:pPr>
             <w:r>
               <w:rPr>
                 <w:rFonts w:ascii="Aptos" w:hAnsi="Aptos"/>
@@ -1257,7 +1832,7 @@
         </w:tc>
         <w:tc>
           <w:tcPr>
-            <w:tcW w:type="dxa" w:w="2880"/>
+            <w:tcW w:type="dxa" w:w="2951"/>
             <w:shd w:fill="D9E7F5"/>
             <w:tcMar>
               <w:top w:w="120" w:type="dxa"/>
@@ -1268,9 +1843,6 @@
             <w:vAlign w:val="center"/>
           </w:tcPr>
           <w:p>
-            <w:pPr>
-              <w:jc w:val="left"/>
-            </w:pPr>
             <w:r>
               <w:rPr>
                 <w:rFonts w:ascii="Aptos" w:hAnsi="Aptos"/>
@@ -1284,7 +1856,7 @@
         </w:tc>
         <w:tc>
           <w:tcPr>
-            <w:tcW w:type="dxa" w:w="3096"/>
+            <w:tcW w:type="dxa" w:w="3240"/>
             <w:shd w:fill="D9E7F5"/>
             <w:tcMar>
               <w:top w:w="120" w:type="dxa"/>
@@ -1295,9 +1867,6 @@
             <w:vAlign w:val="center"/>
           </w:tcPr>
           <w:p>
-            <w:pPr>
-              <w:jc w:val="left"/>
-            </w:pPr>
             <w:r>
               <w:rPr>
                 <w:rFonts w:ascii="Aptos" w:hAnsi="Aptos"/>
@@ -1313,7 +1882,7 @@
       <w:tr>
         <w:tc>
           <w:tcPr>
-            <w:tcW w:type="dxa" w:w="1800"/>
+            <w:tcW w:type="dxa" w:w="1728"/>
             <w:tcMar>
               <w:top w:w="120" w:type="dxa"/>
               <w:start w:w="120" w:type="dxa"/>
@@ -1338,7 +1907,7 @@
         </w:tc>
         <w:tc>
           <w:tcPr>
-            <w:tcW w:type="dxa" w:w="2232"/>
+            <w:tcW w:type="dxa" w:w="2088"/>
             <w:tcMar>
               <w:top w:w="120" w:type="dxa"/>
               <w:start w:w="120" w:type="dxa"/>
@@ -1388,7 +1957,7 @@
         </w:tc>
         <w:tc>
           <w:tcPr>
-            <w:tcW w:type="dxa" w:w="2880"/>
+            <w:tcW w:type="dxa" w:w="2951"/>
             <w:tcMar>
               <w:top w:w="120" w:type="dxa"/>
               <w:start w:w="120" w:type="dxa"/>
@@ -1413,7 +1982,7 @@
         </w:tc>
         <w:tc>
           <w:tcPr>
-            <w:tcW w:type="dxa" w:w="3096"/>
+            <w:tcW w:type="dxa" w:w="3240"/>
             <w:tcMar>
               <w:top w:w="120" w:type="dxa"/>
               <w:start w:w="120" w:type="dxa"/>
@@ -1457,7 +2026,7 @@
       <w:tr>
         <w:tc>
           <w:tcPr>
-            <w:tcW w:type="dxa" w:w="1800"/>
+            <w:tcW w:type="dxa" w:w="1728"/>
             <w:tcMar>
               <w:top w:w="120" w:type="dxa"/>
               <w:start w:w="120" w:type="dxa"/>
@@ -1482,7 +2051,7 @@
         </w:tc>
         <w:tc>
           <w:tcPr>
-            <w:tcW w:type="dxa" w:w="2232"/>
+            <w:tcW w:type="dxa" w:w="2088"/>
             <w:tcMar>
               <w:top w:w="120" w:type="dxa"/>
               <w:start w:w="120" w:type="dxa"/>
@@ -1532,7 +2101,7 @@
         </w:tc>
         <w:tc>
           <w:tcPr>
-            <w:tcW w:type="dxa" w:w="2880"/>
+            <w:tcW w:type="dxa" w:w="2951"/>
             <w:tcMar>
               <w:top w:w="120" w:type="dxa"/>
               <w:start w:w="120" w:type="dxa"/>
@@ -1557,7 +2126,7 @@
         </w:tc>
         <w:tc>
           <w:tcPr>
-            <w:tcW w:type="dxa" w:w="3096"/>
+            <w:tcW w:type="dxa" w:w="3240"/>
             <w:tcMar>
               <w:top w:w="120" w:type="dxa"/>
               <w:start w:w="120" w:type="dxa"/>
@@ -1584,7 +2153,7 @@
       <w:tr>
         <w:tc>
           <w:tcPr>
-            <w:tcW w:type="dxa" w:w="1800"/>
+            <w:tcW w:type="dxa" w:w="1728"/>
             <w:tcMar>
               <w:top w:w="120" w:type="dxa"/>
               <w:start w:w="120" w:type="dxa"/>
@@ -1609,7 +2178,7 @@
         </w:tc>
         <w:tc>
           <w:tcPr>
-            <w:tcW w:type="dxa" w:w="2232"/>
+            <w:tcW w:type="dxa" w:w="2088"/>
             <w:tcMar>
               <w:top w:w="120" w:type="dxa"/>
               <w:start w:w="120" w:type="dxa"/>
@@ -1659,7 +2228,7 @@
         </w:tc>
         <w:tc>
           <w:tcPr>
-            <w:tcW w:type="dxa" w:w="2880"/>
+            <w:tcW w:type="dxa" w:w="2951"/>
             <w:tcMar>
               <w:top w:w="120" w:type="dxa"/>
               <w:start w:w="120" w:type="dxa"/>
@@ -1718,7 +2287,7 @@
         </w:tc>
         <w:tc>
           <w:tcPr>
-            <w:tcW w:type="dxa" w:w="3096"/>
+            <w:tcW w:type="dxa" w:w="3240"/>
             <w:tcMar>
               <w:top w:w="120" w:type="dxa"/>
               <w:start w:w="120" w:type="dxa"/>
@@ -1745,7 +2314,7 @@
       <w:tr>
         <w:tc>
           <w:tcPr>
-            <w:tcW w:type="dxa" w:w="1800"/>
+            <w:tcW w:type="dxa" w:w="1728"/>
             <w:tcMar>
               <w:top w:w="120" w:type="dxa"/>
               <w:start w:w="120" w:type="dxa"/>
@@ -1770,7 +2339,7 @@
         </w:tc>
         <w:tc>
           <w:tcPr>
-            <w:tcW w:type="dxa" w:w="2232"/>
+            <w:tcW w:type="dxa" w:w="2088"/>
             <w:tcMar>
               <w:top w:w="120" w:type="dxa"/>
               <w:start w:w="120" w:type="dxa"/>
@@ -1820,7 +2389,7 @@
         </w:tc>
         <w:tc>
           <w:tcPr>
-            <w:tcW w:type="dxa" w:w="2880"/>
+            <w:tcW w:type="dxa" w:w="2951"/>
             <w:tcMar>
               <w:top w:w="120" w:type="dxa"/>
               <w:start w:w="120" w:type="dxa"/>
@@ -1845,7 +2414,7 @@
         </w:tc>
         <w:tc>
           <w:tcPr>
-            <w:tcW w:type="dxa" w:w="3096"/>
+            <w:tcW w:type="dxa" w:w="3240"/>
             <w:tcMar>
               <w:top w:w="120" w:type="dxa"/>
               <w:start w:w="120" w:type="dxa"/>
@@ -1889,7 +2458,7 @@
       <w:tr>
         <w:tc>
           <w:tcPr>
-            <w:tcW w:type="dxa" w:w="1800"/>
+            <w:tcW w:type="dxa" w:w="1728"/>
             <w:tcMar>
               <w:top w:w="120" w:type="dxa"/>
               <w:start w:w="120" w:type="dxa"/>
@@ -1914,7 +2483,7 @@
         </w:tc>
         <w:tc>
           <w:tcPr>
-            <w:tcW w:type="dxa" w:w="2232"/>
+            <w:tcW w:type="dxa" w:w="2088"/>
             <w:tcMar>
               <w:top w:w="120" w:type="dxa"/>
               <w:start w:w="120" w:type="dxa"/>
@@ -1964,7 +2533,7 @@
         </w:tc>
         <w:tc>
           <w:tcPr>
-            <w:tcW w:type="dxa" w:w="2880"/>
+            <w:tcW w:type="dxa" w:w="2951"/>
             <w:tcMar>
               <w:top w:w="120" w:type="dxa"/>
               <w:start w:w="120" w:type="dxa"/>
@@ -1989,7 +2558,7 @@
         </w:tc>
         <w:tc>
           <w:tcPr>
-            <w:tcW w:type="dxa" w:w="3096"/>
+            <w:tcW w:type="dxa" w:w="3240"/>
             <w:tcMar>
               <w:top w:w="120" w:type="dxa"/>
               <w:start w:w="120" w:type="dxa"/>
@@ -2016,7 +2585,7 @@
       <w:tr>
         <w:tc>
           <w:tcPr>
-            <w:tcW w:type="dxa" w:w="1800"/>
+            <w:tcW w:type="dxa" w:w="1728"/>
             <w:tcMar>
               <w:top w:w="120" w:type="dxa"/>
               <w:start w:w="120" w:type="dxa"/>
@@ -2041,7 +2610,7 @@
         </w:tc>
         <w:tc>
           <w:tcPr>
-            <w:tcW w:type="dxa" w:w="2232"/>
+            <w:tcW w:type="dxa" w:w="2088"/>
             <w:tcMar>
               <w:top w:w="120" w:type="dxa"/>
               <w:start w:w="120" w:type="dxa"/>
@@ -2091,7 +2660,7 @@
         </w:tc>
         <w:tc>
           <w:tcPr>
-            <w:tcW w:type="dxa" w:w="2880"/>
+            <w:tcW w:type="dxa" w:w="2951"/>
             <w:tcMar>
               <w:top w:w="120" w:type="dxa"/>
               <w:start w:w="120" w:type="dxa"/>
@@ -2150,7 +2719,7 @@
         </w:tc>
         <w:tc>
           <w:tcPr>
-            <w:tcW w:type="dxa" w:w="3096"/>
+            <w:tcW w:type="dxa" w:w="3240"/>
             <w:tcMar>
               <w:top w:w="120" w:type="dxa"/>
               <w:start w:w="120" w:type="dxa"/>
@@ -2177,7 +2746,7 @@
       <w:tr>
         <w:tc>
           <w:tcPr>
-            <w:tcW w:type="dxa" w:w="1800"/>
+            <w:tcW w:type="dxa" w:w="1728"/>
             <w:tcMar>
               <w:top w:w="120" w:type="dxa"/>
               <w:start w:w="120" w:type="dxa"/>
@@ -2202,7 +2771,7 @@
         </w:tc>
         <w:tc>
           <w:tcPr>
-            <w:tcW w:type="dxa" w:w="2232"/>
+            <w:tcW w:type="dxa" w:w="2088"/>
             <w:tcMar>
               <w:top w:w="120" w:type="dxa"/>
               <w:start w:w="120" w:type="dxa"/>
@@ -2252,7 +2821,7 @@
         </w:tc>
         <w:tc>
           <w:tcPr>
-            <w:tcW w:type="dxa" w:w="2880"/>
+            <w:tcW w:type="dxa" w:w="2951"/>
             <w:tcMar>
               <w:top w:w="120" w:type="dxa"/>
               <w:start w:w="120" w:type="dxa"/>
@@ -2277,7 +2846,7 @@
         </w:tc>
         <w:tc>
           <w:tcPr>
-            <w:tcW w:type="dxa" w:w="3096"/>
+            <w:tcW w:type="dxa" w:w="3240"/>
             <w:tcMar>
               <w:top w:w="120" w:type="dxa"/>
               <w:start w:w="120" w:type="dxa"/>
@@ -2321,7 +2890,7 @@
       <w:tr>
         <w:tc>
           <w:tcPr>
-            <w:tcW w:type="dxa" w:w="1800"/>
+            <w:tcW w:type="dxa" w:w="1728"/>
             <w:tcMar>
               <w:top w:w="120" w:type="dxa"/>
               <w:start w:w="120" w:type="dxa"/>
@@ -2346,7 +2915,7 @@
         </w:tc>
         <w:tc>
           <w:tcPr>
-            <w:tcW w:type="dxa" w:w="2232"/>
+            <w:tcW w:type="dxa" w:w="2088"/>
             <w:tcMar>
               <w:top w:w="120" w:type="dxa"/>
               <w:start w:w="120" w:type="dxa"/>
@@ -2396,7 +2965,7 @@
         </w:tc>
         <w:tc>
           <w:tcPr>
-            <w:tcW w:type="dxa" w:w="2880"/>
+            <w:tcW w:type="dxa" w:w="2951"/>
             <w:tcMar>
               <w:top w:w="120" w:type="dxa"/>
               <w:start w:w="120" w:type="dxa"/>
@@ -2421,7 +2990,7 @@
         </w:tc>
         <w:tc>
           <w:tcPr>
-            <w:tcW w:type="dxa" w:w="3096"/>
+            <w:tcW w:type="dxa" w:w="3240"/>
             <w:tcMar>
               <w:top w:w="120" w:type="dxa"/>
               <w:start w:w="120" w:type="dxa"/>
@@ -2448,7 +3017,7 @@
       <w:tr>
         <w:tc>
           <w:tcPr>
-            <w:tcW w:type="dxa" w:w="1800"/>
+            <w:tcW w:type="dxa" w:w="1728"/>
             <w:tcMar>
               <w:top w:w="120" w:type="dxa"/>
               <w:start w:w="120" w:type="dxa"/>
@@ -2473,7 +3042,7 @@
         </w:tc>
         <w:tc>
           <w:tcPr>
-            <w:tcW w:type="dxa" w:w="2232"/>
+            <w:tcW w:type="dxa" w:w="2088"/>
             <w:tcMar>
               <w:top w:w="120" w:type="dxa"/>
               <w:start w:w="120" w:type="dxa"/>
@@ -2523,7 +3092,7 @@
         </w:tc>
         <w:tc>
           <w:tcPr>
-            <w:tcW w:type="dxa" w:w="2880"/>
+            <w:tcW w:type="dxa" w:w="2951"/>
             <w:tcMar>
               <w:top w:w="120" w:type="dxa"/>
               <w:start w:w="120" w:type="dxa"/>
@@ -2548,7 +3117,7 @@
         </w:tc>
         <w:tc>
           <w:tcPr>
-            <w:tcW w:type="dxa" w:w="3096"/>
+            <w:tcW w:type="dxa" w:w="3240"/>
             <w:tcMar>
               <w:top w:w="120" w:type="dxa"/>
               <w:start w:w="120" w:type="dxa"/>
@@ -2636,9 +3205,6 @@
             <w:vAlign w:val="center"/>
           </w:tcPr>
           <w:p>
-            <w:pPr>
-              <w:jc w:val="left"/>
-            </w:pPr>
             <w:r>
               <w:rPr>
                 <w:rFonts w:ascii="Aptos" w:hAnsi="Aptos"/>
@@ -2663,9 +3229,6 @@
             <w:vAlign w:val="center"/>
           </w:tcPr>
           <w:p>
-            <w:pPr>
-              <w:jc w:val="left"/>
-            </w:pPr>
             <w:r>
               <w:rPr>
                 <w:rFonts w:ascii="Aptos" w:hAnsi="Aptos"/>
@@ -2690,9 +3253,6 @@
             <w:vAlign w:val="center"/>
           </w:tcPr>
           <w:p>
-            <w:pPr>
-              <w:jc w:val="left"/>
-            </w:pPr>
             <w:r>
               <w:rPr>
                 <w:rFonts w:ascii="Aptos" w:hAnsi="Aptos"/>
@@ -2717,9 +3277,6 @@
             <w:vAlign w:val="center"/>
           </w:tcPr>
           <w:p>
-            <w:pPr>
-              <w:jc w:val="left"/>
-            </w:pPr>
             <w:r>
               <w:rPr>
                 <w:rFonts w:ascii="Aptos" w:hAnsi="Aptos"/>
@@ -2744,9 +3301,6 @@
             <w:vAlign w:val="center"/>
           </w:tcPr>
           <w:p>
-            <w:pPr>
-              <w:jc w:val="left"/>
-            </w:pPr>
             <w:r>
               <w:rPr>
                 <w:rFonts w:ascii="Aptos" w:hAnsi="Aptos"/>
@@ -2771,9 +3325,6 @@
             <w:vAlign w:val="center"/>
           </w:tcPr>
           <w:p>
-            <w:pPr>
-              <w:jc w:val="left"/>
-            </w:pPr>
             <w:r>
               <w:rPr>
                 <w:rFonts w:ascii="Aptos" w:hAnsi="Aptos"/>
@@ -2802,7 +3353,7 @@
             <w:pPr>
               <w:spacing w:after="0"/>
             </w:pPr>
-            <w:hyperlink r:id="rId9">
+            <w:hyperlink r:id="rId10">
               <w:r>
                 <w:rPr>
                   <w:color w:val="0563C1"/>
@@ -2973,7 +3524,7 @@
             <w:pPr>
               <w:spacing w:after="0"/>
             </w:pPr>
-            <w:hyperlink r:id="rId10">
+            <w:hyperlink r:id="rId12">
               <w:r>
                 <w:rPr>
                   <w:color w:val="0563C1"/>
@@ -3127,7 +3678,7 @@
             <w:pPr>
               <w:spacing w:after="0"/>
             </w:pPr>
-            <w:hyperlink r:id="rId11">
+            <w:hyperlink r:id="rId13">
               <w:r>
                 <w:rPr>
                   <w:color w:val="0563C1"/>
@@ -3281,7 +3832,7 @@
             <w:pPr>
               <w:spacing w:after="0"/>
             </w:pPr>
-            <w:hyperlink r:id="rId12">
+            <w:hyperlink r:id="rId14">
               <w:r>
                 <w:rPr>
                   <w:color w:val="0563C1"/>
@@ -3435,7 +3986,7 @@
             <w:pPr>
               <w:spacing w:after="0"/>
             </w:pPr>
-            <w:hyperlink r:id="rId13">
+            <w:hyperlink r:id="rId15">
               <w:r>
                 <w:rPr>
                   <w:color w:val="0563C1"/>
@@ -3589,7 +4140,7 @@
             <w:pPr>
               <w:spacing w:after="0"/>
             </w:pPr>
-            <w:hyperlink r:id="rId14">
+            <w:hyperlink r:id="rId16">
               <w:r>
                 <w:rPr>
                   <w:color w:val="0563C1"/>
@@ -3743,7 +4294,7 @@
             <w:pPr>
               <w:spacing w:after="0"/>
             </w:pPr>
-            <w:hyperlink r:id="rId15">
+            <w:hyperlink r:id="rId17">
               <w:r>
                 <w:rPr>
                   <w:color w:val="0563C1"/>
@@ -3897,7 +4448,7 @@
             <w:pPr>
               <w:spacing w:after="0"/>
             </w:pPr>
-            <w:hyperlink r:id="rId16">
+            <w:hyperlink r:id="rId11">
               <w:r>
                 <w:rPr>
                   <w:color w:val="0563C1"/>
@@ -4048,7 +4599,6 @@
     <w:p>
       <w:pPr>
         <w:pStyle w:val="ListBullet"/>
-        <w:spacing w:after="120" w:line="259" w:lineRule="auto"/>
       </w:pPr>
       <w:r>
         <w:rPr>
@@ -4062,7 +4612,6 @@
     <w:p>
       <w:pPr>
         <w:pStyle w:val="ListBullet"/>
-        <w:spacing w:after="120" w:line="259" w:lineRule="auto"/>
       </w:pPr>
       <w:r>
         <w:rPr>
@@ -4076,7 +4625,6 @@
     <w:p>
       <w:pPr>
         <w:pStyle w:val="ListBullet"/>
-        <w:spacing w:after="120" w:line="259" w:lineRule="auto"/>
       </w:pPr>
       <w:r>
         <w:rPr>
@@ -4090,7 +4638,6 @@
     <w:p>
       <w:pPr>
         <w:pStyle w:val="ListBullet"/>
-        <w:spacing w:after="120" w:line="259" w:lineRule="auto"/>
       </w:pPr>
       <w:r>
         <w:rPr>
@@ -4124,7 +4671,6 @@
     </w:p>
     <w:p>
       <w:pPr>
-        <w:spacing w:before="40" w:after="160"/>
         <w:ind w:left="259"/>
       </w:pPr>
       <w:r>
@@ -4152,7 +4698,7 @@
         </w:rPr>
         <w:t xml:space="preserve">The remaining work is tracked under epic </w:t>
       </w:r>
-      <w:hyperlink r:id="rId17">
+      <w:hyperlink r:id="rId9">
         <w:r>
           <w:rPr>
             <w:color w:val="0563C1"/>

</xml_diff>